<commit_message>
Merged Dataset 1 and 2
Combined cruelty free and not cruelty free list with a new field, merged the list to Products dataset.
</commit_message>
<xml_diff>
--- a/DAV_CA1_Report.docx
+++ b/DAV_CA1_Report.docx
@@ -1122,12 +1122,6 @@
       </w:r>
     </w:p>
     <w:p>
-      <w:pPr>
-        <w:rPr>
-          <w:b/>
-          <w:bCs/>
-        </w:rPr>
-      </w:pPr>
       <w:hyperlink r:id="rId6" w:history="1">
         <w:r>
           <w:rPr>
@@ -1138,6 +1132,32 @@
       </w:hyperlink>
       <w:r>
         <w:t xml:space="preserve">  </w:t>
+      </w:r>
+    </w:p>
+    <w:p>
+      <w:hyperlink r:id="rId7" w:history="1">
+        <w:r>
+          <w:rPr>
+            <w:rStyle w:val="Hyperlink"/>
+          </w:rPr>
+          <w:t>https://www.geeksforgeeks.org/python/use-of-na_values-parameter-in-read_csv-function-of-pandas-in-python/</w:t>
+        </w:r>
+      </w:hyperlink>
+      <w:r>
+        <w:t xml:space="preserve"> </w:t>
+      </w:r>
+    </w:p>
+    <w:p>
+      <w:hyperlink r:id="rId8" w:history="1">
+        <w:r>
+          <w:rPr>
+            <w:rStyle w:val="Hyperlink"/>
+          </w:rPr>
+          <w:t>https://pandas.pydata.org/pandas-docs/stable/reference/api/pandas.DataFrame.merge.html</w:t>
+        </w:r>
+      </w:hyperlink>
+      <w:r>
+        <w:t xml:space="preserve"> </w:t>
       </w:r>
     </w:p>
     <w:sectPr>

</xml_diff>

<commit_message>
Fixes to Final Dataset
Removed product names to group by the Brand, using the averages of the brands price, reviews etc.
</commit_message>
<xml_diff>
--- a/DAV_CA1_Report.docx
+++ b/DAV_CA1_Report.docx
@@ -1099,9 +1099,10 @@
         <w:t xml:space="preserve"> only using boxplots to check price and number of reviews, unnecessary for ratings amount </w:t>
       </w:r>
     </w:p>
-    <w:p>
-      <w:r>
-        <w:br w:type="page"/>
+    <w:p/>
+    <w:p>
+      <w:r>
+        <w:t xml:space="preserve">Categorical variables – make changes to them </w:t>
       </w:r>
     </w:p>
     <w:p/>

</xml_diff>

<commit_message>
Checking outliers for Normalisation
Checking for outliers in the new scaled data from PCA, and outliers in the top 3 variables.
</commit_message>
<xml_diff>
--- a/DAV_CA1_Report.docx
+++ b/DAV_CA1_Report.docx
@@ -75,7 +75,15 @@
     </w:p>
     <w:p>
       <w:r>
-        <w:t xml:space="preserve">As a young adult myself on Social Media, I have personally seen a high intake in paid promotions and advertisements on beauty products which promise lots of different things however the consumers are not warned of any harmful chemicals or about the brands ethical reputation. </w:t>
+        <w:t xml:space="preserve">As a young adult myself on </w:t>
+      </w:r>
+      <w:proofErr w:type="gramStart"/>
+      <w:r>
+        <w:t>Social Media</w:t>
+      </w:r>
+      <w:proofErr w:type="gramEnd"/>
+      <w:r>
+        <w:t xml:space="preserve">, I have personally seen a high intake in paid promotions and advertisements on beauty products which promise lots of different things however the consumers are not warned of any harmful chemicals or about the brands ethical reputation. </w:t>
       </w:r>
     </w:p>
     <w:p>
@@ -133,10 +141,43 @@
         <w:rPr>
           <w:color w:val="EE0000"/>
         </w:rPr>
-        <w:t>(statistic for the amount of animal testing in Europe done with all beauty brands put together)</w:t>
-      </w:r>
-      <w:r>
-        <w:t>As this one is very important I am using the cruelty free true/false column and my own web scraping directly from the Peta website to ensure that the information is correct to validate it</w:t>
+        <w:t xml:space="preserve">(statistic </w:t>
+      </w:r>
+      <w:proofErr w:type="gramStart"/>
+      <w:r>
+        <w:rPr>
+          <w:color w:val="EE0000"/>
+        </w:rPr>
+        <w:t>for the amount of</w:t>
+      </w:r>
+      <w:proofErr w:type="gramEnd"/>
+      <w:r>
+        <w:rPr>
+          <w:color w:val="EE0000"/>
+        </w:rPr>
+        <w:t xml:space="preserve"> animal testing in Europe done with all beauty brands put </w:t>
+      </w:r>
+      <w:proofErr w:type="gramStart"/>
+      <w:r>
+        <w:rPr>
+          <w:color w:val="EE0000"/>
+        </w:rPr>
+        <w:t>together)</w:t>
+      </w:r>
+      <w:r>
+        <w:t>As</w:t>
+      </w:r>
+      <w:proofErr w:type="gramEnd"/>
+      <w:r>
+        <w:t xml:space="preserve"> this one is very </w:t>
+      </w:r>
+      <w:proofErr w:type="gramStart"/>
+      <w:r>
+        <w:t>important</w:t>
+      </w:r>
+      <w:proofErr w:type="gramEnd"/>
+      <w:r>
+        <w:t xml:space="preserve"> I am using the cruelty free true/false column and my own web scraping directly from the Peta website to ensure that the information is correct to validate it</w:t>
       </w:r>
       <w:r>
         <w:t>.</w:t>
@@ -804,7 +845,15 @@
           </w:tcPr>
           <w:p>
             <w:r>
-              <w:t>Toxic Chemicals  in Products Dataset (Kaggle)</w:t>
+              <w:t xml:space="preserve">Toxic </w:t>
+            </w:r>
+            <w:proofErr w:type="gramStart"/>
+            <w:r>
+              <w:t>Chemicals  in</w:t>
+            </w:r>
+            <w:proofErr w:type="gramEnd"/>
+            <w:r>
+              <w:t xml:space="preserve"> Products Dataset (Kaggle)</w:t>
             </w:r>
           </w:p>
         </w:tc>
@@ -926,7 +975,11 @@
       </w:r>
       <w:r>
         <w:lastRenderedPageBreak/>
-        <w:t>on Animals” list. By using the direct web scraping this means my ethical data is completely in real time from the 16</w:t>
+        <w:t xml:space="preserve">on Animals” list. By using the direct web scraping this means my ethical data is completely in real time from the </w:t>
+      </w:r>
+      <w:proofErr w:type="gramStart"/>
+      <w:r>
+        <w:t>16</w:t>
       </w:r>
       <w:r>
         <w:rPr>
@@ -934,6 +987,7 @@
         </w:rPr>
         <w:t>th</w:t>
       </w:r>
+      <w:proofErr w:type="gramEnd"/>
       <w:r>
         <w:t xml:space="preserve"> May, as the website is constantly updated.</w:t>
       </w:r>
@@ -958,7 +1012,15 @@
         <w:t xml:space="preserve">Weakness: </w:t>
       </w:r>
       <w:r>
-        <w:t xml:space="preserve">This indicator has binary results with yes or no, therefore it doesn’t represent any brands who may be actively trying to move away from animal testing and are not approved yet or parent companies and suppliers that still test on animals. </w:t>
+        <w:t xml:space="preserve">This indicator has binary results with yes or </w:t>
+      </w:r>
+      <w:proofErr w:type="gramStart"/>
+      <w:r>
+        <w:t>no,</w:t>
+      </w:r>
+      <w:proofErr w:type="gramEnd"/>
+      <w:r>
+        <w:t xml:space="preserve"> therefore it doesn’t represent any brands who may be actively trying to move away from animal testing and are not approved yet or parent companies and suppliers that still test on animals. </w:t>
       </w:r>
     </w:p>
     <w:p>
@@ -1045,7 +1107,15 @@
         <w:t xml:space="preserve">Weakness: </w:t>
       </w:r>
       <w:r>
-        <w:t xml:space="preserve">This indicator has binary results with yes or no, therefore it doesn’t represent any brands who may be actively trying to move away from animal testing and are not approved yet or parent companies and suppliers that still test on animals. </w:t>
+        <w:t xml:space="preserve">This indicator has binary results with yes or </w:t>
+      </w:r>
+      <w:proofErr w:type="gramStart"/>
+      <w:r>
+        <w:t>no,</w:t>
+      </w:r>
+      <w:proofErr w:type="gramEnd"/>
+      <w:r>
+        <w:t xml:space="preserve"> therefore it doesn’t represent any brands who may be actively trying to move away from animal testing and are not approved yet or parent companies and suppliers that still test on animals. </w:t>
       </w:r>
     </w:p>
     <w:p/>
@@ -1120,12 +1190,28 @@
     </w:p>
     <w:p>
       <w:r>
-        <w:t xml:space="preserve">Heatmap shows overall low linear correlation between variables the correlation is mostly between -0.30 and  +0.30. </w:t>
-      </w:r>
-    </w:p>
-    <w:p>
-      <w:r>
-        <w:t xml:space="preserve">Meaning there are no variables that outweigh the explanation of another variable. For example a higher price doesn’t automatically mean a higher rating. </w:t>
+        <w:t xml:space="preserve">Heatmap shows overall low linear correlation between variables the correlation is mostly between -0.30 </w:t>
+      </w:r>
+      <w:proofErr w:type="gramStart"/>
+      <w:r>
+        <w:t>and  +</w:t>
+      </w:r>
+      <w:proofErr w:type="gramEnd"/>
+      <w:r>
+        <w:t xml:space="preserve">0.30. </w:t>
+      </w:r>
+    </w:p>
+    <w:p>
+      <w:r>
+        <w:t xml:space="preserve">Meaning there are no variables that outweigh the explanation of another variable. For </w:t>
+      </w:r>
+      <w:proofErr w:type="gramStart"/>
+      <w:r>
+        <w:t>example</w:t>
+      </w:r>
+      <w:proofErr w:type="gramEnd"/>
+      <w:r>
+        <w:t xml:space="preserve"> a higher price doesn’t automatically mean a higher rating. </w:t>
       </w:r>
     </w:p>
     <w:p>
@@ -1213,7 +1299,15 @@
     </w:p>
     <w:p>
       <w:r>
-        <w:t xml:space="preserve">Following PCA, it is clear that my index </w:t>
+        <w:t xml:space="preserve">Following PCA, </w:t>
+      </w:r>
+      <w:proofErr w:type="gramStart"/>
+      <w:r>
+        <w:t>it is clear that my</w:t>
+      </w:r>
+      <w:proofErr w:type="gramEnd"/>
+      <w:r>
+        <w:t xml:space="preserve"> index </w:t>
       </w:r>
       <w:proofErr w:type="spellStart"/>
       <w:r>
@@ -1279,7 +1373,134 @@
         <w:t xml:space="preserve">4 is when the curve changes </w:t>
       </w:r>
     </w:p>
+    <w:p>
+      <w:r>
+        <w:t>Make a comment on the brands in each cluster</w:t>
+      </w:r>
+    </w:p>
     <w:p/>
+    <w:p>
+      <w:r>
+        <w:t xml:space="preserve">Price and rating are very low in </w:t>
+      </w:r>
+      <w:proofErr w:type="gramStart"/>
+      <w:r>
+        <w:t>pc,</w:t>
+      </w:r>
+      <w:proofErr w:type="gramEnd"/>
+      <w:r>
+        <w:t xml:space="preserve"> carry almost no information regarding the overall structure they could be excluded in the composite index. </w:t>
+      </w:r>
+    </w:p>
+    <w:p/>
+    <w:p>
+      <w:pPr>
+        <w:pStyle w:val="ListParagraph"/>
+        <w:numPr>
+          <w:ilvl w:val="0"/>
+          <w:numId w:val="3"/>
+        </w:numPr>
+        <w:rPr>
+          <w:b/>
+          <w:bCs/>
+        </w:rPr>
+      </w:pPr>
+      <w:r>
+        <w:rPr>
+          <w:b/>
+          <w:bCs/>
+        </w:rPr>
+        <w:t xml:space="preserve">Normalisation </w:t>
+      </w:r>
+    </w:p>
+    <w:p>
+      <w:r>
+        <w:t xml:space="preserve">Using standard scaler and </w:t>
+      </w:r>
+      <w:proofErr w:type="spellStart"/>
+      <w:r>
+        <w:t>minmaxscaler</w:t>
+      </w:r>
+      <w:proofErr w:type="spellEnd"/>
+      <w:r>
+        <w:t xml:space="preserve"> for comparisons. </w:t>
+      </w:r>
+    </w:p>
+    <w:p>
+      <w:r>
+        <w:t xml:space="preserve">Different scaling for example price is measured in dollars, rating is a scale of 1 – 5, and numbers of reviews can be any number in my case they are mostly in the thousands. </w:t>
+      </w:r>
+    </w:p>
+    <w:p>
+      <w:r>
+        <w:lastRenderedPageBreak/>
+        <w:t xml:space="preserve">Without scaling </w:t>
+      </w:r>
+      <w:proofErr w:type="spellStart"/>
+      <w:r>
+        <w:t>kmeans</w:t>
+      </w:r>
+      <w:proofErr w:type="spellEnd"/>
+      <w:r>
+        <w:t xml:space="preserve"> would be </w:t>
+      </w:r>
+      <w:proofErr w:type="gramStart"/>
+      <w:r>
+        <w:t>effected</w:t>
+      </w:r>
+      <w:proofErr w:type="gramEnd"/>
+      <w:r>
+        <w:t xml:space="preserve"> as the numerical variables are using different measurements of numbers. </w:t>
+      </w:r>
+    </w:p>
+    <w:p>
+      <w:r>
+        <w:t xml:space="preserve">Standard scaler </w:t>
+      </w:r>
+      <w:proofErr w:type="spellStart"/>
+      <w:r>
+        <w:t>centers</w:t>
+      </w:r>
+      <w:proofErr w:type="spellEnd"/>
+      <w:r>
+        <w:t xml:space="preserve"> the data around the mean of 0 and standard deviation of 1. Helping to prevent outliers </w:t>
+      </w:r>
+    </w:p>
+    <w:p>
+      <w:r>
+        <w:t xml:space="preserve">Add graphs showing checking for outliers – done some earlier on by changing to numeric values </w:t>
+      </w:r>
+    </w:p>
+    <w:p>
+      <w:r>
+        <w:t xml:space="preserve">Standard scaler used on all 13 variables </w:t>
+      </w:r>
+    </w:p>
+    <w:p>
+      <w:r>
+        <w:t xml:space="preserve">Min max scaler for price and rating </w:t>
+      </w:r>
+    </w:p>
+    <w:p>
+      <w:pPr>
+        <w:pStyle w:val="ListParagraph"/>
+        <w:numPr>
+          <w:ilvl w:val="0"/>
+          <w:numId w:val="3"/>
+        </w:numPr>
+        <w:rPr>
+          <w:b/>
+          <w:bCs/>
+        </w:rPr>
+      </w:pPr>
+      <w:r>
+        <w:rPr>
+          <w:b/>
+          <w:bCs/>
+        </w:rPr>
+        <w:t xml:space="preserve">Weighting and Aggregation </w:t>
+      </w:r>
+    </w:p>
     <w:p>
       <w:pPr>
         <w:rPr>

</xml_diff>

<commit_message>
Multivariate Analysis Write up Completed
I have created more graphs to represent my findings during the step 4 multivariate analysis, and added the results to the written Report.
</commit_message>
<xml_diff>
--- a/DAV_CA1_Report.docx
+++ b/DAV_CA1_Report.docx
@@ -371,8 +371,21 @@
             <w:color w:val="000000" w:themeColor="text1"/>
             <w:u w:val="none"/>
           </w:rPr>
-          <w:t>……..</w:t>
+          <w:t>…</w:t>
         </w:r>
+        <w:proofErr w:type="gramStart"/>
+        <w:r>
+          <w:rPr>
+            <w:rStyle w:val="Hyperlink"/>
+            <w:rFonts w:ascii="Aptos" w:hAnsi="Aptos" w:cs="Arial"/>
+            <w:b/>
+            <w:bCs/>
+            <w:color w:val="000000" w:themeColor="text1"/>
+            <w:u w:val="none"/>
+          </w:rPr>
+          <w:t>…..</w:t>
+        </w:r>
+        <w:proofErr w:type="gramEnd"/>
         <w:r>
           <w:rPr>
             <w:rStyle w:val="Hyperlink"/>
@@ -542,6 +555,7 @@
         </w:rPr>
         <w:fldChar w:fldCharType="separate"/>
       </w:r>
+      <w:proofErr w:type="gramStart"/>
       <w:r>
         <w:rPr>
           <w:rStyle w:val="Hyperlink"/>
@@ -564,6 +578,7 @@
         </w:rPr>
         <w:t>ub Groups</w:t>
       </w:r>
+      <w:proofErr w:type="gramEnd"/>
       <w:r>
         <w:rPr>
           <w:rStyle w:val="Hyperlink"/>
@@ -1174,6 +1189,7 @@
         </w:rPr>
         <w:t xml:space="preserve">Summary Table </w:t>
       </w:r>
+      <w:proofErr w:type="gramStart"/>
       <w:r>
         <w:rPr>
           <w:rStyle w:val="Hyperlink"/>
@@ -1196,6 +1212,7 @@
         </w:rPr>
         <w:t>..</w:t>
       </w:r>
+      <w:proofErr w:type="gramEnd"/>
       <w:r>
         <w:rPr>
           <w:rStyle w:val="Hyperlink"/>
@@ -2290,7 +2307,19 @@
           <w:szCs w:val="22"/>
           <w:u w:val="none"/>
         </w:rPr>
-        <w:t>…….………………………………………</w:t>
+        <w:t>…….……………………………………</w:t>
+      </w:r>
+      <w:proofErr w:type="gramStart"/>
+      <w:r>
+        <w:rPr>
+          <w:rStyle w:val="Hyperlink"/>
+          <w:rFonts w:ascii="Aptos" w:hAnsi="Aptos" w:cs="Arial"/>
+          <w:color w:val="000000" w:themeColor="text1"/>
+          <w:sz w:val="22"/>
+          <w:szCs w:val="22"/>
+          <w:u w:val="none"/>
+        </w:rPr>
+        <w:t>…</w:t>
       </w:r>
       <w:r>
         <w:rPr>
@@ -2303,6 +2332,7 @@
         </w:rPr>
         <w:t>..</w:t>
       </w:r>
+      <w:proofErr w:type="gramEnd"/>
       <w:r>
         <w:rPr>
           <w:rStyle w:val="Hyperlink"/>
@@ -2405,18 +2435,42 @@
           <w:szCs w:val="22"/>
           <w:u w:val="none"/>
         </w:rPr>
-        <w:t>…………………………………………………………………</w:t>
-      </w:r>
-      <w:r>
-        <w:rPr>
-          <w:rStyle w:val="Hyperlink"/>
-          <w:rFonts w:ascii="Aptos" w:hAnsi="Aptos" w:cs="Arial"/>
-          <w:color w:val="000000" w:themeColor="text1"/>
-          <w:sz w:val="22"/>
-          <w:szCs w:val="22"/>
-          <w:u w:val="none"/>
-        </w:rPr>
-        <w:t xml:space="preserve">.. </w:t>
+        <w:t>………………………………………………………………</w:t>
+      </w:r>
+      <w:proofErr w:type="gramStart"/>
+      <w:r>
+        <w:rPr>
+          <w:rStyle w:val="Hyperlink"/>
+          <w:rFonts w:ascii="Aptos" w:hAnsi="Aptos" w:cs="Arial"/>
+          <w:color w:val="000000" w:themeColor="text1"/>
+          <w:sz w:val="22"/>
+          <w:szCs w:val="22"/>
+          <w:u w:val="none"/>
+        </w:rPr>
+        <w:t>…</w:t>
+      </w:r>
+      <w:r>
+        <w:rPr>
+          <w:rStyle w:val="Hyperlink"/>
+          <w:rFonts w:ascii="Aptos" w:hAnsi="Aptos" w:cs="Arial"/>
+          <w:color w:val="000000" w:themeColor="text1"/>
+          <w:sz w:val="22"/>
+          <w:szCs w:val="22"/>
+          <w:u w:val="none"/>
+        </w:rPr>
+        <w:t>..</w:t>
+      </w:r>
+      <w:proofErr w:type="gramEnd"/>
+      <w:r>
+        <w:rPr>
+          <w:rStyle w:val="Hyperlink"/>
+          <w:rFonts w:ascii="Aptos" w:hAnsi="Aptos" w:cs="Arial"/>
+          <w:color w:val="000000" w:themeColor="text1"/>
+          <w:sz w:val="22"/>
+          <w:szCs w:val="22"/>
+          <w:u w:val="none"/>
+        </w:rPr>
+        <w:t xml:space="preserve"> </w:t>
       </w:r>
       <w:r>
         <w:rPr>
@@ -2509,29 +2563,53 @@
           <w:szCs w:val="22"/>
           <w:u w:val="none"/>
         </w:rPr>
-        <w:t>.……………………………………………………………</w:t>
-      </w:r>
-      <w:r>
-        <w:rPr>
-          <w:rStyle w:val="Hyperlink"/>
-          <w:rFonts w:ascii="Aptos" w:hAnsi="Aptos" w:cs="Arial"/>
-          <w:color w:val="000000" w:themeColor="text1"/>
-          <w:sz w:val="22"/>
-          <w:szCs w:val="22"/>
-          <w:u w:val="none"/>
-        </w:rPr>
-        <w:t xml:space="preserve"> </w:t>
-      </w:r>
-      <w:r>
-        <w:rPr>
-          <w:rStyle w:val="Hyperlink"/>
-          <w:rFonts w:ascii="Aptos" w:hAnsi="Aptos"/>
-          <w:color w:val="000000" w:themeColor="text1"/>
-          <w:sz w:val="22"/>
-          <w:szCs w:val="22"/>
-          <w:u w:val="none"/>
-        </w:rPr>
-        <w:t>18</w:t>
+        <w:t xml:space="preserve">and Possible </w:t>
+      </w:r>
+      <w:proofErr w:type="gramStart"/>
+      <w:r>
+        <w:rPr>
+          <w:rStyle w:val="Hyperlink"/>
+          <w:rFonts w:ascii="Aptos" w:hAnsi="Aptos" w:cs="Arial"/>
+          <w:color w:val="000000" w:themeColor="text1"/>
+          <w:sz w:val="22"/>
+          <w:szCs w:val="22"/>
+          <w:u w:val="none"/>
+        </w:rPr>
+        <w:t xml:space="preserve">Differences </w:t>
+      </w:r>
+      <w:r>
+        <w:rPr>
+          <w:rStyle w:val="Hyperlink"/>
+          <w:rFonts w:ascii="Aptos" w:hAnsi="Aptos" w:cs="Arial"/>
+          <w:color w:val="000000" w:themeColor="text1"/>
+          <w:sz w:val="22"/>
+          <w:szCs w:val="22"/>
+          <w:u w:val="none"/>
+        </w:rPr>
+        <w:t>.</w:t>
+      </w:r>
+      <w:proofErr w:type="gramEnd"/>
+      <w:r>
+        <w:rPr>
+          <w:rStyle w:val="Hyperlink"/>
+          <w:rFonts w:ascii="Aptos" w:hAnsi="Aptos" w:cs="Arial"/>
+          <w:color w:val="000000" w:themeColor="text1"/>
+          <w:sz w:val="22"/>
+          <w:szCs w:val="22"/>
+          <w:u w:val="none"/>
+        </w:rPr>
+        <w:t>…………………</w:t>
+      </w:r>
+      <w:r>
+        <w:rPr>
+          <w:rStyle w:val="Hyperlink"/>
+          <w:rFonts w:ascii="Aptos" w:hAnsi="Aptos" w:cs="Arial"/>
+          <w:color w:val="000000" w:themeColor="text1"/>
+          <w:sz w:val="22"/>
+          <w:szCs w:val="22"/>
+          <w:u w:val="none"/>
+        </w:rPr>
+        <w:t>……… 18</w:t>
       </w:r>
     </w:p>
     <w:p>
@@ -2539,14 +2617,9 @@
         <w:tabs>
           <w:tab w:val="right" w:pos="7920"/>
         </w:tabs>
-        <w:ind w:firstLine="1418"/>
-        <w:rPr>
-          <w:rStyle w:val="Hyperlink"/>
-          <w:rFonts w:ascii="Aptos" w:hAnsi="Aptos" w:cs="Arial"/>
-          <w:color w:val="000000" w:themeColor="text1"/>
-          <w:sz w:val="22"/>
-          <w:szCs w:val="22"/>
-          <w:u w:val="none"/>
+        <w:rPr>
+          <w:b/>
+          <w:bCs/>
         </w:rPr>
       </w:pPr>
       <w:r>
@@ -2557,85 +2630,6 @@
           <w:szCs w:val="22"/>
         </w:rPr>
         <w:fldChar w:fldCharType="end"/>
-      </w:r>
-      <w:r>
-        <w:rPr>
-          <w:rFonts w:ascii="Aptos" w:hAnsi="Aptos" w:cs="Arial"/>
-          <w:color w:val="000000" w:themeColor="text1"/>
-          <w:sz w:val="22"/>
-          <w:szCs w:val="22"/>
-        </w:rPr>
-        <w:fldChar w:fldCharType="begin"/>
-      </w:r>
-      <w:r>
-        <w:rPr>
-          <w:rFonts w:ascii="Aptos" w:hAnsi="Aptos" w:cs="Arial"/>
-          <w:color w:val="000000" w:themeColor="text1"/>
-          <w:sz w:val="22"/>
-          <w:szCs w:val="22"/>
-        </w:rPr>
-        <w:instrText>HYPERLINK  \l "_Sales_Strategy"</w:instrText>
-      </w:r>
-      <w:r>
-        <w:rPr>
-          <w:rFonts w:ascii="Aptos" w:hAnsi="Aptos" w:cs="Arial"/>
-          <w:color w:val="000000" w:themeColor="text1"/>
-          <w:sz w:val="22"/>
-          <w:szCs w:val="22"/>
-        </w:rPr>
-      </w:r>
-      <w:r>
-        <w:rPr>
-          <w:rFonts w:ascii="Aptos" w:hAnsi="Aptos" w:cs="Arial"/>
-          <w:color w:val="000000" w:themeColor="text1"/>
-          <w:sz w:val="22"/>
-          <w:szCs w:val="22"/>
-        </w:rPr>
-        <w:fldChar w:fldCharType="separate"/>
-      </w:r>
-      <w:r>
-        <w:rPr>
-          <w:rStyle w:val="Hyperlink"/>
-          <w:rFonts w:ascii="Aptos" w:hAnsi="Aptos" w:cs="Arial"/>
-          <w:color w:val="000000" w:themeColor="text1"/>
-          <w:sz w:val="22"/>
-          <w:szCs w:val="22"/>
-          <w:u w:val="none"/>
-        </w:rPr>
-        <w:t>Possible Differences</w:t>
-      </w:r>
-      <w:r>
-        <w:rPr>
-          <w:rStyle w:val="Hyperlink"/>
-          <w:rFonts w:ascii="Aptos" w:hAnsi="Aptos" w:cs="Arial"/>
-          <w:color w:val="000000" w:themeColor="text1"/>
-          <w:sz w:val="22"/>
-          <w:szCs w:val="22"/>
-          <w:u w:val="none"/>
-        </w:rPr>
-        <w:t>……………………………………………………………</w:t>
-      </w:r>
-      <w:r>
-        <w:rPr>
-          <w:rStyle w:val="Hyperlink"/>
-          <w:rFonts w:ascii="Aptos" w:hAnsi="Aptos" w:cs="Arial"/>
-          <w:color w:val="000000" w:themeColor="text1"/>
-          <w:sz w:val="22"/>
-          <w:szCs w:val="22"/>
-          <w:u w:val="none"/>
-        </w:rPr>
-        <w:t>..</w:t>
-      </w:r>
-      <w:r>
-        <w:rPr>
-          <w:rStyle w:val="Hyperlink"/>
-          <w:rFonts w:ascii="Aptos" w:hAnsi="Aptos"/>
-          <w:color w:val="000000" w:themeColor="text1"/>
-          <w:sz w:val="22"/>
-          <w:szCs w:val="22"/>
-          <w:u w:val="none"/>
-        </w:rPr>
-        <w:t>18</w:t>
       </w:r>
     </w:p>
     <w:p>
@@ -2662,15 +2656,6 @@
       </w:pPr>
       <w:r>
         <w:rPr>
-          <w:rFonts w:ascii="Aptos" w:hAnsi="Aptos" w:cs="Arial"/>
-          <w:color w:val="000000" w:themeColor="text1"/>
-          <w:sz w:val="22"/>
-          <w:szCs w:val="22"/>
-        </w:rPr>
-        <w:fldChar w:fldCharType="end"/>
-      </w:r>
-      <w:r>
-        <w:rPr>
           <w:b/>
           <w:bCs/>
         </w:rPr>
@@ -3005,7 +2990,19 @@
           <w:szCs w:val="22"/>
           <w:u w:val="none"/>
         </w:rPr>
-        <w:t>…….………………………………………</w:t>
+        <w:t>…….……………………………………</w:t>
+      </w:r>
+      <w:proofErr w:type="gramStart"/>
+      <w:r>
+        <w:rPr>
+          <w:rStyle w:val="Hyperlink"/>
+          <w:rFonts w:ascii="Aptos" w:hAnsi="Aptos" w:cs="Arial"/>
+          <w:color w:val="000000" w:themeColor="text1"/>
+          <w:sz w:val="22"/>
+          <w:szCs w:val="22"/>
+          <w:u w:val="none"/>
+        </w:rPr>
+        <w:t>…</w:t>
       </w:r>
       <w:r>
         <w:rPr>
@@ -3018,6 +3015,7 @@
         </w:rPr>
         <w:t>..</w:t>
       </w:r>
+      <w:proofErr w:type="gramEnd"/>
       <w:r>
         <w:rPr>
           <w:rStyle w:val="Hyperlink"/>
@@ -3235,8 +3233,21 @@
           <w:szCs w:val="22"/>
           <w:u w:val="none"/>
         </w:rPr>
-        <w:t>……..</w:t>
-      </w:r>
+        <w:t>…</w:t>
+      </w:r>
+      <w:proofErr w:type="gramStart"/>
+      <w:r>
+        <w:rPr>
+          <w:rStyle w:val="Hyperlink"/>
+          <w:rFonts w:ascii="Aptos" w:hAnsi="Aptos" w:cs="Arial"/>
+          <w:color w:val="000000" w:themeColor="text1"/>
+          <w:sz w:val="22"/>
+          <w:szCs w:val="22"/>
+          <w:u w:val="none"/>
+        </w:rPr>
+        <w:t>…..</w:t>
+      </w:r>
+      <w:proofErr w:type="gramEnd"/>
       <w:r>
         <w:rPr>
           <w:rStyle w:val="Hyperlink"/>
@@ -4067,8 +4078,21 @@
           <w:szCs w:val="22"/>
           <w:u w:val="none"/>
         </w:rPr>
-        <w:t>…………..</w:t>
-      </w:r>
+        <w:t>………</w:t>
+      </w:r>
+      <w:proofErr w:type="gramStart"/>
+      <w:r>
+        <w:rPr>
+          <w:rStyle w:val="Hyperlink"/>
+          <w:rFonts w:ascii="Aptos" w:hAnsi="Aptos" w:cs="Arial"/>
+          <w:color w:val="000000" w:themeColor="text1"/>
+          <w:sz w:val="22"/>
+          <w:szCs w:val="22"/>
+          <w:u w:val="none"/>
+        </w:rPr>
+        <w:t>…..</w:t>
+      </w:r>
+      <w:proofErr w:type="gramEnd"/>
       <w:r>
         <w:rPr>
           <w:rStyle w:val="Hyperlink"/>
@@ -4337,8 +4361,21 @@
           <w:szCs w:val="22"/>
           <w:u w:val="none"/>
         </w:rPr>
-        <w:t>…………..</w:t>
-      </w:r>
+        <w:t>………</w:t>
+      </w:r>
+      <w:proofErr w:type="gramStart"/>
+      <w:r>
+        <w:rPr>
+          <w:rStyle w:val="Hyperlink"/>
+          <w:rFonts w:ascii="Aptos" w:hAnsi="Aptos" w:cs="Arial"/>
+          <w:color w:val="000000" w:themeColor="text1"/>
+          <w:sz w:val="22"/>
+          <w:szCs w:val="22"/>
+          <w:u w:val="none"/>
+        </w:rPr>
+        <w:t>…..</w:t>
+      </w:r>
+      <w:proofErr w:type="gramEnd"/>
       <w:r>
         <w:rPr>
           <w:rStyle w:val="Hyperlink"/>
@@ -5232,7 +5269,15 @@
         <w:t>ariables</w:t>
       </w:r>
       <w:r>
-        <w:t xml:space="preserve"> via a trending products dataset, from this I gathered data for Ratings and Number of Reviews. </w:t>
+        <w:t xml:space="preserve"> via a trending products </w:t>
+      </w:r>
+      <w:proofErr w:type="gramStart"/>
+      <w:r>
+        <w:t>dataset,</w:t>
+      </w:r>
+      <w:proofErr w:type="gramEnd"/>
+      <w:r>
+        <w:t xml:space="preserve"> from this I gathered data for Ratings and Number of Reviews. </w:t>
       </w:r>
     </w:p>
     <w:p>
@@ -5500,7 +5545,15 @@
     </w:p>
     <w:p>
       <w:r>
-        <w:t xml:space="preserve">By utilising multiple sources for my data I believe I have a good foundation for addressing each sub index. </w:t>
+        <w:t xml:space="preserve">By utilising multiple sources for my </w:t>
+      </w:r>
+      <w:proofErr w:type="gramStart"/>
+      <w:r>
+        <w:t>data</w:t>
+      </w:r>
+      <w:proofErr w:type="gramEnd"/>
+      <w:r>
+        <w:t xml:space="preserve"> I believe I have a good foundation for addressing each sub index. </w:t>
       </w:r>
     </w:p>
     <w:p>
@@ -5560,7 +5613,15 @@
         <w:t xml:space="preserve">Strengths: </w:t>
       </w:r>
       <w:r>
-        <w:t xml:space="preserve">This indicator is based on the numerical variable of product price, </w:t>
+        <w:t xml:space="preserve">This indicator is based on the numerical variable of product </w:t>
+      </w:r>
+      <w:proofErr w:type="gramStart"/>
+      <w:r>
+        <w:t>price,</w:t>
+      </w:r>
+      <w:proofErr w:type="gramEnd"/>
+      <w:r>
+        <w:t xml:space="preserve"> </w:t>
       </w:r>
       <w:r>
         <w:t xml:space="preserve">this directly reflects the type of brand the product is from. For example, it can be assumed that a low price is from a drugstore brand and higher prices are from high end brands. </w:t>
@@ -5586,7 +5647,15 @@
         <w:t xml:space="preserve">Weaknesses: </w:t>
       </w:r>
       <w:r>
-        <w:t xml:space="preserve">The downside to the price variable is it is in US dollars, therefore it is important to consider this when considering the beauty market outside of the US. </w:t>
+        <w:t xml:space="preserve">The downside to the price variable is it is in US </w:t>
+      </w:r>
+      <w:proofErr w:type="gramStart"/>
+      <w:r>
+        <w:t>dollars,</w:t>
+      </w:r>
+      <w:proofErr w:type="gramEnd"/>
+      <w:r>
+        <w:t xml:space="preserve"> therefore it is important to consider this when considering the beauty market outside of the US. </w:t>
       </w:r>
     </w:p>
     <w:p>
@@ -5864,7 +5933,15 @@
         <w:t xml:space="preserve">: </w:t>
       </w:r>
       <w:r>
-        <w:t xml:space="preserve">This indicator has binary results with yes or no, therefore it doesn’t represent any brands who may be actively trying to move away from animal testing and are not approved yet or parent companies and suppliers that still test on animals. </w:t>
+        <w:t xml:space="preserve">This indicator has binary results with yes or </w:t>
+      </w:r>
+      <w:proofErr w:type="gramStart"/>
+      <w:r>
+        <w:t>no,</w:t>
+      </w:r>
+      <w:proofErr w:type="gramEnd"/>
+      <w:r>
+        <w:t xml:space="preserve"> therefore it doesn’t represent any brands who may be actively trying to move away from animal testing and are not approved yet or parent companies and suppliers that still test on animals. </w:t>
       </w:r>
     </w:p>
     <w:p>
@@ -5985,7 +6062,15 @@
         <w:t xml:space="preserve">: </w:t>
       </w:r>
       <w:r>
-        <w:t xml:space="preserve">This indicator has binary results with yes or no, therefore it doesn’t represent any brands who may be actively trying to move away from animal testing and are not approved yet or parent companies and suppliers that still test on animals. </w:t>
+        <w:t xml:space="preserve">This indicator has binary results with yes or </w:t>
+      </w:r>
+      <w:proofErr w:type="gramStart"/>
+      <w:r>
+        <w:t>no,</w:t>
+      </w:r>
+      <w:proofErr w:type="gramEnd"/>
+      <w:r>
+        <w:t xml:space="preserve"> therefore it doesn’t represent any brands who may be actively trying to move away from animal testing and are not approved yet or parent companies and suppliers that still test on animals. </w:t>
       </w:r>
     </w:p>
     <w:p/>
@@ -6842,27 +6927,75 @@
     </w:p>
     <w:p>
       <w:r>
-        <w:t>I performed checks on the raw products dataset and it contained no missing values.</w:t>
-      </w:r>
-    </w:p>
-    <w:p>
-      <w:r>
-        <w:t xml:space="preserve">For the cruelty free lists they didn’t require a check for null values as I web scraped these values straight from the PETA website. </w:t>
-      </w:r>
-    </w:p>
-    <w:p>
-      <w:r>
-        <w:t xml:space="preserve">The only dataset that contained missing values was the Toxic Chemicals List, it had missing values for the variables CSFId, CSF, Discontinued Date and Chemical Date Removed. There was a very high amount of missing values, including CSFId with 33973 values, CSF 34398, Discontinued Date 101715, and Chemical Date Removed with 11650. </w:t>
-      </w:r>
-    </w:p>
-    <w:p>
-      <w:r>
-        <w:t xml:space="preserve">To combat the missing values I first looked at the CSFId, from the original dataset I discovered this Id is given from the California State during their investigation into products. Therefore I gave the missing values a new value of 0 to remove the missing value. </w:t>
-      </w:r>
-    </w:p>
-    <w:p>
-      <w:r>
-        <w:t xml:space="preserve">For the CSF this includes specific ingredients in each product, as I do not have access to the exact ingredients I used a “Standard” value to fill missing values. </w:t>
+        <w:t xml:space="preserve">I performed checks on the raw products </w:t>
+      </w:r>
+      <w:proofErr w:type="gramStart"/>
+      <w:r>
+        <w:t>dataset</w:t>
+      </w:r>
+      <w:proofErr w:type="gramEnd"/>
+      <w:r>
+        <w:t xml:space="preserve"> and it contained no missing values.</w:t>
+      </w:r>
+    </w:p>
+    <w:p>
+      <w:r>
+        <w:t xml:space="preserve">For the cruelty free </w:t>
+      </w:r>
+      <w:proofErr w:type="gramStart"/>
+      <w:r>
+        <w:t>lists</w:t>
+      </w:r>
+      <w:proofErr w:type="gramEnd"/>
+      <w:r>
+        <w:t xml:space="preserve"> they didn’t require a check for null values as I web scraped these values straight from the PETA website. </w:t>
+      </w:r>
+    </w:p>
+    <w:p>
+      <w:r>
+        <w:t xml:space="preserve">The only dataset that contained missing values was the Toxic Chemicals List, it had missing values for the variables CSFId, CSF, Discontinued Date and Chemical Date Removed. There was a very high </w:t>
+      </w:r>
+      <w:proofErr w:type="gramStart"/>
+      <w:r>
+        <w:t>amount</w:t>
+      </w:r>
+      <w:proofErr w:type="gramEnd"/>
+      <w:r>
+        <w:t xml:space="preserve"> of missing values, including CSFId with 33973 values, CSF 34398, Discontinued Date 101715, and Chemical Date Removed with 11650. </w:t>
+      </w:r>
+    </w:p>
+    <w:p>
+      <w:r>
+        <w:t xml:space="preserve">To combat the missing </w:t>
+      </w:r>
+      <w:proofErr w:type="gramStart"/>
+      <w:r>
+        <w:t>values</w:t>
+      </w:r>
+      <w:proofErr w:type="gramEnd"/>
+      <w:r>
+        <w:t xml:space="preserve"> I first looked at the CSFId, from the original dataset I discovered this Id is given from the California State during their investigation into products. </w:t>
+      </w:r>
+      <w:proofErr w:type="gramStart"/>
+      <w:r>
+        <w:t>Therefore</w:t>
+      </w:r>
+      <w:proofErr w:type="gramEnd"/>
+      <w:r>
+        <w:t xml:space="preserve"> I gave the missing values a new value of 0 to remove the missing value. </w:t>
+      </w:r>
+    </w:p>
+    <w:p>
+      <w:r>
+        <w:t xml:space="preserve">For the CSF this includes specific ingredients in each product, as I do not have access to the exact </w:t>
+      </w:r>
+      <w:proofErr w:type="gramStart"/>
+      <w:r>
+        <w:t>ingredients</w:t>
+      </w:r>
+      <w:proofErr w:type="gramEnd"/>
+      <w:r>
+        <w:t xml:space="preserve"> I used a “Standard” value to fill missing values. </w:t>
       </w:r>
     </w:p>
     <w:p>
@@ -6891,7 +7024,23 @@
         <w:t xml:space="preserve">toxic chemicals </w:t>
       </w:r>
       <w:r>
-        <w:t xml:space="preserve">columns into the products dataset. After combining the dataset I found more missing values for PETA Status at 13105, Discontinued Date and Chemical Date Removed both had 12820 missing values. I believe this was due to the majority of the products from the original dataset did not have any chemicals. </w:t>
+        <w:t xml:space="preserve">columns into the products dataset. After combining the </w:t>
+      </w:r>
+      <w:proofErr w:type="gramStart"/>
+      <w:r>
+        <w:t>dataset</w:t>
+      </w:r>
+      <w:proofErr w:type="gramEnd"/>
+      <w:r>
+        <w:t xml:space="preserve"> I found more missing values for PETA Status at 13105, Discontinued Date and Chemical Date Removed both had 12820 missing values. I believe this was due to </w:t>
+      </w:r>
+      <w:proofErr w:type="gramStart"/>
+      <w:r>
+        <w:t>the majority of</w:t>
+      </w:r>
+      <w:proofErr w:type="gramEnd"/>
+      <w:r>
+        <w:t xml:space="preserve"> the products from the original dataset did not have any chemicals. </w:t>
       </w:r>
     </w:p>
     <w:p>
@@ -6926,7 +7075,15 @@
     </w:p>
     <w:p>
       <w:r>
-        <w:t xml:space="preserve">I checked the products dataset for outliers in numerical variables, these included the price and number of reviews. </w:t>
+        <w:t xml:space="preserve">I checked the products dataset for outliers in numerical </w:t>
+      </w:r>
+      <w:proofErr w:type="gramStart"/>
+      <w:r>
+        <w:t>variables,</w:t>
+      </w:r>
+      <w:proofErr w:type="gramEnd"/>
+      <w:r>
+        <w:t xml:space="preserve"> these included the price and number of reviews. </w:t>
       </w:r>
     </w:p>
     <w:p>
@@ -7112,7 +7269,15 @@
     <w:p/>
     <w:p>
       <w:r>
-        <w:t xml:space="preserve">The boxplot above displays the Number of Reviews for products, it outlines that there is a large range of reviews for brands. The data is not dealing with products that have the same popularity from consumers. The median is 5000 reviews, this means that half of the products in the dataset have more than 5000 consumer reviews and the other half have fewer than 5000 reviews. Majority of products have reviews between 2500 and 7500. I will not be removing any values for number of reviews, as this proves that some products are more popular with consumers than others. </w:t>
+        <w:t xml:space="preserve">The boxplot above displays the Number of Reviews for products, it outlines that there is a large range of reviews for brands. The data is not dealing with products that have the same popularity from consumers. The median is 5000 </w:t>
+      </w:r>
+      <w:proofErr w:type="gramStart"/>
+      <w:r>
+        <w:t>reviews,</w:t>
+      </w:r>
+      <w:proofErr w:type="gramEnd"/>
+      <w:r>
+        <w:t xml:space="preserve"> this means that half of the products in the dataset have more than 5000 consumer reviews and the other half have fewer than 5000 reviews. Majority of products have reviews between 2500 and 7500. I will not be removing any values for number of reviews, as this proves that some products are more popular with consumers than others. </w:t>
       </w:r>
     </w:p>
     <w:p>
@@ -7210,18 +7375,55 @@
       <w:r>
         <w:t xml:space="preserve">To deal with the categorical variables I transformed them to numeric values, firstly I changed the Cruelty Free and Toxic Chemical Amounts to int types. </w:t>
       </w:r>
-      <w:r>
-        <w:t xml:space="preserve">Therefore if a brand is certified cruelty free it will have a value of 1. For the toxic chemical amounts variable, I decided to use a 0 and 1 basis as well, as there are a lot of products per brand I believe it makes more sense to use this variable to show if a brand contains any toxic chemicals as a whole. </w:t>
-      </w:r>
-    </w:p>
-    <w:p>
-      <w:r>
-        <w:t xml:space="preserve">For the Category variable, I sorted the categories into is skincare or make up and use a 0 and 1 metric. For skin type I gave each type a number between 1 and 3, and applied these new values. </w:t>
-      </w:r>
-    </w:p>
-    <w:p>
-      <w:r>
-        <w:t xml:space="preserve">The product size variable included a number and ml for example 50ml, therefore I removed the ‘ml’ from each value to ensure there were only numbers in this variable. </w:t>
+      <w:proofErr w:type="gramStart"/>
+      <w:r>
+        <w:t>Therefore</w:t>
+      </w:r>
+      <w:proofErr w:type="gramEnd"/>
+      <w:r>
+        <w:t xml:space="preserve"> if a brand is certified cruelty free it will have a value of 1. For the toxic chemical </w:t>
+      </w:r>
+      <w:proofErr w:type="gramStart"/>
+      <w:r>
+        <w:t>amounts</w:t>
+      </w:r>
+      <w:proofErr w:type="gramEnd"/>
+      <w:r>
+        <w:t xml:space="preserve"> variable, I decided to use a 0 and 1 basis as well, as there are a lot of products per brand I believe it makes more sense to use this variable to show if a brand contains any toxic </w:t>
+      </w:r>
+      <w:proofErr w:type="gramStart"/>
+      <w:r>
+        <w:t>chemicals as a whole</w:t>
+      </w:r>
+      <w:proofErr w:type="gramEnd"/>
+      <w:r>
+        <w:t xml:space="preserve">. </w:t>
+      </w:r>
+    </w:p>
+    <w:p>
+      <w:r>
+        <w:t xml:space="preserve">For the Category variable, I sorted the categories into is skincare or make up and use a 0 and 1 metric. For skin type I gave each type a number between 1 and </w:t>
+      </w:r>
+      <w:proofErr w:type="gramStart"/>
+      <w:r>
+        <w:t>3, and</w:t>
+      </w:r>
+      <w:proofErr w:type="gramEnd"/>
+      <w:r>
+        <w:t xml:space="preserve"> applied these new values. </w:t>
+      </w:r>
+    </w:p>
+    <w:p>
+      <w:r>
+        <w:t xml:space="preserve">The product size variable included a number and ml for example </w:t>
+      </w:r>
+      <w:proofErr w:type="gramStart"/>
+      <w:r>
+        <w:t>50ml,</w:t>
+      </w:r>
+      <w:proofErr w:type="gramEnd"/>
+      <w:r>
+        <w:t xml:space="preserve"> therefore I removed the ‘ml’ from each value to ensure there were only numbers in this variable. </w:t>
       </w:r>
     </w:p>
     <w:p>
@@ -7252,7 +7454,23 @@
     </w:p>
     <w:p>
       <w:r>
-        <w:t xml:space="preserve">The country of origin variable included European countries and some countries outside of Europe, I changed this variable to be European Origin as products created in European countries have the same legislation therefore they are set apart from the US or Australia. </w:t>
+        <w:t xml:space="preserve">The </w:t>
+      </w:r>
+      <w:proofErr w:type="gramStart"/>
+      <w:r>
+        <w:t>country of origin</w:t>
+      </w:r>
+      <w:proofErr w:type="gramEnd"/>
+      <w:r>
+        <w:t xml:space="preserve"> variable included European countries and some countries outside of Europe, I changed this variable to be European Origin as products created in European countries have the same legislation </w:t>
+      </w:r>
+      <w:proofErr w:type="gramStart"/>
+      <w:r>
+        <w:t>therefore</w:t>
+      </w:r>
+      <w:proofErr w:type="gramEnd"/>
+      <w:r>
+        <w:t xml:space="preserve"> they are set apart from the US or Australia. </w:t>
       </w:r>
     </w:p>
     <w:p/>
@@ -7273,11 +7491,27 @@
     </w:p>
     <w:p>
       <w:r>
-        <w:t xml:space="preserve">By dealing with the missing values in the dataset I was able to safe important rows of data instead of removing the rows entirely and throwing away entire rows of product data. For example, if I had removed every row that did not have a PETA status, this would be removing data for no reason as the brand could be actively trying to get approved. By </w:t>
+        <w:t xml:space="preserve">By dealing with the missing values in the </w:t>
+      </w:r>
+      <w:proofErr w:type="gramStart"/>
+      <w:r>
+        <w:t>dataset</w:t>
+      </w:r>
+      <w:proofErr w:type="gramEnd"/>
+      <w:r>
+        <w:t xml:space="preserve"> I was able to safe important rows of data instead of removing the rows entirely and throwing away entire rows of product data. For example, if I had removed every row that did not have a PETA status, this would be removing data for no reason as the brand could be actively trying to get approved. By </w:t>
       </w:r>
       <w:r>
         <w:lastRenderedPageBreak/>
-        <w:t xml:space="preserve">filling in the missing values I was able to keep all of my beauty brands for the composite index. </w:t>
+        <w:t xml:space="preserve">filling in the missing values I was able to keep </w:t>
+      </w:r>
+      <w:proofErr w:type="gramStart"/>
+      <w:r>
+        <w:t>all of</w:t>
+      </w:r>
+      <w:proofErr w:type="gramEnd"/>
+      <w:r>
+        <w:t xml:space="preserve"> my beauty brands for the composite index. </w:t>
       </w:r>
     </w:p>
     <w:p>
@@ -7574,15 +7808,52 @@
       <w:pPr>
         <w:rPr>
           <w:rFonts w:ascii="Aptos" w:hAnsi="Aptos" w:cs="Arial"/>
-          <w:color w:val="000000" w:themeColor="text1"/>
-        </w:rPr>
-      </w:pPr>
-      <w:r>
-        <w:rPr>
-          <w:rFonts w:ascii="Aptos" w:hAnsi="Aptos" w:cs="Arial"/>
-          <w:color w:val="000000" w:themeColor="text1"/>
-        </w:rPr>
-        <w:t xml:space="preserve">As there are so many variables I decided to use a heatmap to display the correlation between variables. </w:t>
+          <w:b/>
+          <w:bCs/>
+          <w:color w:val="000000" w:themeColor="text1"/>
+          <w:u w:val="single"/>
+        </w:rPr>
+      </w:pPr>
+      <w:r>
+        <w:rPr>
+          <w:rFonts w:ascii="Aptos" w:hAnsi="Aptos" w:cs="Arial"/>
+          <w:b/>
+          <w:bCs/>
+          <w:color w:val="000000" w:themeColor="text1"/>
+          <w:u w:val="single"/>
+        </w:rPr>
+        <w:t xml:space="preserve">Heatmap </w:t>
+      </w:r>
+    </w:p>
+    <w:p>
+      <w:pPr>
+        <w:rPr>
+          <w:rFonts w:ascii="Aptos" w:hAnsi="Aptos" w:cs="Arial"/>
+          <w:color w:val="000000" w:themeColor="text1"/>
+        </w:rPr>
+      </w:pPr>
+      <w:r>
+        <w:rPr>
+          <w:rFonts w:ascii="Aptos" w:hAnsi="Aptos" w:cs="Arial"/>
+          <w:color w:val="000000" w:themeColor="text1"/>
+        </w:rPr>
+        <w:t xml:space="preserve">As there are so many </w:t>
+      </w:r>
+      <w:proofErr w:type="gramStart"/>
+      <w:r>
+        <w:rPr>
+          <w:rFonts w:ascii="Aptos" w:hAnsi="Aptos" w:cs="Arial"/>
+          <w:color w:val="000000" w:themeColor="text1"/>
+        </w:rPr>
+        <w:t>variables</w:t>
+      </w:r>
+      <w:proofErr w:type="gramEnd"/>
+      <w:r>
+        <w:rPr>
+          <w:rFonts w:ascii="Aptos" w:hAnsi="Aptos" w:cs="Arial"/>
+          <w:color w:val="000000" w:themeColor="text1"/>
+        </w:rPr>
+        <w:t xml:space="preserve"> I decided to use a heatmap to display the correlation between variables. </w:t>
       </w:r>
     </w:p>
     <w:p>
@@ -7678,7 +7949,39 @@
           <w:rFonts w:ascii="Aptos" w:hAnsi="Aptos" w:cs="Arial"/>
           <w:color w:val="000000" w:themeColor="text1"/>
         </w:rPr>
-        <w:t xml:space="preserve">From the heatmap I was able to see what variables had a high or low correlation, it is clear that there is an overall low linear correlation between variables as the correlation values are mostly between -0.30 and +0.30. </w:t>
+        <w:t xml:space="preserve">From the heatmap I was able to see what variables </w:t>
+      </w:r>
+      <w:proofErr w:type="gramStart"/>
+      <w:r>
+        <w:rPr>
+          <w:rFonts w:ascii="Aptos" w:hAnsi="Aptos" w:cs="Arial"/>
+          <w:color w:val="000000" w:themeColor="text1"/>
+        </w:rPr>
+        <w:t>had a high or low correlation</w:t>
+      </w:r>
+      <w:proofErr w:type="gramEnd"/>
+      <w:r>
+        <w:rPr>
+          <w:rFonts w:ascii="Aptos" w:hAnsi="Aptos" w:cs="Arial"/>
+          <w:color w:val="000000" w:themeColor="text1"/>
+        </w:rPr>
+        <w:t xml:space="preserve">, </w:t>
+      </w:r>
+      <w:proofErr w:type="gramStart"/>
+      <w:r>
+        <w:rPr>
+          <w:rFonts w:ascii="Aptos" w:hAnsi="Aptos" w:cs="Arial"/>
+          <w:color w:val="000000" w:themeColor="text1"/>
+        </w:rPr>
+        <w:t>it is clear that there</w:t>
+      </w:r>
+      <w:proofErr w:type="gramEnd"/>
+      <w:r>
+        <w:rPr>
+          <w:rFonts w:ascii="Aptos" w:hAnsi="Aptos" w:cs="Arial"/>
+          <w:color w:val="000000" w:themeColor="text1"/>
+        </w:rPr>
+        <w:t xml:space="preserve"> is an overall low linear correlation between variables as the correlation values are mostly between -0.30 and +0.30. </w:t>
       </w:r>
       <w:r>
         <w:rPr>
@@ -7793,7 +8096,15 @@
           <w:rFonts w:ascii="Aptos" w:hAnsi="Aptos" w:cs="Arial"/>
           <w:color w:val="000000" w:themeColor="text1"/>
         </w:rPr>
-        <w:t>For example, I expected brands with higher prices to have higher ratings however that is not the case.</w:t>
+        <w:t xml:space="preserve">For example, I expected brands with higher prices to have higher ratings </w:t>
+      </w:r>
+      <w:r>
+        <w:rPr>
+          <w:rFonts w:ascii="Aptos" w:hAnsi="Aptos" w:cs="Arial"/>
+          <w:color w:val="000000" w:themeColor="text1"/>
+        </w:rPr>
+        <w:lastRenderedPageBreak/>
+        <w:t>however that is not the case.</w:t>
       </w:r>
       <w:r>
         <w:rPr>
@@ -7821,80 +8132,425 @@
           <w:rFonts w:ascii="Aptos" w:hAnsi="Aptos" w:cs="Arial"/>
           <w:color w:val="000000" w:themeColor="text1"/>
         </w:rPr>
-        <w:t xml:space="preserve"> shows weak and low negative correlations with </w:t>
-      </w:r>
-      <w:r>
-        <w:rPr>
-          <w:rFonts w:ascii="Aptos" w:hAnsi="Aptos" w:cs="Arial"/>
-          <w:color w:val="000000" w:themeColor="text1"/>
+        <w:t xml:space="preserve"> shows weak and low negative correlations with the ethical variables like Is Cruelty Free at -0.26 and Toxic Chemicals Amount at -0.13. This indicates that the financial cost of products does not </w:t>
+      </w:r>
+      <w:r>
+        <w:rPr>
+          <w:rFonts w:ascii="Aptos" w:hAnsi="Aptos" w:cs="Arial"/>
+          <w:color w:val="000000" w:themeColor="text1"/>
+        </w:rPr>
+        <w:t>influence</w:t>
+      </w:r>
+      <w:r>
+        <w:rPr>
+          <w:rFonts w:ascii="Aptos" w:hAnsi="Aptos" w:cs="Arial"/>
+          <w:color w:val="000000" w:themeColor="text1"/>
+        </w:rPr>
+        <w:t xml:space="preserve"> the sustainability of products. </w:t>
+      </w:r>
+    </w:p>
+    <w:p>
+      <w:pPr>
+        <w:rPr>
+          <w:rFonts w:ascii="Aptos" w:hAnsi="Aptos" w:cs="Arial"/>
+          <w:color w:val="000000" w:themeColor="text1"/>
+        </w:rPr>
+      </w:pPr>
+      <w:r>
+        <w:rPr>
+          <w:rFonts w:ascii="Aptos" w:hAnsi="Aptos" w:cs="Arial"/>
+          <w:color w:val="000000" w:themeColor="text1"/>
+        </w:rPr>
+        <w:t xml:space="preserve">The most notable negative correlations involve usage frequency and product </w:t>
+      </w:r>
+      <w:proofErr w:type="gramStart"/>
+      <w:r>
+        <w:rPr>
+          <w:rFonts w:ascii="Aptos" w:hAnsi="Aptos" w:cs="Arial"/>
+          <w:color w:val="000000" w:themeColor="text1"/>
+        </w:rPr>
+        <w:t>size,</w:t>
+      </w:r>
+      <w:proofErr w:type="gramEnd"/>
+      <w:r>
+        <w:rPr>
+          <w:rFonts w:ascii="Aptos" w:hAnsi="Aptos" w:cs="Arial"/>
+          <w:color w:val="000000" w:themeColor="text1"/>
+        </w:rPr>
+        <w:t xml:space="preserve"> this makes sense as products meant to frequent use or daily application usually come in smaller sizes. Similarly active ingredients and number of reviews have a negative correlation of -0.38</w:t>
+      </w:r>
+      <w:r>
+        <w:rPr>
+          <w:rFonts w:ascii="Aptos" w:hAnsi="Aptos" w:cs="Arial"/>
+          <w:color w:val="000000" w:themeColor="text1"/>
+        </w:rPr>
+        <w:t xml:space="preserve">, this may refer to products which don’t have active ingredients have more reviews than those that do. </w:t>
+      </w:r>
+    </w:p>
+    <w:p>
+      <w:pPr>
+        <w:rPr>
+          <w:rFonts w:ascii="Aptos" w:hAnsi="Aptos" w:cs="Arial"/>
+          <w:b/>
+          <w:bCs/>
+          <w:color w:val="000000" w:themeColor="text1"/>
+          <w:u w:val="single"/>
+        </w:rPr>
+      </w:pPr>
+      <w:r>
+        <w:rPr>
+          <w:rFonts w:ascii="Aptos" w:hAnsi="Aptos" w:cs="Arial"/>
+          <w:b/>
+          <w:bCs/>
+          <w:color w:val="000000" w:themeColor="text1"/>
+          <w:u w:val="single"/>
+        </w:rPr>
+        <w:t>Scatter Plots</w:t>
+      </w:r>
+    </w:p>
+    <w:p>
+      <w:pPr>
+        <w:keepNext/>
+        <w:jc w:val="center"/>
+      </w:pPr>
+      <w:r>
+        <w:rPr>
+          <w:rFonts w:ascii="Aptos" w:hAnsi="Aptos" w:cs="Arial"/>
+          <w:color w:val="000000" w:themeColor="text1"/>
+        </w:rPr>
+        <w:drawing>
+          <wp:inline distT="0" distB="0" distL="0" distR="0" wp14:anchorId="121B3523" wp14:editId="0889C54D">
+            <wp:extent cx="2700957" cy="2133569"/>
+            <wp:effectExtent l="0" t="0" r="4445" b="635"/>
+            <wp:docPr id="2031590394" name="Picture 1"/>
+            <wp:cNvGraphicFramePr>
+              <a:graphicFrameLocks xmlns:a="http://schemas.openxmlformats.org/drawingml/2006/main" noChangeAspect="1"/>
+            </wp:cNvGraphicFramePr>
+            <a:graphic xmlns:a="http://schemas.openxmlformats.org/drawingml/2006/main">
+              <a:graphicData uri="http://schemas.openxmlformats.org/drawingml/2006/picture">
+                <pic:pic xmlns:pic="http://schemas.openxmlformats.org/drawingml/2006/picture">
+                  <pic:nvPicPr>
+                    <pic:cNvPr id="2031590394" name=""/>
+                    <pic:cNvPicPr/>
+                  </pic:nvPicPr>
+                  <pic:blipFill>
+                    <a:blip r:embed="rId12"/>
+                    <a:stretch>
+                      <a:fillRect/>
+                    </a:stretch>
+                  </pic:blipFill>
+                  <pic:spPr>
+                    <a:xfrm>
+                      <a:off x="0" y="0"/>
+                      <a:ext cx="2717310" cy="2146487"/>
+                    </a:xfrm>
+                    <a:prstGeom prst="rect">
+                      <a:avLst/>
+                    </a:prstGeom>
+                  </pic:spPr>
+                </pic:pic>
+              </a:graphicData>
+            </a:graphic>
+          </wp:inline>
+        </w:drawing>
+      </w:r>
+    </w:p>
+    <w:p>
+      <w:pPr>
+        <w:pStyle w:val="Caption"/>
+        <w:jc w:val="center"/>
+      </w:pPr>
+      <w:r>
+        <w:t xml:space="preserve">Figure </w:t>
+      </w:r>
+      <w:r>
+        <w:fldChar w:fldCharType="begin"/>
+      </w:r>
+      <w:r>
+        <w:instrText xml:space="preserve"> SEQ Figure \* ARABIC </w:instrText>
+      </w:r>
+      <w:r>
+        <w:fldChar w:fldCharType="separate"/>
+      </w:r>
+      <w:r>
+        <w:rPr>
+          <w:noProof/>
+        </w:rPr>
+        <w:t>5</w:t>
+      </w:r>
+      <w:r>
+        <w:fldChar w:fldCharType="end"/>
+      </w:r>
+      <w:r>
+        <w:t xml:space="preserve"> Price vs Rating</w:t>
+      </w:r>
+    </w:p>
+    <w:p/>
+    <w:p>
+      <w:pPr>
+        <w:keepNext/>
+        <w:jc w:val="center"/>
+      </w:pPr>
+      <w:r>
+        <w:rPr>
+          <w:rFonts w:ascii="Aptos" w:hAnsi="Aptos" w:cs="Arial"/>
+          <w:color w:val="000000" w:themeColor="text1"/>
+        </w:rPr>
+        <w:drawing>
+          <wp:inline distT="0" distB="0" distL="0" distR="0" wp14:anchorId="6C196126" wp14:editId="24B0EE09">
+            <wp:extent cx="2698782" cy="2117148"/>
+            <wp:effectExtent l="0" t="0" r="6350" b="0"/>
+            <wp:docPr id="99781286" name="Picture 1"/>
+            <wp:cNvGraphicFramePr>
+              <a:graphicFrameLocks xmlns:a="http://schemas.openxmlformats.org/drawingml/2006/main" noChangeAspect="1"/>
+            </wp:cNvGraphicFramePr>
+            <a:graphic xmlns:a="http://schemas.openxmlformats.org/drawingml/2006/main">
+              <a:graphicData uri="http://schemas.openxmlformats.org/drawingml/2006/picture">
+                <pic:pic xmlns:pic="http://schemas.openxmlformats.org/drawingml/2006/picture">
+                  <pic:nvPicPr>
+                    <pic:cNvPr id="99781286" name=""/>
+                    <pic:cNvPicPr/>
+                  </pic:nvPicPr>
+                  <pic:blipFill>
+                    <a:blip r:embed="rId13"/>
+                    <a:stretch>
+                      <a:fillRect/>
+                    </a:stretch>
+                  </pic:blipFill>
+                  <pic:spPr>
+                    <a:xfrm>
+                      <a:off x="0" y="0"/>
+                      <a:ext cx="2704771" cy="2121846"/>
+                    </a:xfrm>
+                    <a:prstGeom prst="rect">
+                      <a:avLst/>
+                    </a:prstGeom>
+                  </pic:spPr>
+                </pic:pic>
+              </a:graphicData>
+            </a:graphic>
+          </wp:inline>
+        </w:drawing>
+      </w:r>
+    </w:p>
+    <w:p>
+      <w:pPr>
+        <w:pStyle w:val="Caption"/>
+        <w:jc w:val="center"/>
+        <w:rPr>
+          <w:rFonts w:ascii="Aptos" w:hAnsi="Aptos" w:cs="Arial"/>
+          <w:color w:val="000000" w:themeColor="text1"/>
+        </w:rPr>
+      </w:pPr>
+      <w:r>
+        <w:t xml:space="preserve">Figure </w:t>
+      </w:r>
+      <w:r>
+        <w:fldChar w:fldCharType="begin"/>
+      </w:r>
+      <w:r>
+        <w:instrText xml:space="preserve"> SEQ Figure \* ARABIC </w:instrText>
+      </w:r>
+      <w:r>
+        <w:fldChar w:fldCharType="separate"/>
+      </w:r>
+      <w:r>
+        <w:rPr>
+          <w:noProof/>
+        </w:rPr>
+        <w:t>6</w:t>
+      </w:r>
+      <w:r>
+        <w:fldChar w:fldCharType="end"/>
+      </w:r>
+      <w:r>
+        <w:t xml:space="preserve"> Price vs Number of Reviews</w:t>
+      </w:r>
+    </w:p>
+    <w:p>
+      <w:pPr>
+        <w:rPr>
+          <w:rFonts w:ascii="Aptos" w:hAnsi="Aptos" w:cs="Arial"/>
+          <w:color w:val="000000" w:themeColor="text1"/>
+        </w:rPr>
+      </w:pPr>
+      <w:r>
+        <w:rPr>
+          <w:rFonts w:ascii="Aptos" w:hAnsi="Aptos" w:cs="Arial"/>
+          <w:color w:val="000000" w:themeColor="text1"/>
+        </w:rPr>
+        <w:t xml:space="preserve">The Scatter plots above back up my findings from the heatmap. </w:t>
+      </w:r>
+    </w:p>
+    <w:p>
+      <w:pPr>
+        <w:rPr>
+          <w:rFonts w:ascii="Aptos" w:hAnsi="Aptos" w:cs="Arial"/>
+          <w:color w:val="000000" w:themeColor="text1"/>
+        </w:rPr>
+      </w:pPr>
+      <w:r>
+        <w:rPr>
+          <w:rFonts w:ascii="Aptos" w:hAnsi="Aptos" w:cs="Arial"/>
+          <w:color w:val="000000" w:themeColor="text1"/>
+        </w:rPr>
+        <w:t xml:space="preserve">As my </w:t>
+      </w:r>
+      <w:r>
+        <w:rPr>
+          <w:rFonts w:ascii="Aptos" w:hAnsi="Aptos" w:cs="Arial"/>
+          <w:color w:val="000000" w:themeColor="text1"/>
+        </w:rPr>
+        <w:t xml:space="preserve">variables do not have simple linear relationships using principal component analysis will help me to discover the underlying of the data. </w:t>
+      </w:r>
+    </w:p>
+    <w:p>
+      <w:pPr>
+        <w:rPr>
+          <w:rFonts w:ascii="Aptos" w:hAnsi="Aptos" w:cs="Arial"/>
+          <w:color w:val="000000" w:themeColor="text1"/>
+        </w:rPr>
+      </w:pPr>
+    </w:p>
+    <w:p>
+      <w:pPr>
+        <w:rPr>
+          <w:b/>
+          <w:bCs/>
+        </w:rPr>
+      </w:pPr>
+      <w:r>
+        <w:rPr>
+          <w:b/>
+          <w:bCs/>
         </w:rPr>
         <w:lastRenderedPageBreak/>
-        <w:t xml:space="preserve">the ethical variables like Is Cruelty Free at -0.26 and Toxic Chemicals Amount at -0.13. This indicates that the financial cost of products does not </w:t>
-      </w:r>
-      <w:r>
-        <w:rPr>
-          <w:rFonts w:ascii="Aptos" w:hAnsi="Aptos" w:cs="Arial"/>
-          <w:color w:val="000000" w:themeColor="text1"/>
-        </w:rPr>
-        <w:t>influence</w:t>
-      </w:r>
-      <w:r>
-        <w:rPr>
-          <w:rFonts w:ascii="Aptos" w:hAnsi="Aptos" w:cs="Arial"/>
-          <w:color w:val="000000" w:themeColor="text1"/>
-        </w:rPr>
-        <w:t xml:space="preserve"> the sustainability of products. </w:t>
-      </w:r>
-    </w:p>
-    <w:p>
-      <w:pPr>
-        <w:rPr>
-          <w:rFonts w:ascii="Aptos" w:hAnsi="Aptos" w:cs="Arial"/>
-          <w:color w:val="000000" w:themeColor="text1"/>
-        </w:rPr>
-      </w:pPr>
-    </w:p>
-    <w:p>
-      <w:r>
-        <w:t xml:space="preserve">Usage frequency and product size is strong negative correlation of -0.35 makes sense as products to be used daily are usually smaller. </w:t>
-      </w:r>
-    </w:p>
-    <w:p>
-      <w:r>
-        <w:t>Packaging type and number of reviews, active ingredients and number of reviews have a strong negative correlation of -0.38.</w:t>
-      </w:r>
-    </w:p>
-    <w:p>
-      <w:pPr>
-        <w:rPr>
-          <w:rFonts w:ascii="Aptos" w:hAnsi="Aptos" w:cs="Arial"/>
-          <w:color w:val="000000" w:themeColor="text1"/>
-        </w:rPr>
-      </w:pPr>
-      <w:r>
-        <w:rPr>
-          <w:rFonts w:ascii="Aptos" w:hAnsi="Aptos" w:cs="Arial"/>
-          <w:color w:val="000000" w:themeColor="text1"/>
-        </w:rPr>
-        <w:t xml:space="preserve">As my </w:t>
-      </w:r>
-      <w:r>
-        <w:rPr>
-          <w:rFonts w:ascii="Aptos" w:hAnsi="Aptos" w:cs="Arial"/>
-          <w:color w:val="000000" w:themeColor="text1"/>
-        </w:rPr>
-        <w:t xml:space="preserve">variables do not have simple linear relationships using principal component analysis will help me to discover the underlying of the data. </w:t>
-      </w:r>
-    </w:p>
-    <w:p>
-      <w:pPr>
-        <w:rPr>
-          <w:rFonts w:ascii="Aptos" w:hAnsi="Aptos" w:cs="Arial"/>
-          <w:b/>
-          <w:bCs/>
-          <w:color w:val="000000" w:themeColor="text1"/>
-        </w:rPr>
-      </w:pPr>
+        <w:t>4.2 Principal Component Analysis</w:t>
+      </w:r>
+    </w:p>
+    <w:p>
+      <w:r>
+        <w:t xml:space="preserve">By carrying out PCA </w:t>
+      </w:r>
+      <w:r>
+        <w:t xml:space="preserve">we can take the 11 variables and see how they are naturally grouped together. </w:t>
+      </w:r>
+    </w:p>
+    <w:p>
+      <w:pPr>
+        <w:keepNext/>
+        <w:jc w:val="center"/>
+      </w:pPr>
+      <w:r>
+        <w:rPr>
+          <w:b/>
+          <w:bCs/>
+        </w:rPr>
+        <w:drawing>
+          <wp:inline distT="0" distB="0" distL="0" distR="0" wp14:anchorId="35C29E65" wp14:editId="06434862">
+            <wp:extent cx="4442663" cy="3092046"/>
+            <wp:effectExtent l="0" t="0" r="0" b="0"/>
+            <wp:docPr id="531594742" name="Picture 1"/>
+            <wp:cNvGraphicFramePr>
+              <a:graphicFrameLocks xmlns:a="http://schemas.openxmlformats.org/drawingml/2006/main" noChangeAspect="1"/>
+            </wp:cNvGraphicFramePr>
+            <a:graphic xmlns:a="http://schemas.openxmlformats.org/drawingml/2006/main">
+              <a:graphicData uri="http://schemas.openxmlformats.org/drawingml/2006/picture">
+                <pic:pic xmlns:pic="http://schemas.openxmlformats.org/drawingml/2006/picture">
+                  <pic:nvPicPr>
+                    <pic:cNvPr id="531594742" name=""/>
+                    <pic:cNvPicPr/>
+                  </pic:nvPicPr>
+                  <pic:blipFill>
+                    <a:blip r:embed="rId14"/>
+                    <a:stretch>
+                      <a:fillRect/>
+                    </a:stretch>
+                  </pic:blipFill>
+                  <pic:spPr>
+                    <a:xfrm>
+                      <a:off x="0" y="0"/>
+                      <a:ext cx="4456835" cy="3101910"/>
+                    </a:xfrm>
+                    <a:prstGeom prst="rect">
+                      <a:avLst/>
+                    </a:prstGeom>
+                  </pic:spPr>
+                </pic:pic>
+              </a:graphicData>
+            </a:graphic>
+          </wp:inline>
+        </w:drawing>
+      </w:r>
+    </w:p>
+    <w:p>
+      <w:pPr>
+        <w:pStyle w:val="Caption"/>
+        <w:jc w:val="center"/>
+      </w:pPr>
+      <w:r>
+        <w:t xml:space="preserve">Figure </w:t>
+      </w:r>
+      <w:r>
+        <w:fldChar w:fldCharType="begin"/>
+      </w:r>
+      <w:r>
+        <w:instrText xml:space="preserve"> SEQ Figure \* ARABIC </w:instrText>
+      </w:r>
+      <w:r>
+        <w:fldChar w:fldCharType="separate"/>
+      </w:r>
+      <w:r>
+        <w:rPr>
+          <w:noProof/>
+        </w:rPr>
+        <w:t>7</w:t>
+      </w:r>
+      <w:r>
+        <w:fldChar w:fldCharType="end"/>
+      </w:r>
+      <w:r>
+        <w:t xml:space="preserve"> Scree Plot</w:t>
+      </w:r>
+    </w:p>
+    <w:p>
+      <w:r>
+        <w:t xml:space="preserve">By using a Scree Plot it displays how much variance is explained by each principal component. </w:t>
+      </w:r>
+      <w:r>
+        <w:t>PC1</w:t>
+      </w:r>
+      <w:r>
+        <w:t xml:space="preserve"> captures the most variance at around 17% and PC2 explains 15%, after PC2 it drops </w:t>
+      </w:r>
+      <w:r>
+        <w:t>to</w:t>
+      </w:r>
+      <w:r>
+        <w:t xml:space="preserve"> PC3 at 11%. From PC3 onwards the line significantly drops</w:t>
+      </w:r>
+      <w:r>
+        <w:t xml:space="preserve">, the first three principal components capture a large portion of the total dataset variance. This confirms that the 11 variables can be condensed into three core </w:t>
+      </w:r>
+      <w:proofErr w:type="gramStart"/>
+      <w:r>
+        <w:t>principal</w:t>
+      </w:r>
+      <w:proofErr w:type="gramEnd"/>
+      <w:r>
+        <w:t xml:space="preserve"> components. </w:t>
+      </w:r>
+    </w:p>
+    <w:p>
+      <w:r>
+        <w:t xml:space="preserve">The 3 highest principal components were explained by the following variables PC1 is packaging type, PC2 is has active ingredients, and PC3 is the number of reviews. </w:t>
+      </w:r>
+      <w:r>
+        <w:t xml:space="preserve">The lowest performing principal components were the price and if the product is skincare. </w:t>
+      </w:r>
+      <w:r>
+        <w:t xml:space="preserve">It is surprising that the packaging type explains most of the variance in the data. </w:t>
+      </w:r>
     </w:p>
     <w:p/>
     <w:p>
@@ -7909,21 +8565,6 @@
           <w:b/>
           <w:bCs/>
         </w:rPr>
-        <w:t>4.2 Principal Component Analysis</w:t>
-      </w:r>
-    </w:p>
-    <w:p>
-      <w:pPr>
-        <w:rPr>
-          <w:b/>
-          <w:bCs/>
-        </w:rPr>
-      </w:pPr>
-      <w:r>
-        <w:rPr>
-          <w:b/>
-          <w:bCs/>
-        </w:rPr>
         <w:t>4.3 Cluster Analysis</w:t>
       </w:r>
     </w:p>
@@ -7932,30 +8573,752 @@
         <w:rPr>
           <w:b/>
           <w:bCs/>
-        </w:rPr>
-      </w:pPr>
-      <w:r>
-        <w:rPr>
-          <w:b/>
-          <w:bCs/>
-        </w:rPr>
+          <w:u w:val="single"/>
+        </w:rPr>
+      </w:pPr>
+      <w:r>
+        <w:rPr>
+          <w:b/>
+          <w:bCs/>
+          <w:u w:val="single"/>
+        </w:rPr>
+        <w:t xml:space="preserve">KMeans Clustering </w:t>
+      </w:r>
+    </w:p>
+    <w:p>
+      <w:r>
+        <w:t xml:space="preserve">For clustering </w:t>
+      </w:r>
+      <w:r>
+        <w:t xml:space="preserve">I decided to use the KMeans method, as I knew from the Principal Component Analysis how many clusters should be selected for the K variable. KMeans is great for numerical data, therefore it was a great fit for my dataset. </w:t>
+      </w:r>
+    </w:p>
+    <w:p>
+      <w:r>
+        <w:t xml:space="preserve">To confirm the number of clusters for the products dataset, I used the Elbow Method. By plotting a graph with the Sum of Squared Error and the Number of Clusters the optimal k can be found. </w:t>
+      </w:r>
+    </w:p>
+    <w:p>
+      <w:pPr>
+        <w:keepNext/>
+        <w:jc w:val="center"/>
+      </w:pPr>
+      <w:r>
+        <w:lastRenderedPageBreak/>
+        <w:drawing>
+          <wp:inline distT="0" distB="0" distL="0" distR="0" wp14:anchorId="48083F54" wp14:editId="72536A2D">
+            <wp:extent cx="4484536" cy="2845440"/>
+            <wp:effectExtent l="0" t="0" r="0" b="0"/>
+            <wp:docPr id="1628414137" name="Picture 1"/>
+            <wp:cNvGraphicFramePr>
+              <a:graphicFrameLocks xmlns:a="http://schemas.openxmlformats.org/drawingml/2006/main" noChangeAspect="1"/>
+            </wp:cNvGraphicFramePr>
+            <a:graphic xmlns:a="http://schemas.openxmlformats.org/drawingml/2006/main">
+              <a:graphicData uri="http://schemas.openxmlformats.org/drawingml/2006/picture">
+                <pic:pic xmlns:pic="http://schemas.openxmlformats.org/drawingml/2006/picture">
+                  <pic:nvPicPr>
+                    <pic:cNvPr id="1628414137" name=""/>
+                    <pic:cNvPicPr/>
+                  </pic:nvPicPr>
+                  <pic:blipFill>
+                    <a:blip r:embed="rId15"/>
+                    <a:stretch>
+                      <a:fillRect/>
+                    </a:stretch>
+                  </pic:blipFill>
+                  <pic:spPr>
+                    <a:xfrm>
+                      <a:off x="0" y="0"/>
+                      <a:ext cx="4495575" cy="2852445"/>
+                    </a:xfrm>
+                    <a:prstGeom prst="rect">
+                      <a:avLst/>
+                    </a:prstGeom>
+                  </pic:spPr>
+                </pic:pic>
+              </a:graphicData>
+            </a:graphic>
+          </wp:inline>
+        </w:drawing>
+      </w:r>
+    </w:p>
+    <w:p>
+      <w:pPr>
+        <w:pStyle w:val="Caption"/>
+        <w:jc w:val="center"/>
+      </w:pPr>
+      <w:r>
+        <w:t xml:space="preserve">Figure </w:t>
+      </w:r>
+      <w:r>
+        <w:fldChar w:fldCharType="begin"/>
+      </w:r>
+      <w:r>
+        <w:instrText xml:space="preserve"> SEQ Figure \* ARABIC </w:instrText>
+      </w:r>
+      <w:r>
+        <w:fldChar w:fldCharType="separate"/>
+      </w:r>
+      <w:r>
+        <w:rPr>
+          <w:noProof/>
+        </w:rPr>
+        <w:t>8</w:t>
+      </w:r>
+      <w:r>
+        <w:fldChar w:fldCharType="end"/>
+      </w:r>
+      <w:r>
+        <w:t xml:space="preserve"> The Elbow Plot</w:t>
+      </w:r>
+    </w:p>
+    <w:p>
+      <w:r>
+        <w:t xml:space="preserve">By looking at the plot </w:t>
+      </w:r>
+      <w:r>
+        <w:t>above we can see the drastic drop in the line between clusters 1 and 2, and clusters 2 and 3. This means that clusters 1 to 3 are the most accurate, after cluster 3 the line takes a sharp turn and flattens out. From the plot adding a 4</w:t>
+      </w:r>
+      <w:r>
+        <w:rPr>
+          <w:vertAlign w:val="superscript"/>
+        </w:rPr>
+        <w:t>th</w:t>
+      </w:r>
+      <w:r>
+        <w:t xml:space="preserve"> or 5</w:t>
+      </w:r>
+      <w:r>
+        <w:rPr>
+          <w:vertAlign w:val="superscript"/>
+        </w:rPr>
+        <w:t>th</w:t>
+      </w:r>
+      <w:r>
+        <w:t xml:space="preserve"> cluster doesn’t appear to lower the error. From the plot it is evident that the “elbow” forms perfectly at cluster 3, proving that splitting the brands from the dataset into 3 groups is the best choice. </w:t>
+      </w:r>
+    </w:p>
+    <w:p/>
+    <w:p>
+      <w:pPr>
+        <w:rPr>
+          <w:b/>
+          <w:bCs/>
+          <w:u w:val="single"/>
+        </w:rPr>
+      </w:pPr>
+      <w:r>
+        <w:rPr>
+          <w:b/>
+          <w:bCs/>
+          <w:u w:val="single"/>
+        </w:rPr>
+        <w:t>K</w:t>
+      </w:r>
+      <w:r>
+        <w:rPr>
+          <w:b/>
+          <w:bCs/>
+          <w:u w:val="single"/>
+        </w:rPr>
+        <w:t>M</w:t>
+      </w:r>
+      <w:r>
+        <w:rPr>
+          <w:b/>
+          <w:bCs/>
+          <w:u w:val="single"/>
+        </w:rPr>
+        <w:t xml:space="preserve">eans </w:t>
+      </w:r>
+      <w:r>
+        <w:rPr>
+          <w:b/>
+          <w:bCs/>
+          <w:u w:val="single"/>
+        </w:rPr>
+        <w:t>C</w:t>
+      </w:r>
+      <w:r>
+        <w:rPr>
+          <w:b/>
+          <w:bCs/>
+          <w:u w:val="single"/>
+        </w:rPr>
+        <w:t xml:space="preserve">lustering </w:t>
+      </w:r>
+      <w:r>
+        <w:rPr>
+          <w:b/>
+          <w:bCs/>
+          <w:u w:val="single"/>
+        </w:rPr>
+        <w:t>G</w:t>
+      </w:r>
+      <w:r>
+        <w:rPr>
+          <w:b/>
+          <w:bCs/>
+          <w:u w:val="single"/>
+        </w:rPr>
+        <w:t xml:space="preserve">raph </w:t>
+      </w:r>
+    </w:p>
+    <w:p>
+      <w:pPr>
+        <w:keepNext/>
+        <w:jc w:val="center"/>
+      </w:pPr>
+      <w:r>
+        <w:drawing>
+          <wp:inline distT="0" distB="0" distL="0" distR="0" wp14:anchorId="4C64E9DE" wp14:editId="64A5EDCE">
+            <wp:extent cx="4055165" cy="3307405"/>
+            <wp:effectExtent l="0" t="0" r="2540" b="7620"/>
+            <wp:docPr id="181787138" name="Picture 1"/>
+            <wp:cNvGraphicFramePr>
+              <a:graphicFrameLocks xmlns:a="http://schemas.openxmlformats.org/drawingml/2006/main" noChangeAspect="1"/>
+            </wp:cNvGraphicFramePr>
+            <a:graphic xmlns:a="http://schemas.openxmlformats.org/drawingml/2006/main">
+              <a:graphicData uri="http://schemas.openxmlformats.org/drawingml/2006/picture">
+                <pic:pic xmlns:pic="http://schemas.openxmlformats.org/drawingml/2006/picture">
+                  <pic:nvPicPr>
+                    <pic:cNvPr id="181787138" name=""/>
+                    <pic:cNvPicPr/>
+                  </pic:nvPicPr>
+                  <pic:blipFill>
+                    <a:blip r:embed="rId16"/>
+                    <a:stretch>
+                      <a:fillRect/>
+                    </a:stretch>
+                  </pic:blipFill>
+                  <pic:spPr>
+                    <a:xfrm>
+                      <a:off x="0" y="0"/>
+                      <a:ext cx="4065793" cy="3316073"/>
+                    </a:xfrm>
+                    <a:prstGeom prst="rect">
+                      <a:avLst/>
+                    </a:prstGeom>
+                  </pic:spPr>
+                </pic:pic>
+              </a:graphicData>
+            </a:graphic>
+          </wp:inline>
+        </w:drawing>
+      </w:r>
+    </w:p>
+    <w:p>
+      <w:pPr>
+        <w:pStyle w:val="Caption"/>
+        <w:jc w:val="center"/>
+      </w:pPr>
+      <w:r>
+        <w:t xml:space="preserve">Figure </w:t>
+      </w:r>
+      <w:r>
+        <w:fldChar w:fldCharType="begin"/>
+      </w:r>
+      <w:r>
+        <w:instrText xml:space="preserve"> SEQ Figure \* ARABIC </w:instrText>
+      </w:r>
+      <w:r>
+        <w:fldChar w:fldCharType="separate"/>
+      </w:r>
+      <w:r>
+        <w:rPr>
+          <w:noProof/>
+        </w:rPr>
+        <w:t>9</w:t>
+      </w:r>
+      <w:r>
+        <w:fldChar w:fldCharType="end"/>
+      </w:r>
+      <w:r>
+        <w:t xml:space="preserve"> KMeans Clusters</w:t>
+      </w:r>
+    </w:p>
+    <w:p>
+      <w:pPr>
+        <w:rPr>
+          <w:b/>
+          <w:bCs/>
+          <w:u w:val="single"/>
+        </w:rPr>
+      </w:pPr>
+      <w:r>
+        <w:rPr>
+          <w:noProof/>
+        </w:rPr>
+        <w:lastRenderedPageBreak/>
+        <w:drawing>
+          <wp:anchor distT="0" distB="0" distL="114300" distR="114300" simplePos="0" relativeHeight="251664384" behindDoc="0" locked="0" layoutInCell="1" allowOverlap="1" wp14:anchorId="5FF0AB10" wp14:editId="45ABE18B">
+            <wp:simplePos x="0" y="0"/>
+            <wp:positionH relativeFrom="margin">
+              <wp:posOffset>3903980</wp:posOffset>
+            </wp:positionH>
+            <wp:positionV relativeFrom="paragraph">
+              <wp:posOffset>486410</wp:posOffset>
+            </wp:positionV>
+            <wp:extent cx="2155190" cy="6390005"/>
+            <wp:effectExtent l="0" t="0" r="0" b="0"/>
+            <wp:wrapSquare wrapText="bothSides"/>
+            <wp:docPr id="1461982349" name="Picture 1"/>
+            <wp:cNvGraphicFramePr>
+              <a:graphicFrameLocks xmlns:a="http://schemas.openxmlformats.org/drawingml/2006/main" noChangeAspect="1"/>
+            </wp:cNvGraphicFramePr>
+            <a:graphic xmlns:a="http://schemas.openxmlformats.org/drawingml/2006/main">
+              <a:graphicData uri="http://schemas.openxmlformats.org/drawingml/2006/picture">
+                <pic:pic xmlns:pic="http://schemas.openxmlformats.org/drawingml/2006/picture">
+                  <pic:nvPicPr>
+                    <pic:cNvPr id="1461982349" name=""/>
+                    <pic:cNvPicPr/>
+                  </pic:nvPicPr>
+                  <pic:blipFill>
+                    <a:blip r:embed="rId17">
+                      <a:extLst>
+                        <a:ext uri="{28A0092B-C50C-407E-A947-70E740481C1C}">
+                          <a14:useLocalDpi xmlns:a14="http://schemas.microsoft.com/office/drawing/2010/main" val="0"/>
+                        </a:ext>
+                      </a:extLst>
+                    </a:blip>
+                    <a:stretch>
+                      <a:fillRect/>
+                    </a:stretch>
+                  </pic:blipFill>
+                  <pic:spPr>
+                    <a:xfrm>
+                      <a:off x="0" y="0"/>
+                      <a:ext cx="2155190" cy="6390005"/>
+                    </a:xfrm>
+                    <a:prstGeom prst="rect">
+                      <a:avLst/>
+                    </a:prstGeom>
+                  </pic:spPr>
+                </pic:pic>
+              </a:graphicData>
+            </a:graphic>
+            <wp14:sizeRelH relativeFrom="margin">
+              <wp14:pctWidth>0</wp14:pctWidth>
+            </wp14:sizeRelH>
+            <wp14:sizeRelV relativeFrom="margin">
+              <wp14:pctHeight>0</wp14:pctHeight>
+            </wp14:sizeRelV>
+          </wp:anchor>
+        </w:drawing>
+      </w:r>
+      <w:r>
+        <w:rPr>
+          <w:b/>
+          <w:bCs/>
+          <w:u w:val="single"/>
+        </w:rPr>
+        <w:t>Clusters in the Dataset</w:t>
+      </w:r>
+    </w:p>
+    <w:p>
+      <w:pPr>
+        <w:keepNext/>
+        <w:jc w:val="center"/>
+      </w:pPr>
+      <w:r>
+        <w:rPr>
+          <w:b/>
+          <w:bCs/>
+        </w:rPr>
+        <w:drawing>
+          <wp:anchor distT="0" distB="0" distL="114300" distR="114300" simplePos="0" relativeHeight="251663360" behindDoc="0" locked="0" layoutInCell="1" allowOverlap="1" wp14:anchorId="0B446D1F" wp14:editId="2C0AF983">
+            <wp:simplePos x="0" y="0"/>
+            <wp:positionH relativeFrom="column">
+              <wp:posOffset>1931670</wp:posOffset>
+            </wp:positionH>
+            <wp:positionV relativeFrom="paragraph">
+              <wp:posOffset>151765</wp:posOffset>
+            </wp:positionV>
+            <wp:extent cx="1651000" cy="5112385"/>
+            <wp:effectExtent l="0" t="0" r="6350" b="0"/>
+            <wp:wrapSquare wrapText="bothSides"/>
+            <wp:docPr id="1713393159" name="Picture 1"/>
+            <wp:cNvGraphicFramePr>
+              <a:graphicFrameLocks xmlns:a="http://schemas.openxmlformats.org/drawingml/2006/main" noChangeAspect="1"/>
+            </wp:cNvGraphicFramePr>
+            <a:graphic xmlns:a="http://schemas.openxmlformats.org/drawingml/2006/main">
+              <a:graphicData uri="http://schemas.openxmlformats.org/drawingml/2006/picture">
+                <pic:pic xmlns:pic="http://schemas.openxmlformats.org/drawingml/2006/picture">
+                  <pic:nvPicPr>
+                    <pic:cNvPr id="1713393159" name=""/>
+                    <pic:cNvPicPr/>
+                  </pic:nvPicPr>
+                  <pic:blipFill>
+                    <a:blip r:embed="rId18">
+                      <a:extLst>
+                        <a:ext uri="{28A0092B-C50C-407E-A947-70E740481C1C}">
+                          <a14:useLocalDpi xmlns:a14="http://schemas.microsoft.com/office/drawing/2010/main" val="0"/>
+                        </a:ext>
+                      </a:extLst>
+                    </a:blip>
+                    <a:stretch>
+                      <a:fillRect/>
+                    </a:stretch>
+                  </pic:blipFill>
+                  <pic:spPr>
+                    <a:xfrm>
+                      <a:off x="0" y="0"/>
+                      <a:ext cx="1651000" cy="5112385"/>
+                    </a:xfrm>
+                    <a:prstGeom prst="rect">
+                      <a:avLst/>
+                    </a:prstGeom>
+                  </pic:spPr>
+                </pic:pic>
+              </a:graphicData>
+            </a:graphic>
+            <wp14:sizeRelH relativeFrom="margin">
+              <wp14:pctWidth>0</wp14:pctWidth>
+            </wp14:sizeRelH>
+            <wp14:sizeRelV relativeFrom="margin">
+              <wp14:pctHeight>0</wp14:pctHeight>
+            </wp14:sizeRelV>
+          </wp:anchor>
+        </w:drawing>
+      </w:r>
+      <w:r>
+        <w:rPr>
+          <w:b/>
+          <w:bCs/>
+        </w:rPr>
+        <w:drawing>
+          <wp:anchor distT="0" distB="0" distL="114300" distR="114300" simplePos="0" relativeHeight="251662336" behindDoc="0" locked="0" layoutInCell="1" allowOverlap="1" wp14:anchorId="6694A9F8" wp14:editId="2E4E686C">
+            <wp:simplePos x="0" y="0"/>
+            <wp:positionH relativeFrom="column">
+              <wp:posOffset>23495</wp:posOffset>
+            </wp:positionH>
+            <wp:positionV relativeFrom="paragraph">
+              <wp:posOffset>88265</wp:posOffset>
+            </wp:positionV>
+            <wp:extent cx="1748790" cy="5695950"/>
+            <wp:effectExtent l="0" t="0" r="3810" b="0"/>
+            <wp:wrapSquare wrapText="bothSides"/>
+            <wp:docPr id="332676569" name="Picture 1"/>
+            <wp:cNvGraphicFramePr>
+              <a:graphicFrameLocks xmlns:a="http://schemas.openxmlformats.org/drawingml/2006/main" noChangeAspect="1"/>
+            </wp:cNvGraphicFramePr>
+            <a:graphic xmlns:a="http://schemas.openxmlformats.org/drawingml/2006/main">
+              <a:graphicData uri="http://schemas.openxmlformats.org/drawingml/2006/picture">
+                <pic:pic xmlns:pic="http://schemas.openxmlformats.org/drawingml/2006/picture">
+                  <pic:nvPicPr>
+                    <pic:cNvPr id="332676569" name=""/>
+                    <pic:cNvPicPr/>
+                  </pic:nvPicPr>
+                  <pic:blipFill>
+                    <a:blip r:embed="rId19">
+                      <a:extLst>
+                        <a:ext uri="{28A0092B-C50C-407E-A947-70E740481C1C}">
+                          <a14:useLocalDpi xmlns:a14="http://schemas.microsoft.com/office/drawing/2010/main" val="0"/>
+                        </a:ext>
+                      </a:extLst>
+                    </a:blip>
+                    <a:stretch>
+                      <a:fillRect/>
+                    </a:stretch>
+                  </pic:blipFill>
+                  <pic:spPr>
+                    <a:xfrm>
+                      <a:off x="0" y="0"/>
+                      <a:ext cx="1748790" cy="5695950"/>
+                    </a:xfrm>
+                    <a:prstGeom prst="rect">
+                      <a:avLst/>
+                    </a:prstGeom>
+                  </pic:spPr>
+                </pic:pic>
+              </a:graphicData>
+            </a:graphic>
+            <wp14:sizeRelH relativeFrom="margin">
+              <wp14:pctWidth>0</wp14:pctWidth>
+            </wp14:sizeRelH>
+          </wp:anchor>
+        </w:drawing>
+      </w:r>
+    </w:p>
+    <w:p>
+      <w:pPr>
+        <w:rPr>
+          <w:b/>
+          <w:bCs/>
+        </w:rPr>
+      </w:pPr>
+      <w:r>
+        <w:rPr>
+          <w:noProof/>
+        </w:rPr>
+        <w:t xml:space="preserve">  </w:t>
+      </w:r>
+    </w:p>
+    <w:p>
+      <w:pPr>
+        <w:rPr>
+          <w:b/>
+          <w:bCs/>
+        </w:rPr>
+      </w:pPr>
+    </w:p>
+    <w:p>
+      <w:pPr>
+        <w:rPr>
+          <w:b/>
+          <w:bCs/>
+        </w:rPr>
+      </w:pPr>
+    </w:p>
+    <w:p>
+      <w:pPr>
+        <w:rPr>
+          <w:b/>
+          <w:bCs/>
+        </w:rPr>
+      </w:pPr>
+    </w:p>
+    <w:p>
+      <w:pPr>
+        <w:rPr>
+          <w:b/>
+          <w:bCs/>
+        </w:rPr>
+      </w:pPr>
+    </w:p>
+    <w:p>
+      <w:pPr>
+        <w:rPr>
+          <w:b/>
+          <w:bCs/>
+        </w:rPr>
+      </w:pPr>
+    </w:p>
+    <w:p>
+      <w:pPr>
+        <w:rPr>
+          <w:b/>
+          <w:bCs/>
+        </w:rPr>
+      </w:pPr>
+    </w:p>
+    <w:p>
+      <w:pPr>
+        <w:rPr>
+          <w:b/>
+          <w:bCs/>
+        </w:rPr>
+      </w:pPr>
+    </w:p>
+    <w:p>
+      <w:pPr>
+        <w:rPr>
+          <w:b/>
+          <w:bCs/>
+        </w:rPr>
+      </w:pPr>
+    </w:p>
+    <w:p>
+      <w:pPr>
+        <w:rPr>
+          <w:b/>
+          <w:bCs/>
+        </w:rPr>
+      </w:pPr>
+      <w:r>
+        <w:rPr>
+          <w:b/>
+          <w:bCs/>
+        </w:rPr>
+        <w:lastRenderedPageBreak/>
         <w:t>4.4 Groups of Indicators</w:t>
       </w:r>
-    </w:p>
-    <w:p>
-      <w:pPr>
-        <w:rPr>
-          <w:b/>
-          <w:bCs/>
-        </w:rPr>
-      </w:pPr>
-      <w:r>
-        <w:rPr>
-          <w:b/>
-          <w:bCs/>
-        </w:rPr>
-        <w:t xml:space="preserve">4.5 Possible Differences </w:t>
-      </w:r>
+      <w:r>
+        <w:rPr>
+          <w:b/>
+          <w:bCs/>
+        </w:rPr>
+        <w:t xml:space="preserve"> and Possible Differences </w:t>
+      </w:r>
+    </w:p>
+    <w:p>
+      <w:r>
+        <w:t xml:space="preserve">From </w:t>
+      </w:r>
+      <w:r>
+        <w:t xml:space="preserve">carrying out KMeans clustering I checked the average of each variable per clusters and the results include: </w:t>
+      </w:r>
+    </w:p>
+    <w:p>
+      <w:pPr>
+        <w:keepNext/>
+        <w:jc w:val="center"/>
+      </w:pPr>
+      <w:r>
+        <w:drawing>
+          <wp:inline distT="0" distB="0" distL="0" distR="0" wp14:anchorId="0C478478" wp14:editId="7CFCB773">
+            <wp:extent cx="4038971" cy="4077807"/>
+            <wp:effectExtent l="0" t="0" r="0" b="0"/>
+            <wp:docPr id="771397784" name="Picture 1"/>
+            <wp:cNvGraphicFramePr>
+              <a:graphicFrameLocks xmlns:a="http://schemas.openxmlformats.org/drawingml/2006/main" noChangeAspect="1"/>
+            </wp:cNvGraphicFramePr>
+            <a:graphic xmlns:a="http://schemas.openxmlformats.org/drawingml/2006/main">
+              <a:graphicData uri="http://schemas.openxmlformats.org/drawingml/2006/picture">
+                <pic:pic xmlns:pic="http://schemas.openxmlformats.org/drawingml/2006/picture">
+                  <pic:nvPicPr>
+                    <pic:cNvPr id="771397784" name=""/>
+                    <pic:cNvPicPr/>
+                  </pic:nvPicPr>
+                  <pic:blipFill>
+                    <a:blip r:embed="rId20"/>
+                    <a:stretch>
+                      <a:fillRect/>
+                    </a:stretch>
+                  </pic:blipFill>
+                  <pic:spPr>
+                    <a:xfrm>
+                      <a:off x="0" y="0"/>
+                      <a:ext cx="4042081" cy="4080947"/>
+                    </a:xfrm>
+                    <a:prstGeom prst="rect">
+                      <a:avLst/>
+                    </a:prstGeom>
+                  </pic:spPr>
+                </pic:pic>
+              </a:graphicData>
+            </a:graphic>
+          </wp:inline>
+        </w:drawing>
+      </w:r>
+    </w:p>
+    <w:p>
+      <w:pPr>
+        <w:pStyle w:val="Caption"/>
+        <w:jc w:val="center"/>
+      </w:pPr>
+      <w:r>
+        <w:t xml:space="preserve">Figure </w:t>
+      </w:r>
+      <w:r>
+        <w:fldChar w:fldCharType="begin"/>
+      </w:r>
+      <w:r>
+        <w:instrText xml:space="preserve"> SEQ Figure \* ARABIC </w:instrText>
+      </w:r>
+      <w:r>
+        <w:fldChar w:fldCharType="separate"/>
+      </w:r>
+      <w:r>
+        <w:rPr>
+          <w:noProof/>
+        </w:rPr>
+        <w:t>10</w:t>
+      </w:r>
+      <w:r>
+        <w:fldChar w:fldCharType="end"/>
+      </w:r>
+      <w:r>
+        <w:t xml:space="preserve"> Table of Variable Averages Per Cluster</w:t>
+      </w:r>
+    </w:p>
+    <w:p>
+      <w:pPr>
+        <w:rPr>
+          <w:u w:val="single"/>
+        </w:rPr>
+      </w:pPr>
+      <w:r>
+        <w:rPr>
+          <w:b/>
+          <w:bCs/>
+          <w:u w:val="single"/>
+        </w:rPr>
+        <w:t>Cluster 0</w:t>
+      </w:r>
+    </w:p>
+    <w:p>
+      <w:r>
+        <w:t xml:space="preserve">None of the brands in cluster 0 are certified cruelty free as this value is at 0%, this value is significantly lower than the other clusters. The brands in this cluster have fewer toxic chemicals than cluster </w:t>
+      </w:r>
+      <w:r>
+        <w:t>1 and</w:t>
+      </w:r>
+      <w:r>
+        <w:t xml:space="preserve"> 2 at around 365. </w:t>
+      </w:r>
+    </w:p>
+    <w:p>
+      <w:r>
+        <w:t xml:space="preserve">The brands in this cluster have products that cost a bit more than cluster 1, with the lowest amount of chemicals in their products however they have no cruelty free certifications. </w:t>
+      </w:r>
+    </w:p>
+    <w:p>
+      <w:pPr>
+        <w:rPr>
+          <w:u w:val="single"/>
+        </w:rPr>
+      </w:pPr>
+      <w:r>
+        <w:rPr>
+          <w:b/>
+          <w:bCs/>
+          <w:u w:val="single"/>
+        </w:rPr>
+        <w:t>Cluster 1</w:t>
+      </w:r>
+    </w:p>
+    <w:p>
+      <w:r>
+        <w:t>This cluster includes brands that can be considered budget friendly</w:t>
+      </w:r>
+      <w:r>
+        <w:t xml:space="preserve">, taking up the lowest price points of 19% of the data. It contains 22% of cruelty free brands from the dataset, this is more than the other two clusters have. </w:t>
+      </w:r>
+      <w:r>
+        <w:t xml:space="preserve">The brands in Cluster 1 contain around 390 toxic chemicals on average, this is a lot. </w:t>
+      </w:r>
+    </w:p>
+    <w:p>
+      <w:r>
+        <w:lastRenderedPageBreak/>
+        <w:t xml:space="preserve">Cluster 1 contains brands at the cheapest price point, with the highest percentage of cruelty free brands however the downside is they use slightly more toxic chemicals at 390, this could be to keep the costs down of the overall product. </w:t>
+      </w:r>
+    </w:p>
+    <w:p>
+      <w:pPr>
+        <w:rPr>
+          <w:b/>
+          <w:bCs/>
+          <w:u w:val="single"/>
+        </w:rPr>
+      </w:pPr>
+      <w:r>
+        <w:rPr>
+          <w:b/>
+          <w:bCs/>
+          <w:u w:val="single"/>
+        </w:rPr>
+        <w:t>Cluster 2</w:t>
+      </w:r>
+    </w:p>
+    <w:p>
+      <w:r>
+        <w:t xml:space="preserve">Cluster 2 contains the brands that can be considered as high end or luxury beauty brands, with the price taking up 60% of the data. </w:t>
+      </w:r>
+    </w:p>
+    <w:p>
+      <w:r>
+        <w:t xml:space="preserve">These brands are the most expensive compared to the brands in clusters 1 and 2, they score in the middle for chemicals amounts and ethical compliance. </w:t>
+      </w:r>
+    </w:p>
+    <w:p>
+      <w:pPr>
+        <w:rPr>
+          <w:b/>
+          <w:bCs/>
+        </w:rPr>
+      </w:pPr>
     </w:p>
     <w:p/>
     <w:p/>
@@ -7982,6 +9345,8 @@
     <w:p/>
     <w:p/>
     <w:p/>
+    <w:p/>
+    <w:p/>
     <w:p>
       <w:pPr>
         <w:pStyle w:val="ListParagraph"/>
@@ -7999,39 +9364,76 @@
           <w:b/>
           <w:bCs/>
         </w:rPr>
-        <w:t xml:space="preserve">Imputation of missing data </w:t>
-      </w:r>
-    </w:p>
-    <w:p>
-      <w:pPr>
-        <w:rPr>
-          <w:b/>
-          <w:bCs/>
-        </w:rPr>
-      </w:pPr>
-      <w:r>
-        <w:rPr>
-          <w:b/>
-          <w:bCs/>
-        </w:rPr>
-        <w:t xml:space="preserve">Outliers </w:t>
-      </w:r>
-    </w:p>
-    <w:p>
-      <w:r>
-        <w:t>Dataset 1 –</w:t>
-      </w:r>
-      <w:r>
-        <w:t xml:space="preserve"> only using boxplots to check price and number of reviews, unnecessary for ratings amount </w:t>
-      </w:r>
-    </w:p>
-    <w:p/>
-    <w:p>
-      <w:r>
-        <w:t xml:space="preserve">Categorical variables – make changes to them </w:t>
-      </w:r>
-    </w:p>
-    <w:p/>
+        <w:t xml:space="preserve">Normalisation </w:t>
+      </w:r>
+    </w:p>
+    <w:p>
+      <w:r>
+        <w:t xml:space="preserve">Using standard scaler and </w:t>
+      </w:r>
+      <w:proofErr w:type="spellStart"/>
+      <w:r>
+        <w:t>minmaxscaler</w:t>
+      </w:r>
+      <w:proofErr w:type="spellEnd"/>
+      <w:r>
+        <w:t xml:space="preserve"> for comparisons. </w:t>
+      </w:r>
+    </w:p>
+    <w:p>
+      <w:r>
+        <w:t xml:space="preserve">Different scaling for example price is measured in dollars, rating is a scale of 1 – 5, and numbers of reviews can be any number in my case they are mostly in the thousands. </w:t>
+      </w:r>
+    </w:p>
+    <w:p>
+      <w:r>
+        <w:t xml:space="preserve">Without scaling </w:t>
+      </w:r>
+      <w:proofErr w:type="spellStart"/>
+      <w:r>
+        <w:t>kmeans</w:t>
+      </w:r>
+      <w:proofErr w:type="spellEnd"/>
+      <w:r>
+        <w:t xml:space="preserve"> would be </w:t>
+      </w:r>
+      <w:proofErr w:type="gramStart"/>
+      <w:r>
+        <w:t>effected</w:t>
+      </w:r>
+      <w:proofErr w:type="gramEnd"/>
+      <w:r>
+        <w:t xml:space="preserve"> as the numerical variables are using different measurements of numbers. </w:t>
+      </w:r>
+    </w:p>
+    <w:p>
+      <w:r>
+        <w:t xml:space="preserve">Standard scaler </w:t>
+      </w:r>
+      <w:proofErr w:type="spellStart"/>
+      <w:r>
+        <w:t>centers</w:t>
+      </w:r>
+      <w:proofErr w:type="spellEnd"/>
+      <w:r>
+        <w:t xml:space="preserve"> the data around the mean of 0 and standard deviation of 1. Helping to prevent outliers </w:t>
+      </w:r>
+    </w:p>
+    <w:p>
+      <w:r>
+        <w:t xml:space="preserve">Add graphs showing checking for outliers – done some earlier on by changing to numeric values </w:t>
+      </w:r>
+    </w:p>
+    <w:p>
+      <w:r>
+        <w:t xml:space="preserve">Standard scaler used on all 13 variables </w:t>
+      </w:r>
+    </w:p>
+    <w:p>
+      <w:r>
+        <w:t xml:space="preserve">Min max scaler for price and rating </w:t>
+      </w:r>
+    </w:p>
     <w:p>
       <w:pPr>
         <w:pStyle w:val="ListParagraph"/>
@@ -8039,218 +9441,6 @@
           <w:ilvl w:val="0"/>
           <w:numId w:val="3"/>
         </w:numPr>
-      </w:pPr>
-      <w:r>
-        <w:t xml:space="preserve">Multivariate </w:t>
-      </w:r>
-    </w:p>
-    <w:p/>
-    <w:p>
-      <w:pPr>
-        <w:rPr>
-          <w:b/>
-          <w:bCs/>
-        </w:rPr>
-      </w:pPr>
-      <w:r>
-        <w:rPr>
-          <w:b/>
-          <w:bCs/>
-        </w:rPr>
-        <w:t>PCA</w:t>
-      </w:r>
-    </w:p>
-    <w:p>
-      <w:r>
-        <w:t>Positive high scores:</w:t>
-      </w:r>
-    </w:p>
-    <w:p>
-      <w:r>
-        <w:t xml:space="preserve">Brands scoring high are defined by packaging type, number of reviews and cruelty free status. </w:t>
-      </w:r>
-    </w:p>
-    <w:p>
-      <w:r>
-        <w:t>Negative low scores:</w:t>
-      </w:r>
-    </w:p>
-    <w:p>
-      <w:r>
-        <w:t xml:space="preserve">Brands scoring low if they have active ingredients, are created in Europe or are used at a high usage frequency. </w:t>
-      </w:r>
-    </w:p>
-    <w:p>
-      <w:r>
-        <w:lastRenderedPageBreak/>
-        <w:t xml:space="preserve">Following PCA, it is clear that my index </w:t>
-      </w:r>
-      <w:proofErr w:type="spellStart"/>
-      <w:r>
-        <w:t>priortises</w:t>
-      </w:r>
-      <w:proofErr w:type="spellEnd"/>
-      <w:r>
-        <w:t xml:space="preserve"> popular, certified cruelty free and heavily reviews products at the top. </w:t>
-      </w:r>
-    </w:p>
-    <w:p/>
-    <w:p>
-      <w:proofErr w:type="spellStart"/>
-      <w:r>
-        <w:t>Kmeans</w:t>
-      </w:r>
-      <w:proofErr w:type="spellEnd"/>
-      <w:r>
-        <w:t xml:space="preserve"> </w:t>
-      </w:r>
-    </w:p>
-    <w:p>
-      <w:r>
-        <w:rPr>
-          <w:noProof/>
-        </w:rPr>
-        <w:drawing>
-          <wp:inline distT="0" distB="0" distL="0" distR="0" wp14:anchorId="50747A25" wp14:editId="1F7EAAC5">
-            <wp:extent cx="5438775" cy="4114800"/>
-            <wp:effectExtent l="0" t="0" r="9525" b="0"/>
-            <wp:docPr id="692437108" name="Picture 1"/>
-            <wp:cNvGraphicFramePr>
-              <a:graphicFrameLocks xmlns:a="http://schemas.openxmlformats.org/drawingml/2006/main" noChangeAspect="1"/>
-            </wp:cNvGraphicFramePr>
-            <a:graphic xmlns:a="http://schemas.openxmlformats.org/drawingml/2006/main">
-              <a:graphicData uri="http://schemas.openxmlformats.org/drawingml/2006/picture">
-                <pic:pic xmlns:pic="http://schemas.openxmlformats.org/drawingml/2006/picture">
-                  <pic:nvPicPr>
-                    <pic:cNvPr id="692437108" name=""/>
-                    <pic:cNvPicPr/>
-                  </pic:nvPicPr>
-                  <pic:blipFill>
-                    <a:blip r:embed="rId12"/>
-                    <a:stretch>
-                      <a:fillRect/>
-                    </a:stretch>
-                  </pic:blipFill>
-                  <pic:spPr>
-                    <a:xfrm>
-                      <a:off x="0" y="0"/>
-                      <a:ext cx="5438775" cy="4114800"/>
-                    </a:xfrm>
-                    <a:prstGeom prst="rect">
-                      <a:avLst/>
-                    </a:prstGeom>
-                  </pic:spPr>
-                </pic:pic>
-              </a:graphicData>
-            </a:graphic>
-          </wp:inline>
-        </w:drawing>
-      </w:r>
-    </w:p>
-    <w:p>
-      <w:r>
-        <w:t xml:space="preserve">4 is when the curve changes </w:t>
-      </w:r>
-    </w:p>
-    <w:p>
-      <w:r>
-        <w:t>Make a comment on the brands in each cluster</w:t>
-      </w:r>
-    </w:p>
-    <w:p/>
-    <w:p>
-      <w:r>
-        <w:t xml:space="preserve">Price and rating are very low in pc, carry almost no information regarding the overall structure they could be excluded in the composite index. </w:t>
-      </w:r>
-    </w:p>
-    <w:p/>
-    <w:p>
-      <w:pPr>
-        <w:pStyle w:val="ListParagraph"/>
-        <w:numPr>
-          <w:ilvl w:val="0"/>
-          <w:numId w:val="3"/>
-        </w:numPr>
-        <w:rPr>
-          <w:b/>
-          <w:bCs/>
-        </w:rPr>
-      </w:pPr>
-      <w:r>
-        <w:rPr>
-          <w:b/>
-          <w:bCs/>
-        </w:rPr>
-        <w:t xml:space="preserve">Normalisation </w:t>
-      </w:r>
-    </w:p>
-    <w:p>
-      <w:r>
-        <w:t xml:space="preserve">Using standard scaler and </w:t>
-      </w:r>
-      <w:proofErr w:type="spellStart"/>
-      <w:r>
-        <w:t>minmaxscaler</w:t>
-      </w:r>
-      <w:proofErr w:type="spellEnd"/>
-      <w:r>
-        <w:t xml:space="preserve"> for comparisons. </w:t>
-      </w:r>
-    </w:p>
-    <w:p>
-      <w:r>
-        <w:t xml:space="preserve">Different scaling for example price is measured in dollars, rating is a scale of 1 – 5, and numbers of reviews can be any number in my case they are mostly in the thousands. </w:t>
-      </w:r>
-    </w:p>
-    <w:p>
-      <w:r>
-        <w:t xml:space="preserve">Without scaling </w:t>
-      </w:r>
-      <w:proofErr w:type="spellStart"/>
-      <w:r>
-        <w:t>kmeans</w:t>
-      </w:r>
-      <w:proofErr w:type="spellEnd"/>
-      <w:r>
-        <w:t xml:space="preserve"> would be effected as the numerical variables are using different measurements of numbers. </w:t>
-      </w:r>
-    </w:p>
-    <w:p>
-      <w:r>
-        <w:lastRenderedPageBreak/>
-        <w:t xml:space="preserve">Standard scaler </w:t>
-      </w:r>
-      <w:proofErr w:type="spellStart"/>
-      <w:r>
-        <w:t>centers</w:t>
-      </w:r>
-      <w:proofErr w:type="spellEnd"/>
-      <w:r>
-        <w:t xml:space="preserve"> the data around the mean of 0 and standard deviation of 1. Helping to prevent outliers </w:t>
-      </w:r>
-    </w:p>
-    <w:p>
-      <w:r>
-        <w:t xml:space="preserve">Add graphs showing checking for outliers – done some earlier on by changing to numeric values </w:t>
-      </w:r>
-    </w:p>
-    <w:p>
-      <w:r>
-        <w:t xml:space="preserve">Standard scaler used on all 13 variables </w:t>
-      </w:r>
-    </w:p>
-    <w:p>
-      <w:r>
-        <w:t xml:space="preserve">Min max scaler for price and rating </w:t>
-      </w:r>
-    </w:p>
-    <w:p>
-      <w:pPr>
-        <w:pStyle w:val="ListParagraph"/>
-        <w:numPr>
-          <w:ilvl w:val="0"/>
-          <w:numId w:val="3"/>
-        </w:numPr>
         <w:rPr>
           <w:b/>
           <w:bCs/>
@@ -8312,7 +9502,7 @@
       </w:r>
     </w:p>
     <w:p>
-      <w:hyperlink r:id="rId13" w:history="1">
+      <w:hyperlink r:id="rId21" w:history="1">
         <w:r>
           <w:rPr>
             <w:rStyle w:val="Hyperlink"/>
@@ -8325,7 +9515,7 @@
       </w:r>
     </w:p>
     <w:p>
-      <w:hyperlink r:id="rId14" w:history="1">
+      <w:hyperlink r:id="rId22" w:history="1">
         <w:r>
           <w:rPr>
             <w:rStyle w:val="Hyperlink"/>
@@ -8338,7 +9528,7 @@
       </w:r>
     </w:p>
     <w:p>
-      <w:hyperlink r:id="rId15" w:history="1">
+      <w:hyperlink r:id="rId23" w:history="1">
         <w:r>
           <w:rPr>
             <w:rStyle w:val="Hyperlink"/>
@@ -8351,7 +9541,7 @@
       </w:r>
     </w:p>
     <w:p>
-      <w:hyperlink r:id="rId16" w:history="1">
+      <w:hyperlink r:id="rId24" w:history="1">
         <w:r>
           <w:rPr>
             <w:rStyle w:val="Hyperlink"/>
@@ -8364,7 +9554,7 @@
       </w:r>
     </w:p>
     <w:p>
-      <w:hyperlink r:id="rId17" w:history="1">
+      <w:hyperlink r:id="rId25" w:history="1">
         <w:r>
           <w:rPr>
             <w:rStyle w:val="Hyperlink"/>
@@ -8377,7 +9567,7 @@
       </w:r>
     </w:p>
     <w:p>
-      <w:hyperlink r:id="rId18" w:history="1">
+      <w:hyperlink r:id="rId26" w:history="1">
         <w:r>
           <w:rPr>
             <w:rStyle w:val="Hyperlink"/>
@@ -8389,8 +9579,34 @@
         <w:t xml:space="preserve"> </w:t>
       </w:r>
     </w:p>
+    <w:p>
+      <w:hyperlink r:id="rId27" w:history="1">
+        <w:r>
+          <w:rPr>
+            <w:rStyle w:val="Hyperlink"/>
+          </w:rPr>
+          <w:t>https://www.statology.org/scree-plot-python/</w:t>
+        </w:r>
+      </w:hyperlink>
+      <w:r>
+        <w:t xml:space="preserve"> </w:t>
+      </w:r>
+    </w:p>
+    <w:p>
+      <w:hyperlink r:id="rId28" w:history="1">
+        <w:r>
+          <w:rPr>
+            <w:rStyle w:val="Hyperlink"/>
+          </w:rPr>
+          <w:t>https://pandas.pydata.org/pandas-docs/stable/reference/api/pandas.DataFrame.loc.html</w:t>
+        </w:r>
+      </w:hyperlink>
+      <w:r>
+        <w:t xml:space="preserve"> </w:t>
+      </w:r>
+    </w:p>
     <w:sectPr>
-      <w:footerReference w:type="default" r:id="rId19"/>
+      <w:footerReference w:type="default" r:id="rId29"/>
       <w:pgSz w:w="11906" w:h="16838"/>
       <w:pgMar w:top="1440" w:right="1440" w:bottom="1440" w:left="1440" w:header="708" w:footer="708" w:gutter="0"/>
       <w:cols w:space="708"/>
@@ -8619,6 +9835,119 @@
     </w:lvl>
   </w:abstractNum>
   <w:abstractNum w:abstractNumId="1" w15:restartNumberingAfterBreak="0">
+    <w:nsid w:val="0AAE774F"/>
+    <w:multiLevelType w:val="hybridMultilevel"/>
+    <w:tmpl w:val="ED2E9CA4"/>
+    <w:lvl w:ilvl="0" w:tplc="08090001">
+      <w:start w:val="1"/>
+      <w:numFmt w:val="bullet"/>
+      <w:lvlText w:val=""/>
+      <w:lvlJc w:val="left"/>
+      <w:pPr>
+        <w:ind w:left="720" w:hanging="360"/>
+      </w:pPr>
+      <w:rPr>
+        <w:rFonts w:ascii="Symbol" w:hAnsi="Symbol" w:hint="default"/>
+      </w:rPr>
+    </w:lvl>
+    <w:lvl w:ilvl="1" w:tplc="08090003" w:tentative="1">
+      <w:start w:val="1"/>
+      <w:numFmt w:val="bullet"/>
+      <w:lvlText w:val="o"/>
+      <w:lvlJc w:val="left"/>
+      <w:pPr>
+        <w:ind w:left="1440" w:hanging="360"/>
+      </w:pPr>
+      <w:rPr>
+        <w:rFonts w:ascii="Courier New" w:hAnsi="Courier New" w:cs="Courier New" w:hint="default"/>
+      </w:rPr>
+    </w:lvl>
+    <w:lvl w:ilvl="2" w:tplc="08090005" w:tentative="1">
+      <w:start w:val="1"/>
+      <w:numFmt w:val="bullet"/>
+      <w:lvlText w:val=""/>
+      <w:lvlJc w:val="left"/>
+      <w:pPr>
+        <w:ind w:left="2160" w:hanging="360"/>
+      </w:pPr>
+      <w:rPr>
+        <w:rFonts w:ascii="Wingdings" w:hAnsi="Wingdings" w:hint="default"/>
+      </w:rPr>
+    </w:lvl>
+    <w:lvl w:ilvl="3" w:tplc="08090001" w:tentative="1">
+      <w:start w:val="1"/>
+      <w:numFmt w:val="bullet"/>
+      <w:lvlText w:val=""/>
+      <w:lvlJc w:val="left"/>
+      <w:pPr>
+        <w:ind w:left="2880" w:hanging="360"/>
+      </w:pPr>
+      <w:rPr>
+        <w:rFonts w:ascii="Symbol" w:hAnsi="Symbol" w:hint="default"/>
+      </w:rPr>
+    </w:lvl>
+    <w:lvl w:ilvl="4" w:tplc="08090003" w:tentative="1">
+      <w:start w:val="1"/>
+      <w:numFmt w:val="bullet"/>
+      <w:lvlText w:val="o"/>
+      <w:lvlJc w:val="left"/>
+      <w:pPr>
+        <w:ind w:left="3600" w:hanging="360"/>
+      </w:pPr>
+      <w:rPr>
+        <w:rFonts w:ascii="Courier New" w:hAnsi="Courier New" w:cs="Courier New" w:hint="default"/>
+      </w:rPr>
+    </w:lvl>
+    <w:lvl w:ilvl="5" w:tplc="08090005" w:tentative="1">
+      <w:start w:val="1"/>
+      <w:numFmt w:val="bullet"/>
+      <w:lvlText w:val=""/>
+      <w:lvlJc w:val="left"/>
+      <w:pPr>
+        <w:ind w:left="4320" w:hanging="360"/>
+      </w:pPr>
+      <w:rPr>
+        <w:rFonts w:ascii="Wingdings" w:hAnsi="Wingdings" w:hint="default"/>
+      </w:rPr>
+    </w:lvl>
+    <w:lvl w:ilvl="6" w:tplc="08090001" w:tentative="1">
+      <w:start w:val="1"/>
+      <w:numFmt w:val="bullet"/>
+      <w:lvlText w:val=""/>
+      <w:lvlJc w:val="left"/>
+      <w:pPr>
+        <w:ind w:left="5040" w:hanging="360"/>
+      </w:pPr>
+      <w:rPr>
+        <w:rFonts w:ascii="Symbol" w:hAnsi="Symbol" w:hint="default"/>
+      </w:rPr>
+    </w:lvl>
+    <w:lvl w:ilvl="7" w:tplc="08090003" w:tentative="1">
+      <w:start w:val="1"/>
+      <w:numFmt w:val="bullet"/>
+      <w:lvlText w:val="o"/>
+      <w:lvlJc w:val="left"/>
+      <w:pPr>
+        <w:ind w:left="5760" w:hanging="360"/>
+      </w:pPr>
+      <w:rPr>
+        <w:rFonts w:ascii="Courier New" w:hAnsi="Courier New" w:cs="Courier New" w:hint="default"/>
+      </w:rPr>
+    </w:lvl>
+    <w:lvl w:ilvl="8" w:tplc="08090005" w:tentative="1">
+      <w:start w:val="1"/>
+      <w:numFmt w:val="bullet"/>
+      <w:lvlText w:val=""/>
+      <w:lvlJc w:val="left"/>
+      <w:pPr>
+        <w:ind w:left="6480" w:hanging="360"/>
+      </w:pPr>
+      <w:rPr>
+        <w:rFonts w:ascii="Wingdings" w:hAnsi="Wingdings" w:hint="default"/>
+      </w:rPr>
+    </w:lvl>
+  </w:abstractNum>
+  <w:abstractNum w:abstractNumId="2" w15:restartNumberingAfterBreak="0">
     <w:nsid w:val="0B5F7D7A"/>
     <w:multiLevelType w:val="hybridMultilevel"/>
     <w:tmpl w:val="192CF4FC"/>
@@ -8731,7 +10060,120 @@
       </w:rPr>
     </w:lvl>
   </w:abstractNum>
-  <w:abstractNum w:abstractNumId="2" w15:restartNumberingAfterBreak="0">
+  <w:abstractNum w:abstractNumId="3" w15:restartNumberingAfterBreak="0">
+    <w:nsid w:val="0DDF548A"/>
+    <w:multiLevelType w:val="hybridMultilevel"/>
+    <w:tmpl w:val="138AFA64"/>
+    <w:lvl w:ilvl="0" w:tplc="08090001">
+      <w:start w:val="1"/>
+      <w:numFmt w:val="bullet"/>
+      <w:lvlText w:val=""/>
+      <w:lvlJc w:val="left"/>
+      <w:pPr>
+        <w:ind w:left="720" w:hanging="360"/>
+      </w:pPr>
+      <w:rPr>
+        <w:rFonts w:ascii="Symbol" w:hAnsi="Symbol" w:hint="default"/>
+      </w:rPr>
+    </w:lvl>
+    <w:lvl w:ilvl="1" w:tplc="08090003" w:tentative="1">
+      <w:start w:val="1"/>
+      <w:numFmt w:val="bullet"/>
+      <w:lvlText w:val="o"/>
+      <w:lvlJc w:val="left"/>
+      <w:pPr>
+        <w:ind w:left="1440" w:hanging="360"/>
+      </w:pPr>
+      <w:rPr>
+        <w:rFonts w:ascii="Courier New" w:hAnsi="Courier New" w:cs="Courier New" w:hint="default"/>
+      </w:rPr>
+    </w:lvl>
+    <w:lvl w:ilvl="2" w:tplc="08090005" w:tentative="1">
+      <w:start w:val="1"/>
+      <w:numFmt w:val="bullet"/>
+      <w:lvlText w:val=""/>
+      <w:lvlJc w:val="left"/>
+      <w:pPr>
+        <w:ind w:left="2160" w:hanging="360"/>
+      </w:pPr>
+      <w:rPr>
+        <w:rFonts w:ascii="Wingdings" w:hAnsi="Wingdings" w:hint="default"/>
+      </w:rPr>
+    </w:lvl>
+    <w:lvl w:ilvl="3" w:tplc="08090001" w:tentative="1">
+      <w:start w:val="1"/>
+      <w:numFmt w:val="bullet"/>
+      <w:lvlText w:val=""/>
+      <w:lvlJc w:val="left"/>
+      <w:pPr>
+        <w:ind w:left="2880" w:hanging="360"/>
+      </w:pPr>
+      <w:rPr>
+        <w:rFonts w:ascii="Symbol" w:hAnsi="Symbol" w:hint="default"/>
+      </w:rPr>
+    </w:lvl>
+    <w:lvl w:ilvl="4" w:tplc="08090003" w:tentative="1">
+      <w:start w:val="1"/>
+      <w:numFmt w:val="bullet"/>
+      <w:lvlText w:val="o"/>
+      <w:lvlJc w:val="left"/>
+      <w:pPr>
+        <w:ind w:left="3600" w:hanging="360"/>
+      </w:pPr>
+      <w:rPr>
+        <w:rFonts w:ascii="Courier New" w:hAnsi="Courier New" w:cs="Courier New" w:hint="default"/>
+      </w:rPr>
+    </w:lvl>
+    <w:lvl w:ilvl="5" w:tplc="08090005" w:tentative="1">
+      <w:start w:val="1"/>
+      <w:numFmt w:val="bullet"/>
+      <w:lvlText w:val=""/>
+      <w:lvlJc w:val="left"/>
+      <w:pPr>
+        <w:ind w:left="4320" w:hanging="360"/>
+      </w:pPr>
+      <w:rPr>
+        <w:rFonts w:ascii="Wingdings" w:hAnsi="Wingdings" w:hint="default"/>
+      </w:rPr>
+    </w:lvl>
+    <w:lvl w:ilvl="6" w:tplc="08090001" w:tentative="1">
+      <w:start w:val="1"/>
+      <w:numFmt w:val="bullet"/>
+      <w:lvlText w:val=""/>
+      <w:lvlJc w:val="left"/>
+      <w:pPr>
+        <w:ind w:left="5040" w:hanging="360"/>
+      </w:pPr>
+      <w:rPr>
+        <w:rFonts w:ascii="Symbol" w:hAnsi="Symbol" w:hint="default"/>
+      </w:rPr>
+    </w:lvl>
+    <w:lvl w:ilvl="7" w:tplc="08090003" w:tentative="1">
+      <w:start w:val="1"/>
+      <w:numFmt w:val="bullet"/>
+      <w:lvlText w:val="o"/>
+      <w:lvlJc w:val="left"/>
+      <w:pPr>
+        <w:ind w:left="5760" w:hanging="360"/>
+      </w:pPr>
+      <w:rPr>
+        <w:rFonts w:ascii="Courier New" w:hAnsi="Courier New" w:cs="Courier New" w:hint="default"/>
+      </w:rPr>
+    </w:lvl>
+    <w:lvl w:ilvl="8" w:tplc="08090005" w:tentative="1">
+      <w:start w:val="1"/>
+      <w:numFmt w:val="bullet"/>
+      <w:lvlText w:val=""/>
+      <w:lvlJc w:val="left"/>
+      <w:pPr>
+        <w:ind w:left="6480" w:hanging="360"/>
+      </w:pPr>
+      <w:rPr>
+        <w:rFonts w:ascii="Wingdings" w:hAnsi="Wingdings" w:hint="default"/>
+      </w:rPr>
+    </w:lvl>
+  </w:abstractNum>
+  <w:abstractNum w:abstractNumId="4" w15:restartNumberingAfterBreak="0">
     <w:nsid w:val="1573144C"/>
     <w:multiLevelType w:val="hybridMultilevel"/>
     <w:tmpl w:val="E0D4E470"/>
@@ -8820,7 +10262,7 @@
       </w:pPr>
     </w:lvl>
   </w:abstractNum>
-  <w:abstractNum w:abstractNumId="3" w15:restartNumberingAfterBreak="0">
+  <w:abstractNum w:abstractNumId="5" w15:restartNumberingAfterBreak="0">
     <w:nsid w:val="31B5223A"/>
     <w:multiLevelType w:val="hybridMultilevel"/>
     <w:tmpl w:val="CCA67980"/>
@@ -8909,7 +10351,7 @@
       </w:pPr>
     </w:lvl>
   </w:abstractNum>
-  <w:abstractNum w:abstractNumId="4" w15:restartNumberingAfterBreak="0">
+  <w:abstractNum w:abstractNumId="6" w15:restartNumberingAfterBreak="0">
     <w:nsid w:val="3A7D1669"/>
     <w:multiLevelType w:val="hybridMultilevel"/>
     <w:tmpl w:val="E0D4E470"/>
@@ -8998,7 +10440,7 @@
       </w:pPr>
     </w:lvl>
   </w:abstractNum>
-  <w:abstractNum w:abstractNumId="5" w15:restartNumberingAfterBreak="0">
+  <w:abstractNum w:abstractNumId="7" w15:restartNumberingAfterBreak="0">
     <w:nsid w:val="3AC4324D"/>
     <w:multiLevelType w:val="hybridMultilevel"/>
     <w:tmpl w:val="7AB279D0"/>
@@ -9087,7 +10529,7 @@
       </w:pPr>
     </w:lvl>
   </w:abstractNum>
-  <w:abstractNum w:abstractNumId="6" w15:restartNumberingAfterBreak="0">
+  <w:abstractNum w:abstractNumId="8" w15:restartNumberingAfterBreak="0">
     <w:nsid w:val="3AD8218C"/>
     <w:multiLevelType w:val="hybridMultilevel"/>
     <w:tmpl w:val="828C9C00"/>
@@ -9200,7 +10642,7 @@
       </w:rPr>
     </w:lvl>
   </w:abstractNum>
-  <w:abstractNum w:abstractNumId="7" w15:restartNumberingAfterBreak="0">
+  <w:abstractNum w:abstractNumId="9" w15:restartNumberingAfterBreak="0">
     <w:nsid w:val="491F6C31"/>
     <w:multiLevelType w:val="hybridMultilevel"/>
     <w:tmpl w:val="7EA8974C"/>
@@ -9289,7 +10731,7 @@
       </w:pPr>
     </w:lvl>
   </w:abstractNum>
-  <w:abstractNum w:abstractNumId="8" w15:restartNumberingAfterBreak="0">
+  <w:abstractNum w:abstractNumId="10" w15:restartNumberingAfterBreak="0">
     <w:nsid w:val="52246F86"/>
     <w:multiLevelType w:val="hybridMultilevel"/>
     <w:tmpl w:val="5F049012"/>
@@ -9378,7 +10820,7 @@
       </w:pPr>
     </w:lvl>
   </w:abstractNum>
-  <w:abstractNum w:abstractNumId="9" w15:restartNumberingAfterBreak="0">
+  <w:abstractNum w:abstractNumId="11" w15:restartNumberingAfterBreak="0">
     <w:nsid w:val="5E05291C"/>
     <w:multiLevelType w:val="multilevel"/>
     <w:tmpl w:val="9B908FDE"/>
@@ -9491,7 +10933,7 @@
       </w:rPr>
     </w:lvl>
   </w:abstractNum>
-  <w:abstractNum w:abstractNumId="10" w15:restartNumberingAfterBreak="0">
+  <w:abstractNum w:abstractNumId="12" w15:restartNumberingAfterBreak="0">
     <w:nsid w:val="6FCD51AA"/>
     <w:multiLevelType w:val="hybridMultilevel"/>
     <w:tmpl w:val="65F6F516"/>
@@ -9604,7 +11046,7 @@
       </w:rPr>
     </w:lvl>
   </w:abstractNum>
-  <w:abstractNum w:abstractNumId="11" w15:restartNumberingAfterBreak="0">
+  <w:abstractNum w:abstractNumId="13" w15:restartNumberingAfterBreak="0">
     <w:nsid w:val="708148EA"/>
     <w:multiLevelType w:val="hybridMultilevel"/>
     <w:tmpl w:val="E8745C70"/>
@@ -9717,7 +11159,7 @@
       </w:rPr>
     </w:lvl>
   </w:abstractNum>
-  <w:abstractNum w:abstractNumId="12" w15:restartNumberingAfterBreak="0">
+  <w:abstractNum w:abstractNumId="14" w15:restartNumberingAfterBreak="0">
     <w:nsid w:val="7191242B"/>
     <w:multiLevelType w:val="multilevel"/>
     <w:tmpl w:val="A3D8253A"/>
@@ -9835,7 +11277,7 @@
       </w:pPr>
     </w:lvl>
   </w:abstractNum>
-  <w:abstractNum w:abstractNumId="13" w15:restartNumberingAfterBreak="0">
+  <w:abstractNum w:abstractNumId="15" w15:restartNumberingAfterBreak="0">
     <w:nsid w:val="73AE3B6C"/>
     <w:multiLevelType w:val="hybridMultilevel"/>
     <w:tmpl w:val="D5F4766A"/>
@@ -9948,7 +11390,7 @@
       </w:rPr>
     </w:lvl>
   </w:abstractNum>
-  <w:abstractNum w:abstractNumId="14" w15:restartNumberingAfterBreak="0">
+  <w:abstractNum w:abstractNumId="16" w15:restartNumberingAfterBreak="0">
     <w:nsid w:val="769A539F"/>
     <w:multiLevelType w:val="hybridMultilevel"/>
     <w:tmpl w:val="93406AB0"/>
@@ -10037,7 +11479,7 @@
       </w:pPr>
     </w:lvl>
   </w:abstractNum>
-  <w:abstractNum w:abstractNumId="15" w15:restartNumberingAfterBreak="0">
+  <w:abstractNum w:abstractNumId="17" w15:restartNumberingAfterBreak="0">
     <w:nsid w:val="79C01CB2"/>
     <w:multiLevelType w:val="multilevel"/>
     <w:tmpl w:val="118ECD4C"/>
@@ -10150,7 +11592,7 @@
       </w:rPr>
     </w:lvl>
   </w:abstractNum>
-  <w:abstractNum w:abstractNumId="16" w15:restartNumberingAfterBreak="0">
+  <w:abstractNum w:abstractNumId="18" w15:restartNumberingAfterBreak="0">
     <w:nsid w:val="7BDD142D"/>
     <w:multiLevelType w:val="hybridMultilevel"/>
     <w:tmpl w:val="75E09E86"/>
@@ -10239,7 +11681,7 @@
       </w:pPr>
     </w:lvl>
   </w:abstractNum>
-  <w:abstractNum w:abstractNumId="17" w15:restartNumberingAfterBreak="0">
+  <w:abstractNum w:abstractNumId="19" w15:restartNumberingAfterBreak="0">
     <w:nsid w:val="7BF70FB7"/>
     <w:multiLevelType w:val="hybridMultilevel"/>
     <w:tmpl w:val="64661CC2"/>
@@ -10353,58 +11795,64 @@
     </w:lvl>
   </w:abstractNum>
   <w:num w:numId="1" w16cid:durableId="1677344584">
-    <w:abstractNumId w:val="2"/>
+    <w:abstractNumId w:val="4"/>
   </w:num>
   <w:num w:numId="2" w16cid:durableId="1990818663">
-    <w:abstractNumId w:val="4"/>
+    <w:abstractNumId w:val="6"/>
   </w:num>
   <w:num w:numId="3" w16cid:durableId="1950309440">
-    <w:abstractNumId w:val="5"/>
+    <w:abstractNumId w:val="7"/>
   </w:num>
   <w:num w:numId="4" w16cid:durableId="246964553">
     <w:abstractNumId w:val="0"/>
   </w:num>
   <w:num w:numId="5" w16cid:durableId="850527125">
+    <w:abstractNumId w:val="19"/>
+  </w:num>
+  <w:num w:numId="6" w16cid:durableId="1690643817">
+    <w:abstractNumId w:val="9"/>
+  </w:num>
+  <w:num w:numId="7" w16cid:durableId="1813905963">
+    <w:abstractNumId w:val="14"/>
+  </w:num>
+  <w:num w:numId="8" w16cid:durableId="972636849">
     <w:abstractNumId w:val="17"/>
   </w:num>
-  <w:num w:numId="6" w16cid:durableId="1690643817">
-    <w:abstractNumId w:val="7"/>
+  <w:num w:numId="9" w16cid:durableId="796487559">
+    <w:abstractNumId w:val="5"/>
   </w:num>
-  <w:num w:numId="7" w16cid:durableId="1813905963">
+  <w:num w:numId="10" w16cid:durableId="1764063428">
+    <w:abstractNumId w:val="18"/>
+  </w:num>
+  <w:num w:numId="11" w16cid:durableId="1981884099">
+    <w:abstractNumId w:val="16"/>
+  </w:num>
+  <w:num w:numId="12" w16cid:durableId="782192607">
+    <w:abstractNumId w:val="15"/>
+  </w:num>
+  <w:num w:numId="13" w16cid:durableId="1700161290">
+    <w:abstractNumId w:val="10"/>
+  </w:num>
+  <w:num w:numId="14" w16cid:durableId="24870201">
+    <w:abstractNumId w:val="8"/>
+  </w:num>
+  <w:num w:numId="15" w16cid:durableId="1456942452">
+    <w:abstractNumId w:val="13"/>
+  </w:num>
+  <w:num w:numId="16" w16cid:durableId="2113430917">
     <w:abstractNumId w:val="12"/>
   </w:num>
-  <w:num w:numId="8" w16cid:durableId="972636849">
-    <w:abstractNumId w:val="15"/>
+  <w:num w:numId="17" w16cid:durableId="178348452">
+    <w:abstractNumId w:val="2"/>
   </w:num>
-  <w:num w:numId="9" w16cid:durableId="796487559">
-    <w:abstractNumId w:val="3"/>
-  </w:num>
-  <w:num w:numId="10" w16cid:durableId="1764063428">
-    <w:abstractNumId w:val="16"/>
-  </w:num>
-  <w:num w:numId="11" w16cid:durableId="1981884099">
-    <w:abstractNumId w:val="14"/>
-  </w:num>
-  <w:num w:numId="12" w16cid:durableId="782192607">
-    <w:abstractNumId w:val="13"/>
-  </w:num>
-  <w:num w:numId="13" w16cid:durableId="1700161290">
-    <w:abstractNumId w:val="8"/>
-  </w:num>
-  <w:num w:numId="14" w16cid:durableId="24870201">
-    <w:abstractNumId w:val="6"/>
-  </w:num>
-  <w:num w:numId="15" w16cid:durableId="1456942452">
+  <w:num w:numId="18" w16cid:durableId="1918860253">
     <w:abstractNumId w:val="11"/>
   </w:num>
-  <w:num w:numId="16" w16cid:durableId="2113430917">
-    <w:abstractNumId w:val="10"/>
-  </w:num>
-  <w:num w:numId="17" w16cid:durableId="178348452">
+  <w:num w:numId="19" w16cid:durableId="2063558979">
     <w:abstractNumId w:val="1"/>
   </w:num>
-  <w:num w:numId="18" w16cid:durableId="1918860253">
-    <w:abstractNumId w:val="9"/>
+  <w:num w:numId="20" w16cid:durableId="306207192">
+    <w:abstractNumId w:val="3"/>
   </w:num>
 </w:numbering>
 </file>
@@ -11738,4 +13186,24 @@
     </a:ext>
   </a:extLst>
 </a:theme>
+</file>
+
+<file path=word/webextensions/taskpanes.xml><?xml version="1.0" encoding="utf-8"?>
+<wetp:taskpanes xmlns:wetp="http://schemas.microsoft.com/office/webextensions/taskpanes/2010/11">
+  <wetp:taskpane dockstate="right" visibility="0" width="525" row="1">
+    <wetp:webextensionref xmlns:r="http://schemas.openxmlformats.org/officeDocument/2006/relationships" r:id="rId1"/>
+  </wetp:taskpane>
+</wetp:taskpanes>
+</file>
+
+<file path=word/webextensions/webextension1.xml><?xml version="1.0" encoding="utf-8"?>
+<we:webextension xmlns:we="http://schemas.microsoft.com/office/webextensions/webextension/2010/11" id="{9453A6FA-1B8B-472C-B0BF-EE9ECE8471AC}">
+  <we:reference id="f7164644-6193-4742-a703-0dc1551d5955" version="1.1.121.0" store="EXCatalog" storeType="EXCatalog"/>
+  <we:alternateReferences>
+    <we:reference id="WA200004257" version="1.1.121.0" store="en-US" storeType="OMEX"/>
+  </we:alternateReferences>
+  <we:properties/>
+  <we:bindings/>
+  <we:snapshot xmlns:r="http://schemas.openxmlformats.org/officeDocument/2006/relationships"/>
+</we:webextension>
 </file>
</xml_diff>

<commit_message>
Fixed issue in Index
The sub indicator for ethical compliance was using the scaled active variable instead of the cruelty free variable.
</commit_message>
<xml_diff>
--- a/DAV_CA1_Report.docx
+++ b/DAV_CA1_Report.docx
@@ -371,21 +371,8 @@
             <w:color w:val="000000" w:themeColor="text1"/>
             <w:u w:val="none"/>
           </w:rPr>
-          <w:t>…</w:t>
+          <w:t>……..</w:t>
         </w:r>
-        <w:proofErr w:type="gramStart"/>
-        <w:r>
-          <w:rPr>
-            <w:rStyle w:val="Hyperlink"/>
-            <w:rFonts w:ascii="Aptos" w:hAnsi="Aptos" w:cs="Arial"/>
-            <w:b/>
-            <w:bCs/>
-            <w:color w:val="000000" w:themeColor="text1"/>
-            <w:u w:val="none"/>
-          </w:rPr>
-          <w:t>…..</w:t>
-        </w:r>
-        <w:proofErr w:type="gramEnd"/>
         <w:r>
           <w:rPr>
             <w:rStyle w:val="Hyperlink"/>
@@ -555,7 +542,6 @@
         </w:rPr>
         <w:fldChar w:fldCharType="separate"/>
       </w:r>
-      <w:proofErr w:type="gramStart"/>
       <w:r>
         <w:rPr>
           <w:rStyle w:val="Hyperlink"/>
@@ -578,7 +564,6 @@
         </w:rPr>
         <w:t>ub Groups</w:t>
       </w:r>
-      <w:proofErr w:type="gramEnd"/>
       <w:r>
         <w:rPr>
           <w:rStyle w:val="Hyperlink"/>
@@ -1189,7 +1174,6 @@
         </w:rPr>
         <w:t xml:space="preserve">Summary Table </w:t>
       </w:r>
-      <w:proofErr w:type="gramStart"/>
       <w:r>
         <w:rPr>
           <w:rStyle w:val="Hyperlink"/>
@@ -1212,7 +1196,6 @@
         </w:rPr>
         <w:t>..</w:t>
       </w:r>
-      <w:proofErr w:type="gramEnd"/>
       <w:r>
         <w:rPr>
           <w:rStyle w:val="Hyperlink"/>
@@ -2307,19 +2290,7 @@
           <w:szCs w:val="22"/>
           <w:u w:val="none"/>
         </w:rPr>
-        <w:t>…….……………………………………</w:t>
-      </w:r>
-      <w:proofErr w:type="gramStart"/>
-      <w:r>
-        <w:rPr>
-          <w:rStyle w:val="Hyperlink"/>
-          <w:rFonts w:ascii="Aptos" w:hAnsi="Aptos" w:cs="Arial"/>
-          <w:color w:val="000000" w:themeColor="text1"/>
-          <w:sz w:val="22"/>
-          <w:szCs w:val="22"/>
-          <w:u w:val="none"/>
-        </w:rPr>
-        <w:t>…</w:t>
+        <w:t>…….………………………………………</w:t>
       </w:r>
       <w:r>
         <w:rPr>
@@ -2332,7 +2303,6 @@
         </w:rPr>
         <w:t>..</w:t>
       </w:r>
-      <w:proofErr w:type="gramEnd"/>
       <w:r>
         <w:rPr>
           <w:rStyle w:val="Hyperlink"/>
@@ -2435,42 +2405,18 @@
           <w:szCs w:val="22"/>
           <w:u w:val="none"/>
         </w:rPr>
-        <w:t>………………………………………………………………</w:t>
-      </w:r>
-      <w:proofErr w:type="gramStart"/>
-      <w:r>
-        <w:rPr>
-          <w:rStyle w:val="Hyperlink"/>
-          <w:rFonts w:ascii="Aptos" w:hAnsi="Aptos" w:cs="Arial"/>
-          <w:color w:val="000000" w:themeColor="text1"/>
-          <w:sz w:val="22"/>
-          <w:szCs w:val="22"/>
-          <w:u w:val="none"/>
-        </w:rPr>
-        <w:t>…</w:t>
-      </w:r>
-      <w:r>
-        <w:rPr>
-          <w:rStyle w:val="Hyperlink"/>
-          <w:rFonts w:ascii="Aptos" w:hAnsi="Aptos" w:cs="Arial"/>
-          <w:color w:val="000000" w:themeColor="text1"/>
-          <w:sz w:val="22"/>
-          <w:szCs w:val="22"/>
-          <w:u w:val="none"/>
-        </w:rPr>
-        <w:t>..</w:t>
-      </w:r>
-      <w:proofErr w:type="gramEnd"/>
-      <w:r>
-        <w:rPr>
-          <w:rStyle w:val="Hyperlink"/>
-          <w:rFonts w:ascii="Aptos" w:hAnsi="Aptos" w:cs="Arial"/>
-          <w:color w:val="000000" w:themeColor="text1"/>
-          <w:sz w:val="22"/>
-          <w:szCs w:val="22"/>
-          <w:u w:val="none"/>
-        </w:rPr>
-        <w:t xml:space="preserve"> </w:t>
+        <w:t>…………………………………………………………………</w:t>
+      </w:r>
+      <w:r>
+        <w:rPr>
+          <w:rStyle w:val="Hyperlink"/>
+          <w:rFonts w:ascii="Aptos" w:hAnsi="Aptos" w:cs="Arial"/>
+          <w:color w:val="000000" w:themeColor="text1"/>
+          <w:sz w:val="22"/>
+          <w:szCs w:val="22"/>
+          <w:u w:val="none"/>
+        </w:rPr>
+        <w:t xml:space="preserve">.. </w:t>
       </w:r>
       <w:r>
         <w:rPr>
@@ -2563,42 +2509,18 @@
           <w:szCs w:val="22"/>
           <w:u w:val="none"/>
         </w:rPr>
-        <w:t xml:space="preserve">and Possible </w:t>
-      </w:r>
-      <w:proofErr w:type="gramStart"/>
-      <w:r>
-        <w:rPr>
-          <w:rStyle w:val="Hyperlink"/>
-          <w:rFonts w:ascii="Aptos" w:hAnsi="Aptos" w:cs="Arial"/>
-          <w:color w:val="000000" w:themeColor="text1"/>
-          <w:sz w:val="22"/>
-          <w:szCs w:val="22"/>
-          <w:u w:val="none"/>
-        </w:rPr>
-        <w:t xml:space="preserve">Differences </w:t>
-      </w:r>
-      <w:r>
-        <w:rPr>
-          <w:rStyle w:val="Hyperlink"/>
-          <w:rFonts w:ascii="Aptos" w:hAnsi="Aptos" w:cs="Arial"/>
-          <w:color w:val="000000" w:themeColor="text1"/>
-          <w:sz w:val="22"/>
-          <w:szCs w:val="22"/>
-          <w:u w:val="none"/>
-        </w:rPr>
-        <w:t>.</w:t>
-      </w:r>
-      <w:proofErr w:type="gramEnd"/>
-      <w:r>
-        <w:rPr>
-          <w:rStyle w:val="Hyperlink"/>
-          <w:rFonts w:ascii="Aptos" w:hAnsi="Aptos" w:cs="Arial"/>
-          <w:color w:val="000000" w:themeColor="text1"/>
-          <w:sz w:val="22"/>
-          <w:szCs w:val="22"/>
-          <w:u w:val="none"/>
-        </w:rPr>
-        <w:t>…………………</w:t>
+        <w:t xml:space="preserve">and Possible Differences </w:t>
+      </w:r>
+      <w:r>
+        <w:rPr>
+          <w:rStyle w:val="Hyperlink"/>
+          <w:rFonts w:ascii="Aptos" w:hAnsi="Aptos" w:cs="Arial"/>
+          <w:color w:val="000000" w:themeColor="text1"/>
+          <w:sz w:val="22"/>
+          <w:szCs w:val="22"/>
+          <w:u w:val="none"/>
+        </w:rPr>
+        <w:t>.…………………</w:t>
       </w:r>
       <w:r>
         <w:rPr>
@@ -2990,19 +2912,7 @@
           <w:szCs w:val="22"/>
           <w:u w:val="none"/>
         </w:rPr>
-        <w:t>…….……………………………………</w:t>
-      </w:r>
-      <w:proofErr w:type="gramStart"/>
-      <w:r>
-        <w:rPr>
-          <w:rStyle w:val="Hyperlink"/>
-          <w:rFonts w:ascii="Aptos" w:hAnsi="Aptos" w:cs="Arial"/>
-          <w:color w:val="000000" w:themeColor="text1"/>
-          <w:sz w:val="22"/>
-          <w:szCs w:val="22"/>
-          <w:u w:val="none"/>
-        </w:rPr>
-        <w:t>…</w:t>
+        <w:t>…….………………………………………</w:t>
       </w:r>
       <w:r>
         <w:rPr>
@@ -3015,7 +2925,6 @@
         </w:rPr>
         <w:t>..</w:t>
       </w:r>
-      <w:proofErr w:type="gramEnd"/>
       <w:r>
         <w:rPr>
           <w:rStyle w:val="Hyperlink"/>
@@ -3233,21 +3142,8 @@
           <w:szCs w:val="22"/>
           <w:u w:val="none"/>
         </w:rPr>
-        <w:t>…</w:t>
-      </w:r>
-      <w:proofErr w:type="gramStart"/>
-      <w:r>
-        <w:rPr>
-          <w:rStyle w:val="Hyperlink"/>
-          <w:rFonts w:ascii="Aptos" w:hAnsi="Aptos" w:cs="Arial"/>
-          <w:color w:val="000000" w:themeColor="text1"/>
-          <w:sz w:val="22"/>
-          <w:szCs w:val="22"/>
-          <w:u w:val="none"/>
-        </w:rPr>
-        <w:t>…..</w:t>
-      </w:r>
-      <w:proofErr w:type="gramEnd"/>
+        <w:t>……..</w:t>
+      </w:r>
       <w:r>
         <w:rPr>
           <w:rStyle w:val="Hyperlink"/>
@@ -4078,21 +3974,8 @@
           <w:szCs w:val="22"/>
           <w:u w:val="none"/>
         </w:rPr>
-        <w:t>………</w:t>
-      </w:r>
-      <w:proofErr w:type="gramStart"/>
-      <w:r>
-        <w:rPr>
-          <w:rStyle w:val="Hyperlink"/>
-          <w:rFonts w:ascii="Aptos" w:hAnsi="Aptos" w:cs="Arial"/>
-          <w:color w:val="000000" w:themeColor="text1"/>
-          <w:sz w:val="22"/>
-          <w:szCs w:val="22"/>
-          <w:u w:val="none"/>
-        </w:rPr>
-        <w:t>…..</w:t>
-      </w:r>
-      <w:proofErr w:type="gramEnd"/>
+        <w:t>…………..</w:t>
+      </w:r>
       <w:r>
         <w:rPr>
           <w:rStyle w:val="Hyperlink"/>
@@ -4361,21 +4244,8 @@
           <w:szCs w:val="22"/>
           <w:u w:val="none"/>
         </w:rPr>
-        <w:t>………</w:t>
-      </w:r>
-      <w:proofErr w:type="gramStart"/>
-      <w:r>
-        <w:rPr>
-          <w:rStyle w:val="Hyperlink"/>
-          <w:rFonts w:ascii="Aptos" w:hAnsi="Aptos" w:cs="Arial"/>
-          <w:color w:val="000000" w:themeColor="text1"/>
-          <w:sz w:val="22"/>
-          <w:szCs w:val="22"/>
-          <w:u w:val="none"/>
-        </w:rPr>
-        <w:t>…..</w:t>
-      </w:r>
-      <w:proofErr w:type="gramEnd"/>
+        <w:t>…………..</w:t>
+      </w:r>
       <w:r>
         <w:rPr>
           <w:rStyle w:val="Hyperlink"/>
@@ -5269,15 +5139,7 @@
         <w:t>ariables</w:t>
       </w:r>
       <w:r>
-        <w:t xml:space="preserve"> via a trending products </w:t>
-      </w:r>
-      <w:proofErr w:type="gramStart"/>
-      <w:r>
-        <w:t>dataset,</w:t>
-      </w:r>
-      <w:proofErr w:type="gramEnd"/>
-      <w:r>
-        <w:t xml:space="preserve"> from this I gathered data for Ratings and Number of Reviews. </w:t>
+        <w:t xml:space="preserve"> via a trending products dataset, from this I gathered data for Ratings and Number of Reviews. </w:t>
       </w:r>
     </w:p>
     <w:p>
@@ -5545,15 +5407,7 @@
     </w:p>
     <w:p>
       <w:r>
-        <w:t xml:space="preserve">By utilising multiple sources for my </w:t>
-      </w:r>
-      <w:proofErr w:type="gramStart"/>
-      <w:r>
-        <w:t>data</w:t>
-      </w:r>
-      <w:proofErr w:type="gramEnd"/>
-      <w:r>
-        <w:t xml:space="preserve"> I believe I have a good foundation for addressing each sub index. </w:t>
+        <w:t xml:space="preserve">By utilising multiple sources for my data I believe I have a good foundation for addressing each sub index. </w:t>
       </w:r>
     </w:p>
     <w:p>
@@ -5613,15 +5467,7 @@
         <w:t xml:space="preserve">Strengths: </w:t>
       </w:r>
       <w:r>
-        <w:t xml:space="preserve">This indicator is based on the numerical variable of product </w:t>
-      </w:r>
-      <w:proofErr w:type="gramStart"/>
-      <w:r>
-        <w:t>price,</w:t>
-      </w:r>
-      <w:proofErr w:type="gramEnd"/>
-      <w:r>
-        <w:t xml:space="preserve"> </w:t>
+        <w:t xml:space="preserve">This indicator is based on the numerical variable of product price, </w:t>
       </w:r>
       <w:r>
         <w:t xml:space="preserve">this directly reflects the type of brand the product is from. For example, it can be assumed that a low price is from a drugstore brand and higher prices are from high end brands. </w:t>
@@ -5647,15 +5493,7 @@
         <w:t xml:space="preserve">Weaknesses: </w:t>
       </w:r>
       <w:r>
-        <w:t xml:space="preserve">The downside to the price variable is it is in US </w:t>
-      </w:r>
-      <w:proofErr w:type="gramStart"/>
-      <w:r>
-        <w:t>dollars,</w:t>
-      </w:r>
-      <w:proofErr w:type="gramEnd"/>
-      <w:r>
-        <w:t xml:space="preserve"> therefore it is important to consider this when considering the beauty market outside of the US. </w:t>
+        <w:t xml:space="preserve">The downside to the price variable is it is in US dollars, therefore it is important to consider this when considering the beauty market outside of the US. </w:t>
       </w:r>
     </w:p>
     <w:p>
@@ -5933,15 +5771,7 @@
         <w:t xml:space="preserve">: </w:t>
       </w:r>
       <w:r>
-        <w:t xml:space="preserve">This indicator has binary results with yes or </w:t>
-      </w:r>
-      <w:proofErr w:type="gramStart"/>
-      <w:r>
-        <w:t>no,</w:t>
-      </w:r>
-      <w:proofErr w:type="gramEnd"/>
-      <w:r>
-        <w:t xml:space="preserve"> therefore it doesn’t represent any brands who may be actively trying to move away from animal testing and are not approved yet or parent companies and suppliers that still test on animals. </w:t>
+        <w:t xml:space="preserve">This indicator has binary results with yes or no, therefore it doesn’t represent any brands who may be actively trying to move away from animal testing and are not approved yet or parent companies and suppliers that still test on animals. </w:t>
       </w:r>
     </w:p>
     <w:p>
@@ -6062,15 +5892,7 @@
         <w:t xml:space="preserve">: </w:t>
       </w:r>
       <w:r>
-        <w:t xml:space="preserve">This indicator has binary results with yes or </w:t>
-      </w:r>
-      <w:proofErr w:type="gramStart"/>
-      <w:r>
-        <w:t>no,</w:t>
-      </w:r>
-      <w:proofErr w:type="gramEnd"/>
-      <w:r>
-        <w:t xml:space="preserve"> therefore it doesn’t represent any brands who may be actively trying to move away from animal testing and are not approved yet or parent companies and suppliers that still test on animals. </w:t>
+        <w:t xml:space="preserve">This indicator has binary results with yes or no, therefore it doesn’t represent any brands who may be actively trying to move away from animal testing and are not approved yet or parent companies and suppliers that still test on animals. </w:t>
       </w:r>
     </w:p>
     <w:p/>
@@ -6927,75 +6749,27 @@
     </w:p>
     <w:p>
       <w:r>
-        <w:t xml:space="preserve">I performed checks on the raw products </w:t>
-      </w:r>
-      <w:proofErr w:type="gramStart"/>
-      <w:r>
-        <w:t>dataset</w:t>
-      </w:r>
-      <w:proofErr w:type="gramEnd"/>
-      <w:r>
-        <w:t xml:space="preserve"> and it contained no missing values.</w:t>
-      </w:r>
-    </w:p>
-    <w:p>
-      <w:r>
-        <w:t xml:space="preserve">For the cruelty free </w:t>
-      </w:r>
-      <w:proofErr w:type="gramStart"/>
-      <w:r>
-        <w:t>lists</w:t>
-      </w:r>
-      <w:proofErr w:type="gramEnd"/>
-      <w:r>
-        <w:t xml:space="preserve"> they didn’t require a check for null values as I web scraped these values straight from the PETA website. </w:t>
-      </w:r>
-    </w:p>
-    <w:p>
-      <w:r>
-        <w:t xml:space="preserve">The only dataset that contained missing values was the Toxic Chemicals List, it had missing values for the variables CSFId, CSF, Discontinued Date and Chemical Date Removed. There was a very high </w:t>
-      </w:r>
-      <w:proofErr w:type="gramStart"/>
-      <w:r>
-        <w:t>amount</w:t>
-      </w:r>
-      <w:proofErr w:type="gramEnd"/>
-      <w:r>
-        <w:t xml:space="preserve"> of missing values, including CSFId with 33973 values, CSF 34398, Discontinued Date 101715, and Chemical Date Removed with 11650. </w:t>
-      </w:r>
-    </w:p>
-    <w:p>
-      <w:r>
-        <w:t xml:space="preserve">To combat the missing </w:t>
-      </w:r>
-      <w:proofErr w:type="gramStart"/>
-      <w:r>
-        <w:t>values</w:t>
-      </w:r>
-      <w:proofErr w:type="gramEnd"/>
-      <w:r>
-        <w:t xml:space="preserve"> I first looked at the CSFId, from the original dataset I discovered this Id is given from the California State during their investigation into products. </w:t>
-      </w:r>
-      <w:proofErr w:type="gramStart"/>
-      <w:r>
-        <w:t>Therefore</w:t>
-      </w:r>
-      <w:proofErr w:type="gramEnd"/>
-      <w:r>
-        <w:t xml:space="preserve"> I gave the missing values a new value of 0 to remove the missing value. </w:t>
-      </w:r>
-    </w:p>
-    <w:p>
-      <w:r>
-        <w:t xml:space="preserve">For the CSF this includes specific ingredients in each product, as I do not have access to the exact </w:t>
-      </w:r>
-      <w:proofErr w:type="gramStart"/>
-      <w:r>
-        <w:t>ingredients</w:t>
-      </w:r>
-      <w:proofErr w:type="gramEnd"/>
-      <w:r>
-        <w:t xml:space="preserve"> I used a “Standard” value to fill missing values. </w:t>
+        <w:t>I performed checks on the raw products dataset and it contained no missing values.</w:t>
+      </w:r>
+    </w:p>
+    <w:p>
+      <w:r>
+        <w:t xml:space="preserve">For the cruelty free lists they didn’t require a check for null values as I web scraped these values straight from the PETA website. </w:t>
+      </w:r>
+    </w:p>
+    <w:p>
+      <w:r>
+        <w:t xml:space="preserve">The only dataset that contained missing values was the Toxic Chemicals List, it had missing values for the variables CSFId, CSF, Discontinued Date and Chemical Date Removed. There was a very high amount of missing values, including CSFId with 33973 values, CSF 34398, Discontinued Date 101715, and Chemical Date Removed with 11650. </w:t>
+      </w:r>
+    </w:p>
+    <w:p>
+      <w:r>
+        <w:t xml:space="preserve">To combat the missing values I first looked at the CSFId, from the original dataset I discovered this Id is given from the California State during their investigation into products. Therefore I gave the missing values a new value of 0 to remove the missing value. </w:t>
+      </w:r>
+    </w:p>
+    <w:p>
+      <w:r>
+        <w:t xml:space="preserve">For the CSF this includes specific ingredients in each product, as I do not have access to the exact ingredients I used a “Standard” value to fill missing values. </w:t>
       </w:r>
     </w:p>
     <w:p>
@@ -7005,15 +6779,7 @@
     </w:p>
     <w:p>
       <w:r>
-        <w:t xml:space="preserve">Once I dealt with the missing values, I combined the datasets together first I merged the products dataset with the cruelty free list. To do this I combined the cruelty free and </w:t>
-      </w:r>
-      <w:proofErr w:type="spellStart"/>
-      <w:r>
-        <w:t>non cruelty</w:t>
-      </w:r>
-      <w:proofErr w:type="spellEnd"/>
-      <w:r>
-        <w:t xml:space="preserve"> free brands list together, I changed the field to be “PETA Status” therefore if the brand was cruelty free it would have the value “Certified Cruelty Free”, and if not “Tests on Animals”. I found that some brands did not have any PETA Status and were not on either list, I dealt with this issue later in the process.</w:t>
+        <w:t>Once I dealt with the missing values, I combined the datasets together first I merged the products dataset with the cruelty free list. To do this I combined the cruelty free and non cruelty free brands list together, I changed the field to be “PETA Status” therefore if the brand was cruelty free it would have the value “Certified Cruelty Free”, and if not “Tests on Animals”. I found that some brands did not have any PETA Status and were not on either list, I dealt with this issue later in the process.</w:t>
       </w:r>
     </w:p>
     <w:p>
@@ -7024,23 +6790,7 @@
         <w:t xml:space="preserve">toxic chemicals </w:t>
       </w:r>
       <w:r>
-        <w:t xml:space="preserve">columns into the products dataset. After combining the </w:t>
-      </w:r>
-      <w:proofErr w:type="gramStart"/>
-      <w:r>
-        <w:t>dataset</w:t>
-      </w:r>
-      <w:proofErr w:type="gramEnd"/>
-      <w:r>
-        <w:t xml:space="preserve"> I found more missing values for PETA Status at 13105, Discontinued Date and Chemical Date Removed both had 12820 missing values. I believe this was due to </w:t>
-      </w:r>
-      <w:proofErr w:type="gramStart"/>
-      <w:r>
-        <w:t>the majority of</w:t>
-      </w:r>
-      <w:proofErr w:type="gramEnd"/>
-      <w:r>
-        <w:t xml:space="preserve"> the products from the original dataset did not have any chemicals. </w:t>
+        <w:t xml:space="preserve">columns into the products dataset. After combining the dataset I found more missing values for PETA Status at 13105, Discontinued Date and Chemical Date Removed both had 12820 missing values. I believe this was due to the majority of the products from the original dataset did not have any chemicals. </w:t>
       </w:r>
     </w:p>
     <w:p>
@@ -7075,15 +6825,7 @@
     </w:p>
     <w:p>
       <w:r>
-        <w:t xml:space="preserve">I checked the products dataset for outliers in numerical </w:t>
-      </w:r>
-      <w:proofErr w:type="gramStart"/>
-      <w:r>
-        <w:t>variables,</w:t>
-      </w:r>
-      <w:proofErr w:type="gramEnd"/>
-      <w:r>
-        <w:t xml:space="preserve"> these included the price and number of reviews. </w:t>
+        <w:t xml:space="preserve">I checked the products dataset for outliers in numerical variables, these included the price and number of reviews. </w:t>
       </w:r>
     </w:p>
     <w:p>
@@ -7269,15 +7011,7 @@
     <w:p/>
     <w:p>
       <w:r>
-        <w:t xml:space="preserve">The boxplot above displays the Number of Reviews for products, it outlines that there is a large range of reviews for brands. The data is not dealing with products that have the same popularity from consumers. The median is 5000 </w:t>
-      </w:r>
-      <w:proofErr w:type="gramStart"/>
-      <w:r>
-        <w:t>reviews,</w:t>
-      </w:r>
-      <w:proofErr w:type="gramEnd"/>
-      <w:r>
-        <w:t xml:space="preserve"> this means that half of the products in the dataset have more than 5000 consumer reviews and the other half have fewer than 5000 reviews. Majority of products have reviews between 2500 and 7500. I will not be removing any values for number of reviews, as this proves that some products are more popular with consumers than others. </w:t>
+        <w:t xml:space="preserve">The boxplot above displays the Number of Reviews for products, it outlines that there is a large range of reviews for brands. The data is not dealing with products that have the same popularity from consumers. The median is 5000 reviews, this means that half of the products in the dataset have more than 5000 consumer reviews and the other half have fewer than 5000 reviews. Majority of products have reviews between 2500 and 7500. I will not be removing any values for number of reviews, as this proves that some products are more popular with consumers than others. </w:t>
       </w:r>
     </w:p>
     <w:p>
@@ -7375,55 +7109,18 @@
       <w:r>
         <w:t xml:space="preserve">To deal with the categorical variables I transformed them to numeric values, firstly I changed the Cruelty Free and Toxic Chemical Amounts to int types. </w:t>
       </w:r>
-      <w:proofErr w:type="gramStart"/>
-      <w:r>
-        <w:t>Therefore</w:t>
-      </w:r>
-      <w:proofErr w:type="gramEnd"/>
-      <w:r>
-        <w:t xml:space="preserve"> if a brand is certified cruelty free it will have a value of 1. For the toxic chemical </w:t>
-      </w:r>
-      <w:proofErr w:type="gramStart"/>
-      <w:r>
-        <w:t>amounts</w:t>
-      </w:r>
-      <w:proofErr w:type="gramEnd"/>
-      <w:r>
-        <w:t xml:space="preserve"> variable, I decided to use a 0 and 1 basis as well, as there are a lot of products per brand I believe it makes more sense to use this variable to show if a brand contains any toxic </w:t>
-      </w:r>
-      <w:proofErr w:type="gramStart"/>
-      <w:r>
-        <w:t>chemicals as a whole</w:t>
-      </w:r>
-      <w:proofErr w:type="gramEnd"/>
-      <w:r>
-        <w:t xml:space="preserve">. </w:t>
-      </w:r>
-    </w:p>
-    <w:p>
-      <w:r>
-        <w:t xml:space="preserve">For the Category variable, I sorted the categories into is skincare or make up and use a 0 and 1 metric. For skin type I gave each type a number between 1 and </w:t>
-      </w:r>
-      <w:proofErr w:type="gramStart"/>
-      <w:r>
-        <w:t>3, and</w:t>
-      </w:r>
-      <w:proofErr w:type="gramEnd"/>
-      <w:r>
-        <w:t xml:space="preserve"> applied these new values. </w:t>
-      </w:r>
-    </w:p>
-    <w:p>
-      <w:r>
-        <w:t xml:space="preserve">The product size variable included a number and ml for example </w:t>
-      </w:r>
-      <w:proofErr w:type="gramStart"/>
-      <w:r>
-        <w:t>50ml,</w:t>
-      </w:r>
-      <w:proofErr w:type="gramEnd"/>
-      <w:r>
-        <w:t xml:space="preserve"> therefore I removed the ‘ml’ from each value to ensure there were only numbers in this variable. </w:t>
+      <w:r>
+        <w:t xml:space="preserve">Therefore if a brand is certified cruelty free it will have a value of 1. For the toxic chemical amounts variable, I decided to use a 0 and 1 basis as well, as there are a lot of products per brand I believe it makes more sense to use this variable to show if a brand contains any toxic chemicals as a whole. </w:t>
+      </w:r>
+    </w:p>
+    <w:p>
+      <w:r>
+        <w:t xml:space="preserve">For the Category variable, I sorted the categories into is skincare or make up and use a 0 and 1 metric. For skin type I gave each type a number between 1 and 3, and applied these new values. </w:t>
+      </w:r>
+    </w:p>
+    <w:p>
+      <w:r>
+        <w:t xml:space="preserve">The product size variable included a number and ml for example 50ml, therefore I removed the ‘ml’ from each value to ensure there were only numbers in this variable. </w:t>
       </w:r>
     </w:p>
     <w:p>
@@ -7454,23 +7151,7 @@
     </w:p>
     <w:p>
       <w:r>
-        <w:t xml:space="preserve">The </w:t>
-      </w:r>
-      <w:proofErr w:type="gramStart"/>
-      <w:r>
-        <w:t>country of origin</w:t>
-      </w:r>
-      <w:proofErr w:type="gramEnd"/>
-      <w:r>
-        <w:t xml:space="preserve"> variable included European countries and some countries outside of Europe, I changed this variable to be European Origin as products created in European countries have the same legislation </w:t>
-      </w:r>
-      <w:proofErr w:type="gramStart"/>
-      <w:r>
-        <w:t>therefore</w:t>
-      </w:r>
-      <w:proofErr w:type="gramEnd"/>
-      <w:r>
-        <w:t xml:space="preserve"> they are set apart from the US or Australia. </w:t>
+        <w:t xml:space="preserve">The country of origin variable included European countries and some countries outside of Europe, I changed this variable to be European Origin as products created in European countries have the same legislation therefore they are set apart from the US or Australia. </w:t>
       </w:r>
     </w:p>
     <w:p/>
@@ -7491,27 +7172,11 @@
     </w:p>
     <w:p>
       <w:r>
-        <w:t xml:space="preserve">By dealing with the missing values in the </w:t>
-      </w:r>
-      <w:proofErr w:type="gramStart"/>
-      <w:r>
-        <w:t>dataset</w:t>
-      </w:r>
-      <w:proofErr w:type="gramEnd"/>
-      <w:r>
-        <w:t xml:space="preserve"> I was able to safe important rows of data instead of removing the rows entirely and throwing away entire rows of product data. For example, if I had removed every row that did not have a PETA status, this would be removing data for no reason as the brand could be actively trying to get approved. By </w:t>
+        <w:t xml:space="preserve">By dealing with the missing values in the dataset I was able to safe important rows of data instead of removing the rows entirely and throwing away entire rows of product data. For example, if I had removed every row that did not have a PETA status, this would be removing data for no reason as the brand could be actively trying to get approved. By </w:t>
       </w:r>
       <w:r>
         <w:lastRenderedPageBreak/>
-        <w:t xml:space="preserve">filling in the missing values I was able to keep </w:t>
-      </w:r>
-      <w:proofErr w:type="gramStart"/>
-      <w:r>
-        <w:t>all of</w:t>
-      </w:r>
-      <w:proofErr w:type="gramEnd"/>
-      <w:r>
-        <w:t xml:space="preserve"> my beauty brands for the composite index. </w:t>
+        <w:t xml:space="preserve">filling in the missing values I was able to keep all of my beauty brands for the composite index. </w:t>
       </w:r>
     </w:p>
     <w:p>
@@ -7837,23 +7502,7 @@
           <w:rFonts w:ascii="Aptos" w:hAnsi="Aptos" w:cs="Arial"/>
           <w:color w:val="000000" w:themeColor="text1"/>
         </w:rPr>
-        <w:t xml:space="preserve">As there are so many </w:t>
-      </w:r>
-      <w:proofErr w:type="gramStart"/>
-      <w:r>
-        <w:rPr>
-          <w:rFonts w:ascii="Aptos" w:hAnsi="Aptos" w:cs="Arial"/>
-          <w:color w:val="000000" w:themeColor="text1"/>
-        </w:rPr>
-        <w:t>variables</w:t>
-      </w:r>
-      <w:proofErr w:type="gramEnd"/>
-      <w:r>
-        <w:rPr>
-          <w:rFonts w:ascii="Aptos" w:hAnsi="Aptos" w:cs="Arial"/>
-          <w:color w:val="000000" w:themeColor="text1"/>
-        </w:rPr>
-        <w:t xml:space="preserve"> I decided to use a heatmap to display the correlation between variables. </w:t>
+        <w:t xml:space="preserve">As there are so many variables I decided to use a heatmap to display the correlation between variables. </w:t>
       </w:r>
     </w:p>
     <w:p>
@@ -7949,39 +7598,7 @@
           <w:rFonts w:ascii="Aptos" w:hAnsi="Aptos" w:cs="Arial"/>
           <w:color w:val="000000" w:themeColor="text1"/>
         </w:rPr>
-        <w:t xml:space="preserve">From the heatmap I was able to see what variables </w:t>
-      </w:r>
-      <w:proofErr w:type="gramStart"/>
-      <w:r>
-        <w:rPr>
-          <w:rFonts w:ascii="Aptos" w:hAnsi="Aptos" w:cs="Arial"/>
-          <w:color w:val="000000" w:themeColor="text1"/>
-        </w:rPr>
-        <w:t>had a high or low correlation</w:t>
-      </w:r>
-      <w:proofErr w:type="gramEnd"/>
-      <w:r>
-        <w:rPr>
-          <w:rFonts w:ascii="Aptos" w:hAnsi="Aptos" w:cs="Arial"/>
-          <w:color w:val="000000" w:themeColor="text1"/>
-        </w:rPr>
-        <w:t xml:space="preserve">, </w:t>
-      </w:r>
-      <w:proofErr w:type="gramStart"/>
-      <w:r>
-        <w:rPr>
-          <w:rFonts w:ascii="Aptos" w:hAnsi="Aptos" w:cs="Arial"/>
-          <w:color w:val="000000" w:themeColor="text1"/>
-        </w:rPr>
-        <w:t>it is clear that there</w:t>
-      </w:r>
-      <w:proofErr w:type="gramEnd"/>
-      <w:r>
-        <w:rPr>
-          <w:rFonts w:ascii="Aptos" w:hAnsi="Aptos" w:cs="Arial"/>
-          <w:color w:val="000000" w:themeColor="text1"/>
-        </w:rPr>
-        <w:t xml:space="preserve"> is an overall low linear correlation between variables as the correlation values are mostly between -0.30 and +0.30. </w:t>
+        <w:t xml:space="preserve">From the heatmap I was able to see what variables had a high or low correlation, it is clear that there is an overall low linear correlation between variables as the correlation values are mostly between -0.30 and +0.30. </w:t>
       </w:r>
       <w:r>
         <w:rPr>
@@ -8161,23 +7778,7 @@
           <w:rFonts w:ascii="Aptos" w:hAnsi="Aptos" w:cs="Arial"/>
           <w:color w:val="000000" w:themeColor="text1"/>
         </w:rPr>
-        <w:t xml:space="preserve">The most notable negative correlations involve usage frequency and product </w:t>
-      </w:r>
-      <w:proofErr w:type="gramStart"/>
-      <w:r>
-        <w:rPr>
-          <w:rFonts w:ascii="Aptos" w:hAnsi="Aptos" w:cs="Arial"/>
-          <w:color w:val="000000" w:themeColor="text1"/>
-        </w:rPr>
-        <w:t>size,</w:t>
-      </w:r>
-      <w:proofErr w:type="gramEnd"/>
-      <w:r>
-        <w:rPr>
-          <w:rFonts w:ascii="Aptos" w:hAnsi="Aptos" w:cs="Arial"/>
-          <w:color w:val="000000" w:themeColor="text1"/>
-        </w:rPr>
-        <w:t xml:space="preserve"> this makes sense as products meant to frequent use or daily application usually come in smaller sizes. Similarly active ingredients and number of reviews have a negative correlation of -0.38</w:t>
+        <w:t>The most notable negative correlations involve usage frequency and product size, this makes sense as products meant to frequent use or daily application usually come in smaller sizes. Similarly active ingredients and number of reviews have a negative correlation of -0.38</w:t>
       </w:r>
       <w:r>
         <w:rPr>
@@ -8530,15 +8131,7 @@
         <w:t xml:space="preserve"> PC3 at 11%. From PC3 onwards the line significantly drops</w:t>
       </w:r>
       <w:r>
-        <w:t xml:space="preserve">, the first three principal components capture a large portion of the total dataset variance. This confirms that the 11 variables can be condensed into three core </w:t>
-      </w:r>
-      <w:proofErr w:type="gramStart"/>
-      <w:r>
-        <w:t>principal</w:t>
-      </w:r>
-      <w:proofErr w:type="gramEnd"/>
-      <w:r>
-        <w:t xml:space="preserve"> components. </w:t>
+        <w:t xml:space="preserve">, the first three principal components capture a large portion of the total dataset variance. This confirms that the 11 variables can be condensed into three core principal components. </w:t>
       </w:r>
     </w:p>
     <w:p>
@@ -9443,15 +9036,7 @@
     </w:p>
     <w:p>
       <w:r>
-        <w:t xml:space="preserve">As KMeans clustering does not work well with outliers it was essential that I checked for outliers in my data. During step 4 of Multivariate Analysis, I carried out outlier checks in the data before and after combining </w:t>
-      </w:r>
-      <w:proofErr w:type="gramStart"/>
-      <w:r>
-        <w:t>all of</w:t>
-      </w:r>
-      <w:proofErr w:type="gramEnd"/>
-      <w:r>
-        <w:t xml:space="preserve"> my datasets using boxplots, I also converted string variables into numeric values such as the is cruelty free variable. </w:t>
+        <w:t xml:space="preserve">As KMeans clustering does not work well with outliers it was essential that I checked for outliers in my data. During step 4 of Multivariate Analysis, I carried out outlier checks in the data before and after combining all of my datasets using boxplots, I also converted string variables into numeric values such as the is cruelty free variable. </w:t>
       </w:r>
     </w:p>
     <w:p>
@@ -9558,15 +9143,7 @@
         <w:t>with the data staying within a standard deviation of 3. W</w:t>
       </w:r>
       <w:r>
-        <w:t xml:space="preserve">ith zero outliers detected this shows that </w:t>
-      </w:r>
-      <w:proofErr w:type="gramStart"/>
-      <w:r>
-        <w:t>the majority of</w:t>
-      </w:r>
-      <w:proofErr w:type="gramEnd"/>
-      <w:r>
-        <w:t xml:space="preserve"> the data is stable in the final dataset.</w:t>
+        <w:t>ith zero outliers detected this shows that the majority of the data is stable in the final dataset.</w:t>
       </w:r>
     </w:p>
     <w:p>
@@ -9691,15 +9268,7 @@
     </w:p>
     <w:p>
       <w:r>
-        <w:t xml:space="preserve">The boxplot above shows that the standard scaling procedure successfully worked on these indicators. The number of reviews was previously thousands, however now </w:t>
-      </w:r>
-      <w:proofErr w:type="gramStart"/>
-      <w:r>
-        <w:t>all of</w:t>
-      </w:r>
-      <w:proofErr w:type="gramEnd"/>
-      <w:r>
-        <w:t xml:space="preserve"> the numerical values are within the same scale of around -2.3 and +1.8. </w:t>
+        <w:t xml:space="preserve">The boxplot above shows that the standard scaling procedure successfully worked on these indicators. The number of reviews was previously thousands, however now all of the numerical values are within the same scale of around -2.3 and +1.8. </w:t>
       </w:r>
       <w:r>
         <w:t xml:space="preserve">The median values for the three variables are also within the same range which is good. </w:t>
@@ -9830,12 +9399,148 @@
       </w:r>
     </w:p>
     <w:p>
-      <w:pPr>
-        <w:rPr>
-          <w:b/>
-          <w:bCs/>
-        </w:rPr>
-      </w:pPr>
+      <w:r>
+        <w:t>The structure of my composite index was built using the following sub indicators:</w:t>
+      </w:r>
+    </w:p>
+    <w:p>
+      <w:pPr>
+        <w:pStyle w:val="ListParagraph"/>
+        <w:numPr>
+          <w:ilvl w:val="0"/>
+          <w:numId w:val="21"/>
+        </w:numPr>
+        <w:rPr>
+          <w:b/>
+          <w:bCs/>
+        </w:rPr>
+      </w:pPr>
+      <w:r>
+        <w:rPr>
+          <w:b/>
+          <w:bCs/>
+        </w:rPr>
+        <w:t>Market Affordability Index:</w:t>
+      </w:r>
+      <w:r>
+        <w:rPr>
+          <w:b/>
+          <w:bCs/>
+        </w:rPr>
+        <w:t xml:space="preserve"> </w:t>
+      </w:r>
+      <w:r>
+        <w:t xml:space="preserve">The scaled price represents how accessible the product is for consumers. </w:t>
+      </w:r>
+    </w:p>
+    <w:p>
+      <w:pPr>
+        <w:pStyle w:val="ListParagraph"/>
+        <w:numPr>
+          <w:ilvl w:val="0"/>
+          <w:numId w:val="21"/>
+        </w:numPr>
+        <w:rPr>
+          <w:b/>
+          <w:bCs/>
+        </w:rPr>
+      </w:pPr>
+      <w:r>
+        <w:rPr>
+          <w:b/>
+          <w:bCs/>
+        </w:rPr>
+        <w:t xml:space="preserve">Consumer Acceptance Index: </w:t>
+      </w:r>
+      <w:r>
+        <w:t xml:space="preserve">This represents an equally weighted average based on what the consumer thinks of the brand, using the scaled rating and number </w:t>
+      </w:r>
+      <w:r>
+        <w:t>of reviews</w:t>
+      </w:r>
+      <w:r>
+        <w:t xml:space="preserve">. </w:t>
+      </w:r>
+    </w:p>
+    <w:p>
+      <w:pPr>
+        <w:pStyle w:val="ListParagraph"/>
+        <w:numPr>
+          <w:ilvl w:val="0"/>
+          <w:numId w:val="21"/>
+        </w:numPr>
+        <w:rPr>
+          <w:b/>
+          <w:bCs/>
+        </w:rPr>
+      </w:pPr>
+      <w:r>
+        <w:rPr>
+          <w:b/>
+          <w:bCs/>
+        </w:rPr>
+        <w:t>Packaging Sustainability Index:</w:t>
+      </w:r>
+      <w:r>
+        <w:rPr>
+          <w:b/>
+          <w:bCs/>
+        </w:rPr>
+        <w:t xml:space="preserve"> </w:t>
+      </w:r>
+      <w:r>
+        <w:t xml:space="preserve">This captures the brands status on environmental compliance using the scaled packaging type variable. </w:t>
+      </w:r>
+    </w:p>
+    <w:p>
+      <w:pPr>
+        <w:pStyle w:val="ListParagraph"/>
+        <w:numPr>
+          <w:ilvl w:val="0"/>
+          <w:numId w:val="21"/>
+        </w:numPr>
+        <w:rPr>
+          <w:b/>
+          <w:bCs/>
+        </w:rPr>
+      </w:pPr>
+      <w:r>
+        <w:rPr>
+          <w:b/>
+          <w:bCs/>
+        </w:rPr>
+        <w:t>Ethical Compliance Index:</w:t>
+      </w:r>
+      <w:r>
+        <w:rPr>
+          <w:b/>
+          <w:bCs/>
+        </w:rPr>
+        <w:t xml:space="preserve"> </w:t>
+      </w:r>
+      <w:r>
+        <w:t xml:space="preserve">This index represents the brands ethical reputation using the cruelty free variable. </w:t>
+      </w:r>
+    </w:p>
+    <w:p>
+      <w:pPr>
+        <w:pStyle w:val="ListParagraph"/>
+        <w:numPr>
+          <w:ilvl w:val="0"/>
+          <w:numId w:val="21"/>
+        </w:numPr>
+        <w:rPr>
+          <w:b/>
+          <w:bCs/>
+        </w:rPr>
+      </w:pPr>
+      <w:r>
+        <w:rPr>
+          <w:b/>
+          <w:bCs/>
+        </w:rPr>
+        <w:t>Product Safety Index:</w:t>
+      </w:r>
     </w:p>
     <w:p>
       <w:pPr>
@@ -10044,6 +9749,7 @@
     </w:p>
     <w:p>
       <w:r>
+        <w:lastRenderedPageBreak/>
         <w:t xml:space="preserve">Top brands belong to cluster 2, scaler working as the top brand is 100. </w:t>
       </w:r>
     </w:p>
@@ -12427,6 +12133,119 @@
       </w:rPr>
     </w:lvl>
   </w:abstractNum>
+  <w:abstractNum w:abstractNumId="20" w15:restartNumberingAfterBreak="0">
+    <w:nsid w:val="7F523469"/>
+    <w:multiLevelType w:val="hybridMultilevel"/>
+    <w:tmpl w:val="BA9A1D02"/>
+    <w:lvl w:ilvl="0" w:tplc="08090001">
+      <w:start w:val="1"/>
+      <w:numFmt w:val="bullet"/>
+      <w:lvlText w:val=""/>
+      <w:lvlJc w:val="left"/>
+      <w:pPr>
+        <w:ind w:left="1080" w:hanging="360"/>
+      </w:pPr>
+      <w:rPr>
+        <w:rFonts w:ascii="Symbol" w:hAnsi="Symbol" w:hint="default"/>
+      </w:rPr>
+    </w:lvl>
+    <w:lvl w:ilvl="1" w:tplc="08090003" w:tentative="1">
+      <w:start w:val="1"/>
+      <w:numFmt w:val="bullet"/>
+      <w:lvlText w:val="o"/>
+      <w:lvlJc w:val="left"/>
+      <w:pPr>
+        <w:ind w:left="1800" w:hanging="360"/>
+      </w:pPr>
+      <w:rPr>
+        <w:rFonts w:ascii="Courier New" w:hAnsi="Courier New" w:cs="Courier New" w:hint="default"/>
+      </w:rPr>
+    </w:lvl>
+    <w:lvl w:ilvl="2" w:tplc="08090005" w:tentative="1">
+      <w:start w:val="1"/>
+      <w:numFmt w:val="bullet"/>
+      <w:lvlText w:val=""/>
+      <w:lvlJc w:val="left"/>
+      <w:pPr>
+        <w:ind w:left="2520" w:hanging="360"/>
+      </w:pPr>
+      <w:rPr>
+        <w:rFonts w:ascii="Wingdings" w:hAnsi="Wingdings" w:hint="default"/>
+      </w:rPr>
+    </w:lvl>
+    <w:lvl w:ilvl="3" w:tplc="08090001" w:tentative="1">
+      <w:start w:val="1"/>
+      <w:numFmt w:val="bullet"/>
+      <w:lvlText w:val=""/>
+      <w:lvlJc w:val="left"/>
+      <w:pPr>
+        <w:ind w:left="3240" w:hanging="360"/>
+      </w:pPr>
+      <w:rPr>
+        <w:rFonts w:ascii="Symbol" w:hAnsi="Symbol" w:hint="default"/>
+      </w:rPr>
+    </w:lvl>
+    <w:lvl w:ilvl="4" w:tplc="08090003" w:tentative="1">
+      <w:start w:val="1"/>
+      <w:numFmt w:val="bullet"/>
+      <w:lvlText w:val="o"/>
+      <w:lvlJc w:val="left"/>
+      <w:pPr>
+        <w:ind w:left="3960" w:hanging="360"/>
+      </w:pPr>
+      <w:rPr>
+        <w:rFonts w:ascii="Courier New" w:hAnsi="Courier New" w:cs="Courier New" w:hint="default"/>
+      </w:rPr>
+    </w:lvl>
+    <w:lvl w:ilvl="5" w:tplc="08090005" w:tentative="1">
+      <w:start w:val="1"/>
+      <w:numFmt w:val="bullet"/>
+      <w:lvlText w:val=""/>
+      <w:lvlJc w:val="left"/>
+      <w:pPr>
+        <w:ind w:left="4680" w:hanging="360"/>
+      </w:pPr>
+      <w:rPr>
+        <w:rFonts w:ascii="Wingdings" w:hAnsi="Wingdings" w:hint="default"/>
+      </w:rPr>
+    </w:lvl>
+    <w:lvl w:ilvl="6" w:tplc="08090001" w:tentative="1">
+      <w:start w:val="1"/>
+      <w:numFmt w:val="bullet"/>
+      <w:lvlText w:val=""/>
+      <w:lvlJc w:val="left"/>
+      <w:pPr>
+        <w:ind w:left="5400" w:hanging="360"/>
+      </w:pPr>
+      <w:rPr>
+        <w:rFonts w:ascii="Symbol" w:hAnsi="Symbol" w:hint="default"/>
+      </w:rPr>
+    </w:lvl>
+    <w:lvl w:ilvl="7" w:tplc="08090003" w:tentative="1">
+      <w:start w:val="1"/>
+      <w:numFmt w:val="bullet"/>
+      <w:lvlText w:val="o"/>
+      <w:lvlJc w:val="left"/>
+      <w:pPr>
+        <w:ind w:left="6120" w:hanging="360"/>
+      </w:pPr>
+      <w:rPr>
+        <w:rFonts w:ascii="Courier New" w:hAnsi="Courier New" w:cs="Courier New" w:hint="default"/>
+      </w:rPr>
+    </w:lvl>
+    <w:lvl w:ilvl="8" w:tplc="08090005" w:tentative="1">
+      <w:start w:val="1"/>
+      <w:numFmt w:val="bullet"/>
+      <w:lvlText w:val=""/>
+      <w:lvlJc w:val="left"/>
+      <w:pPr>
+        <w:ind w:left="6840" w:hanging="360"/>
+      </w:pPr>
+      <w:rPr>
+        <w:rFonts w:ascii="Wingdings" w:hAnsi="Wingdings" w:hint="default"/>
+      </w:rPr>
+    </w:lvl>
+  </w:abstractNum>
   <w:num w:numId="1" w16cid:durableId="1677344584">
     <w:abstractNumId w:val="4"/>
   </w:num>
@@ -12486,6 +12305,9 @@
   </w:num>
   <w:num w:numId="20" w16cid:durableId="306207192">
     <w:abstractNumId w:val="3"/>
+  </w:num>
+  <w:num w:numId="21" w16cid:durableId="100729775">
+    <w:abstractNumId w:val="20"/>
   </w:num>
 </w:numbering>
 </file>

</xml_diff>

<commit_message>
Weighting and Aggregation Write up
I added the weighting and aggregation section to my report, outlining considerations for the sub indicators and final composite indicator score.
</commit_message>
<xml_diff>
--- a/DAV_CA1_Report.docx
+++ b/DAV_CA1_Report.docx
@@ -371,8 +371,21 @@
             <w:color w:val="000000" w:themeColor="text1"/>
             <w:u w:val="none"/>
           </w:rPr>
-          <w:t>……..</w:t>
+          <w:t>…</w:t>
         </w:r>
+        <w:proofErr w:type="gramStart"/>
+        <w:r>
+          <w:rPr>
+            <w:rStyle w:val="Hyperlink"/>
+            <w:rFonts w:ascii="Aptos" w:hAnsi="Aptos" w:cs="Arial"/>
+            <w:b/>
+            <w:bCs/>
+            <w:color w:val="000000" w:themeColor="text1"/>
+            <w:u w:val="none"/>
+          </w:rPr>
+          <w:t>…..</w:t>
+        </w:r>
+        <w:proofErr w:type="gramEnd"/>
         <w:r>
           <w:rPr>
             <w:rStyle w:val="Hyperlink"/>
@@ -542,6 +555,7 @@
         </w:rPr>
         <w:fldChar w:fldCharType="separate"/>
       </w:r>
+      <w:proofErr w:type="gramStart"/>
       <w:r>
         <w:rPr>
           <w:rStyle w:val="Hyperlink"/>
@@ -564,6 +578,7 @@
         </w:rPr>
         <w:t>ub Groups</w:t>
       </w:r>
+      <w:proofErr w:type="gramEnd"/>
       <w:r>
         <w:rPr>
           <w:rStyle w:val="Hyperlink"/>
@@ -1174,6 +1189,7 @@
         </w:rPr>
         <w:t xml:space="preserve">Summary Table </w:t>
       </w:r>
+      <w:proofErr w:type="gramStart"/>
       <w:r>
         <w:rPr>
           <w:rStyle w:val="Hyperlink"/>
@@ -1196,6 +1212,7 @@
         </w:rPr>
         <w:t>..</w:t>
       </w:r>
+      <w:proofErr w:type="gramEnd"/>
       <w:r>
         <w:rPr>
           <w:rStyle w:val="Hyperlink"/>
@@ -2290,7 +2307,19 @@
           <w:szCs w:val="22"/>
           <w:u w:val="none"/>
         </w:rPr>
-        <w:t>…….………………………………………</w:t>
+        <w:t>…….……………………………………</w:t>
+      </w:r>
+      <w:proofErr w:type="gramStart"/>
+      <w:r>
+        <w:rPr>
+          <w:rStyle w:val="Hyperlink"/>
+          <w:rFonts w:ascii="Aptos" w:hAnsi="Aptos" w:cs="Arial"/>
+          <w:color w:val="000000" w:themeColor="text1"/>
+          <w:sz w:val="22"/>
+          <w:szCs w:val="22"/>
+          <w:u w:val="none"/>
+        </w:rPr>
+        <w:t>…</w:t>
       </w:r>
       <w:r>
         <w:rPr>
@@ -2303,6 +2332,7 @@
         </w:rPr>
         <w:t>..</w:t>
       </w:r>
+      <w:proofErr w:type="gramEnd"/>
       <w:r>
         <w:rPr>
           <w:rStyle w:val="Hyperlink"/>
@@ -2405,18 +2435,42 @@
           <w:szCs w:val="22"/>
           <w:u w:val="none"/>
         </w:rPr>
-        <w:t>…………………………………………………………………</w:t>
-      </w:r>
-      <w:r>
-        <w:rPr>
-          <w:rStyle w:val="Hyperlink"/>
-          <w:rFonts w:ascii="Aptos" w:hAnsi="Aptos" w:cs="Arial"/>
-          <w:color w:val="000000" w:themeColor="text1"/>
-          <w:sz w:val="22"/>
-          <w:szCs w:val="22"/>
-          <w:u w:val="none"/>
-        </w:rPr>
-        <w:t xml:space="preserve">.. </w:t>
+        <w:t>………………………………………………………………</w:t>
+      </w:r>
+      <w:proofErr w:type="gramStart"/>
+      <w:r>
+        <w:rPr>
+          <w:rStyle w:val="Hyperlink"/>
+          <w:rFonts w:ascii="Aptos" w:hAnsi="Aptos" w:cs="Arial"/>
+          <w:color w:val="000000" w:themeColor="text1"/>
+          <w:sz w:val="22"/>
+          <w:szCs w:val="22"/>
+          <w:u w:val="none"/>
+        </w:rPr>
+        <w:t>…</w:t>
+      </w:r>
+      <w:r>
+        <w:rPr>
+          <w:rStyle w:val="Hyperlink"/>
+          <w:rFonts w:ascii="Aptos" w:hAnsi="Aptos" w:cs="Arial"/>
+          <w:color w:val="000000" w:themeColor="text1"/>
+          <w:sz w:val="22"/>
+          <w:szCs w:val="22"/>
+          <w:u w:val="none"/>
+        </w:rPr>
+        <w:t>..</w:t>
+      </w:r>
+      <w:proofErr w:type="gramEnd"/>
+      <w:r>
+        <w:rPr>
+          <w:rStyle w:val="Hyperlink"/>
+          <w:rFonts w:ascii="Aptos" w:hAnsi="Aptos" w:cs="Arial"/>
+          <w:color w:val="000000" w:themeColor="text1"/>
+          <w:sz w:val="22"/>
+          <w:szCs w:val="22"/>
+          <w:u w:val="none"/>
+        </w:rPr>
+        <w:t xml:space="preserve"> </w:t>
       </w:r>
       <w:r>
         <w:rPr>
@@ -2509,18 +2563,42 @@
           <w:szCs w:val="22"/>
           <w:u w:val="none"/>
         </w:rPr>
-        <w:t xml:space="preserve">and Possible Differences </w:t>
-      </w:r>
-      <w:r>
-        <w:rPr>
-          <w:rStyle w:val="Hyperlink"/>
-          <w:rFonts w:ascii="Aptos" w:hAnsi="Aptos" w:cs="Arial"/>
-          <w:color w:val="000000" w:themeColor="text1"/>
-          <w:sz w:val="22"/>
-          <w:szCs w:val="22"/>
-          <w:u w:val="none"/>
-        </w:rPr>
-        <w:t>.…………………</w:t>
+        <w:t xml:space="preserve">and Possible </w:t>
+      </w:r>
+      <w:proofErr w:type="gramStart"/>
+      <w:r>
+        <w:rPr>
+          <w:rStyle w:val="Hyperlink"/>
+          <w:rFonts w:ascii="Aptos" w:hAnsi="Aptos" w:cs="Arial"/>
+          <w:color w:val="000000" w:themeColor="text1"/>
+          <w:sz w:val="22"/>
+          <w:szCs w:val="22"/>
+          <w:u w:val="none"/>
+        </w:rPr>
+        <w:t xml:space="preserve">Differences </w:t>
+      </w:r>
+      <w:r>
+        <w:rPr>
+          <w:rStyle w:val="Hyperlink"/>
+          <w:rFonts w:ascii="Aptos" w:hAnsi="Aptos" w:cs="Arial"/>
+          <w:color w:val="000000" w:themeColor="text1"/>
+          <w:sz w:val="22"/>
+          <w:szCs w:val="22"/>
+          <w:u w:val="none"/>
+        </w:rPr>
+        <w:t>.</w:t>
+      </w:r>
+      <w:proofErr w:type="gramEnd"/>
+      <w:r>
+        <w:rPr>
+          <w:rStyle w:val="Hyperlink"/>
+          <w:rFonts w:ascii="Aptos" w:hAnsi="Aptos" w:cs="Arial"/>
+          <w:color w:val="000000" w:themeColor="text1"/>
+          <w:sz w:val="22"/>
+          <w:szCs w:val="22"/>
+          <w:u w:val="none"/>
+        </w:rPr>
+        <w:t>…………………</w:t>
       </w:r>
       <w:r>
         <w:rPr>
@@ -2912,7 +2990,19 @@
           <w:szCs w:val="22"/>
           <w:u w:val="none"/>
         </w:rPr>
-        <w:t>…….………………………………………</w:t>
+        <w:t>…….……………………………………</w:t>
+      </w:r>
+      <w:proofErr w:type="gramStart"/>
+      <w:r>
+        <w:rPr>
+          <w:rStyle w:val="Hyperlink"/>
+          <w:rFonts w:ascii="Aptos" w:hAnsi="Aptos" w:cs="Arial"/>
+          <w:color w:val="000000" w:themeColor="text1"/>
+          <w:sz w:val="22"/>
+          <w:szCs w:val="22"/>
+          <w:u w:val="none"/>
+        </w:rPr>
+        <w:t>…</w:t>
       </w:r>
       <w:r>
         <w:rPr>
@@ -2925,6 +3015,7 @@
         </w:rPr>
         <w:t>..</w:t>
       </w:r>
+      <w:proofErr w:type="gramEnd"/>
       <w:r>
         <w:rPr>
           <w:rStyle w:val="Hyperlink"/>
@@ -3142,8 +3233,21 @@
           <w:szCs w:val="22"/>
           <w:u w:val="none"/>
         </w:rPr>
-        <w:t>……..</w:t>
-      </w:r>
+        <w:t>…</w:t>
+      </w:r>
+      <w:proofErr w:type="gramStart"/>
+      <w:r>
+        <w:rPr>
+          <w:rStyle w:val="Hyperlink"/>
+          <w:rFonts w:ascii="Aptos" w:hAnsi="Aptos" w:cs="Arial"/>
+          <w:color w:val="000000" w:themeColor="text1"/>
+          <w:sz w:val="22"/>
+          <w:szCs w:val="22"/>
+          <w:u w:val="none"/>
+        </w:rPr>
+        <w:t>…..</w:t>
+      </w:r>
+      <w:proofErr w:type="gramEnd"/>
       <w:r>
         <w:rPr>
           <w:rStyle w:val="Hyperlink"/>
@@ -3974,8 +4078,21 @@
           <w:szCs w:val="22"/>
           <w:u w:val="none"/>
         </w:rPr>
-        <w:t>…………..</w:t>
-      </w:r>
+        <w:t>………</w:t>
+      </w:r>
+      <w:proofErr w:type="gramStart"/>
+      <w:r>
+        <w:rPr>
+          <w:rStyle w:val="Hyperlink"/>
+          <w:rFonts w:ascii="Aptos" w:hAnsi="Aptos" w:cs="Arial"/>
+          <w:color w:val="000000" w:themeColor="text1"/>
+          <w:sz w:val="22"/>
+          <w:szCs w:val="22"/>
+          <w:u w:val="none"/>
+        </w:rPr>
+        <w:t>…..</w:t>
+      </w:r>
+      <w:proofErr w:type="gramEnd"/>
       <w:r>
         <w:rPr>
           <w:rStyle w:val="Hyperlink"/>
@@ -4244,8 +4361,21 @@
           <w:szCs w:val="22"/>
           <w:u w:val="none"/>
         </w:rPr>
-        <w:t>…………..</w:t>
-      </w:r>
+        <w:t>………</w:t>
+      </w:r>
+      <w:proofErr w:type="gramStart"/>
+      <w:r>
+        <w:rPr>
+          <w:rStyle w:val="Hyperlink"/>
+          <w:rFonts w:ascii="Aptos" w:hAnsi="Aptos" w:cs="Arial"/>
+          <w:color w:val="000000" w:themeColor="text1"/>
+          <w:sz w:val="22"/>
+          <w:szCs w:val="22"/>
+          <w:u w:val="none"/>
+        </w:rPr>
+        <w:t>…..</w:t>
+      </w:r>
+      <w:proofErr w:type="gramEnd"/>
       <w:r>
         <w:rPr>
           <w:rStyle w:val="Hyperlink"/>
@@ -5139,7 +5269,15 @@
         <w:t>ariables</w:t>
       </w:r>
       <w:r>
-        <w:t xml:space="preserve"> via a trending products dataset, from this I gathered data for Ratings and Number of Reviews. </w:t>
+        <w:t xml:space="preserve"> via a trending products </w:t>
+      </w:r>
+      <w:proofErr w:type="gramStart"/>
+      <w:r>
+        <w:t>dataset,</w:t>
+      </w:r>
+      <w:proofErr w:type="gramEnd"/>
+      <w:r>
+        <w:t xml:space="preserve"> from this I gathered data for Ratings and Number of Reviews. </w:t>
       </w:r>
     </w:p>
     <w:p>
@@ -5407,7 +5545,15 @@
     </w:p>
     <w:p>
       <w:r>
-        <w:t xml:space="preserve">By utilising multiple sources for my data I believe I have a good foundation for addressing each sub index. </w:t>
+        <w:t xml:space="preserve">By utilising multiple sources for my </w:t>
+      </w:r>
+      <w:proofErr w:type="gramStart"/>
+      <w:r>
+        <w:t>data</w:t>
+      </w:r>
+      <w:proofErr w:type="gramEnd"/>
+      <w:r>
+        <w:t xml:space="preserve"> I believe I have a good foundation for addressing each sub index. </w:t>
       </w:r>
     </w:p>
     <w:p>
@@ -5467,7 +5613,15 @@
         <w:t xml:space="preserve">Strengths: </w:t>
       </w:r>
       <w:r>
-        <w:t xml:space="preserve">This indicator is based on the numerical variable of product price, </w:t>
+        <w:t xml:space="preserve">This indicator is based on the numerical variable of product </w:t>
+      </w:r>
+      <w:proofErr w:type="gramStart"/>
+      <w:r>
+        <w:t>price,</w:t>
+      </w:r>
+      <w:proofErr w:type="gramEnd"/>
+      <w:r>
+        <w:t xml:space="preserve"> </w:t>
       </w:r>
       <w:r>
         <w:t xml:space="preserve">this directly reflects the type of brand the product is from. For example, it can be assumed that a low price is from a drugstore brand and higher prices are from high end brands. </w:t>
@@ -5493,7 +5647,15 @@
         <w:t xml:space="preserve">Weaknesses: </w:t>
       </w:r>
       <w:r>
-        <w:t xml:space="preserve">The downside to the price variable is it is in US dollars, therefore it is important to consider this when considering the beauty market outside of the US. </w:t>
+        <w:t xml:space="preserve">The downside to the price variable is it is in US </w:t>
+      </w:r>
+      <w:proofErr w:type="gramStart"/>
+      <w:r>
+        <w:t>dollars,</w:t>
+      </w:r>
+      <w:proofErr w:type="gramEnd"/>
+      <w:r>
+        <w:t xml:space="preserve"> therefore it is important to consider this when considering the beauty market outside of the US. </w:t>
       </w:r>
     </w:p>
     <w:p>
@@ -5771,7 +5933,15 @@
         <w:t xml:space="preserve">: </w:t>
       </w:r>
       <w:r>
-        <w:t xml:space="preserve">This indicator has binary results with yes or no, therefore it doesn’t represent any brands who may be actively trying to move away from animal testing and are not approved yet or parent companies and suppliers that still test on animals. </w:t>
+        <w:t xml:space="preserve">This indicator has binary results with yes or </w:t>
+      </w:r>
+      <w:proofErr w:type="gramStart"/>
+      <w:r>
+        <w:t>no,</w:t>
+      </w:r>
+      <w:proofErr w:type="gramEnd"/>
+      <w:r>
+        <w:t xml:space="preserve"> therefore it doesn’t represent any brands who may be actively trying to move away from animal testing and are not approved yet or parent companies and suppliers that still test on animals. </w:t>
       </w:r>
     </w:p>
     <w:p>
@@ -5892,7 +6062,15 @@
         <w:t xml:space="preserve">: </w:t>
       </w:r>
       <w:r>
-        <w:t xml:space="preserve">This indicator has binary results with yes or no, therefore it doesn’t represent any brands who may be actively trying to move away from animal testing and are not approved yet or parent companies and suppliers that still test on animals. </w:t>
+        <w:t xml:space="preserve">This indicator has binary results with yes or </w:t>
+      </w:r>
+      <w:proofErr w:type="gramStart"/>
+      <w:r>
+        <w:t>no,</w:t>
+      </w:r>
+      <w:proofErr w:type="gramEnd"/>
+      <w:r>
+        <w:t xml:space="preserve"> therefore it doesn’t represent any brands who may be actively trying to move away from animal testing and are not approved yet or parent companies and suppliers that still test on animals. </w:t>
       </w:r>
     </w:p>
     <w:p/>
@@ -6749,27 +6927,75 @@
     </w:p>
     <w:p>
       <w:r>
-        <w:t>I performed checks on the raw products dataset and it contained no missing values.</w:t>
-      </w:r>
-    </w:p>
-    <w:p>
-      <w:r>
-        <w:t xml:space="preserve">For the cruelty free lists they didn’t require a check for null values as I web scraped these values straight from the PETA website. </w:t>
-      </w:r>
-    </w:p>
-    <w:p>
-      <w:r>
-        <w:t xml:space="preserve">The only dataset that contained missing values was the Toxic Chemicals List, it had missing values for the variables CSFId, CSF, Discontinued Date and Chemical Date Removed. There was a very high amount of missing values, including CSFId with 33973 values, CSF 34398, Discontinued Date 101715, and Chemical Date Removed with 11650. </w:t>
-      </w:r>
-    </w:p>
-    <w:p>
-      <w:r>
-        <w:t xml:space="preserve">To combat the missing values I first looked at the CSFId, from the original dataset I discovered this Id is given from the California State during their investigation into products. Therefore I gave the missing values a new value of 0 to remove the missing value. </w:t>
-      </w:r>
-    </w:p>
-    <w:p>
-      <w:r>
-        <w:t xml:space="preserve">For the CSF this includes specific ingredients in each product, as I do not have access to the exact ingredients I used a “Standard” value to fill missing values. </w:t>
+        <w:t xml:space="preserve">I performed checks on the raw products </w:t>
+      </w:r>
+      <w:proofErr w:type="gramStart"/>
+      <w:r>
+        <w:t>dataset</w:t>
+      </w:r>
+      <w:proofErr w:type="gramEnd"/>
+      <w:r>
+        <w:t xml:space="preserve"> and it contained no missing values.</w:t>
+      </w:r>
+    </w:p>
+    <w:p>
+      <w:r>
+        <w:t xml:space="preserve">For the cruelty free </w:t>
+      </w:r>
+      <w:proofErr w:type="gramStart"/>
+      <w:r>
+        <w:t>lists</w:t>
+      </w:r>
+      <w:proofErr w:type="gramEnd"/>
+      <w:r>
+        <w:t xml:space="preserve"> they didn’t require a check for null values as I web scraped these values straight from the PETA website. </w:t>
+      </w:r>
+    </w:p>
+    <w:p>
+      <w:r>
+        <w:t xml:space="preserve">The only dataset that contained missing values was the Toxic Chemicals List, it had missing values for the variables CSFId, CSF, Discontinued Date and Chemical Date Removed. There was a very high </w:t>
+      </w:r>
+      <w:proofErr w:type="gramStart"/>
+      <w:r>
+        <w:t>amount</w:t>
+      </w:r>
+      <w:proofErr w:type="gramEnd"/>
+      <w:r>
+        <w:t xml:space="preserve"> of missing values, including CSFId with 33973 values, CSF 34398, Discontinued Date 101715, and Chemical Date Removed with 11650. </w:t>
+      </w:r>
+    </w:p>
+    <w:p>
+      <w:r>
+        <w:t xml:space="preserve">To combat the missing </w:t>
+      </w:r>
+      <w:proofErr w:type="gramStart"/>
+      <w:r>
+        <w:t>values</w:t>
+      </w:r>
+      <w:proofErr w:type="gramEnd"/>
+      <w:r>
+        <w:t xml:space="preserve"> I first looked at the CSFId, from the original dataset I discovered this Id is given from the California State during their investigation into products. </w:t>
+      </w:r>
+      <w:proofErr w:type="gramStart"/>
+      <w:r>
+        <w:t>Therefore</w:t>
+      </w:r>
+      <w:proofErr w:type="gramEnd"/>
+      <w:r>
+        <w:t xml:space="preserve"> I gave the missing values a new value of 0 to remove the missing value. </w:t>
+      </w:r>
+    </w:p>
+    <w:p>
+      <w:r>
+        <w:t xml:space="preserve">For the CSF this includes specific ingredients in each product, as I do not have access to the exact </w:t>
+      </w:r>
+      <w:proofErr w:type="gramStart"/>
+      <w:r>
+        <w:t>ingredients</w:t>
+      </w:r>
+      <w:proofErr w:type="gramEnd"/>
+      <w:r>
+        <w:t xml:space="preserve"> I used a “Standard” value to fill missing values. </w:t>
       </w:r>
     </w:p>
     <w:p>
@@ -6779,7 +7005,15 @@
     </w:p>
     <w:p>
       <w:r>
-        <w:t>Once I dealt with the missing values, I combined the datasets together first I merged the products dataset with the cruelty free list. To do this I combined the cruelty free and non cruelty free brands list together, I changed the field to be “PETA Status” therefore if the brand was cruelty free it would have the value “Certified Cruelty Free”, and if not “Tests on Animals”. I found that some brands did not have any PETA Status and were not on either list, I dealt with this issue later in the process.</w:t>
+        <w:t xml:space="preserve">Once I dealt with the missing values, I combined the datasets together first I merged the products dataset with the cruelty free list. To do this I combined the cruelty free and </w:t>
+      </w:r>
+      <w:proofErr w:type="spellStart"/>
+      <w:r>
+        <w:t>non cruelty</w:t>
+      </w:r>
+      <w:proofErr w:type="spellEnd"/>
+      <w:r>
+        <w:t xml:space="preserve"> free brands list together, I changed the field to be “PETA Status” therefore if the brand was cruelty free it would have the value “Certified Cruelty Free”, and if not “Tests on Animals”. I found that some brands did not have any PETA Status and were not on either list, I dealt with this issue later in the process.</w:t>
       </w:r>
     </w:p>
     <w:p>
@@ -6790,7 +7024,23 @@
         <w:t xml:space="preserve">toxic chemicals </w:t>
       </w:r>
       <w:r>
-        <w:t xml:space="preserve">columns into the products dataset. After combining the dataset I found more missing values for PETA Status at 13105, Discontinued Date and Chemical Date Removed both had 12820 missing values. I believe this was due to the majority of the products from the original dataset did not have any chemicals. </w:t>
+        <w:t xml:space="preserve">columns into the products dataset. After combining the </w:t>
+      </w:r>
+      <w:proofErr w:type="gramStart"/>
+      <w:r>
+        <w:t>dataset</w:t>
+      </w:r>
+      <w:proofErr w:type="gramEnd"/>
+      <w:r>
+        <w:t xml:space="preserve"> I found more missing values for PETA Status at 13105, Discontinued Date and Chemical Date Removed both had 12820 missing values. I believe this was due to </w:t>
+      </w:r>
+      <w:proofErr w:type="gramStart"/>
+      <w:r>
+        <w:t>the majority of</w:t>
+      </w:r>
+      <w:proofErr w:type="gramEnd"/>
+      <w:r>
+        <w:t xml:space="preserve"> the products from the original dataset did not have any chemicals. </w:t>
       </w:r>
     </w:p>
     <w:p>
@@ -6825,7 +7075,15 @@
     </w:p>
     <w:p>
       <w:r>
-        <w:t xml:space="preserve">I checked the products dataset for outliers in numerical variables, these included the price and number of reviews. </w:t>
+        <w:t xml:space="preserve">I checked the products dataset for outliers in numerical </w:t>
+      </w:r>
+      <w:proofErr w:type="gramStart"/>
+      <w:r>
+        <w:t>variables,</w:t>
+      </w:r>
+      <w:proofErr w:type="gramEnd"/>
+      <w:r>
+        <w:t xml:space="preserve"> these included the price and number of reviews. </w:t>
       </w:r>
     </w:p>
     <w:p>
@@ -7011,7 +7269,15 @@
     <w:p/>
     <w:p>
       <w:r>
-        <w:t xml:space="preserve">The boxplot above displays the Number of Reviews for products, it outlines that there is a large range of reviews for brands. The data is not dealing with products that have the same popularity from consumers. The median is 5000 reviews, this means that half of the products in the dataset have more than 5000 consumer reviews and the other half have fewer than 5000 reviews. Majority of products have reviews between 2500 and 7500. I will not be removing any values for number of reviews, as this proves that some products are more popular with consumers than others. </w:t>
+        <w:t xml:space="preserve">The boxplot above displays the Number of Reviews for products, it outlines that there is a large range of reviews for brands. The data is not dealing with products that have the same popularity from consumers. The median is 5000 </w:t>
+      </w:r>
+      <w:proofErr w:type="gramStart"/>
+      <w:r>
+        <w:t>reviews,</w:t>
+      </w:r>
+      <w:proofErr w:type="gramEnd"/>
+      <w:r>
+        <w:t xml:space="preserve"> this means that half of the products in the dataset have more than 5000 consumer reviews and the other half have fewer than 5000 reviews. Majority of products have reviews between 2500 and 7500. I will not be removing any values for number of reviews, as this proves that some products are more popular with consumers than others. </w:t>
       </w:r>
     </w:p>
     <w:p>
@@ -7109,18 +7375,55 @@
       <w:r>
         <w:t xml:space="preserve">To deal with the categorical variables I transformed them to numeric values, firstly I changed the Cruelty Free and Toxic Chemical Amounts to int types. </w:t>
       </w:r>
-      <w:r>
-        <w:t xml:space="preserve">Therefore if a brand is certified cruelty free it will have a value of 1. For the toxic chemical amounts variable, I decided to use a 0 and 1 basis as well, as there are a lot of products per brand I believe it makes more sense to use this variable to show if a brand contains any toxic chemicals as a whole. </w:t>
-      </w:r>
-    </w:p>
-    <w:p>
-      <w:r>
-        <w:t xml:space="preserve">For the Category variable, I sorted the categories into is skincare or make up and use a 0 and 1 metric. For skin type I gave each type a number between 1 and 3, and applied these new values. </w:t>
-      </w:r>
-    </w:p>
-    <w:p>
-      <w:r>
-        <w:t xml:space="preserve">The product size variable included a number and ml for example 50ml, therefore I removed the ‘ml’ from each value to ensure there were only numbers in this variable. </w:t>
+      <w:proofErr w:type="gramStart"/>
+      <w:r>
+        <w:t>Therefore</w:t>
+      </w:r>
+      <w:proofErr w:type="gramEnd"/>
+      <w:r>
+        <w:t xml:space="preserve"> if a brand is certified cruelty free it will have a value of 1. For the toxic chemical </w:t>
+      </w:r>
+      <w:proofErr w:type="gramStart"/>
+      <w:r>
+        <w:t>amounts</w:t>
+      </w:r>
+      <w:proofErr w:type="gramEnd"/>
+      <w:r>
+        <w:t xml:space="preserve"> variable, I decided to use a 0 and 1 basis as well, as there are a lot of products per brand I believe it makes more sense to use this variable to show if a brand contains any toxic </w:t>
+      </w:r>
+      <w:proofErr w:type="gramStart"/>
+      <w:r>
+        <w:t>chemicals as a whole</w:t>
+      </w:r>
+      <w:proofErr w:type="gramEnd"/>
+      <w:r>
+        <w:t xml:space="preserve">. </w:t>
+      </w:r>
+    </w:p>
+    <w:p>
+      <w:r>
+        <w:t xml:space="preserve">For the Category variable, I sorted the categories into is skincare or make up and use a 0 and 1 metric. For skin type I gave each type a number between 1 and </w:t>
+      </w:r>
+      <w:proofErr w:type="gramStart"/>
+      <w:r>
+        <w:t>3, and</w:t>
+      </w:r>
+      <w:proofErr w:type="gramEnd"/>
+      <w:r>
+        <w:t xml:space="preserve"> applied these new values. </w:t>
+      </w:r>
+    </w:p>
+    <w:p>
+      <w:r>
+        <w:t xml:space="preserve">The product size variable included a number and ml for example </w:t>
+      </w:r>
+      <w:proofErr w:type="gramStart"/>
+      <w:r>
+        <w:t>50ml,</w:t>
+      </w:r>
+      <w:proofErr w:type="gramEnd"/>
+      <w:r>
+        <w:t xml:space="preserve"> therefore I removed the ‘ml’ from each value to ensure there were only numbers in this variable. </w:t>
       </w:r>
     </w:p>
     <w:p>
@@ -7151,7 +7454,23 @@
     </w:p>
     <w:p>
       <w:r>
-        <w:t xml:space="preserve">The country of origin variable included European countries and some countries outside of Europe, I changed this variable to be European Origin as products created in European countries have the same legislation therefore they are set apart from the US or Australia. </w:t>
+        <w:t xml:space="preserve">The </w:t>
+      </w:r>
+      <w:proofErr w:type="gramStart"/>
+      <w:r>
+        <w:t>country of origin</w:t>
+      </w:r>
+      <w:proofErr w:type="gramEnd"/>
+      <w:r>
+        <w:t xml:space="preserve"> variable included European countries and some countries outside of Europe, I changed this variable to be European Origin as products created in European countries have the same legislation </w:t>
+      </w:r>
+      <w:proofErr w:type="gramStart"/>
+      <w:r>
+        <w:t>therefore</w:t>
+      </w:r>
+      <w:proofErr w:type="gramEnd"/>
+      <w:r>
+        <w:t xml:space="preserve"> they are set apart from the US or Australia. </w:t>
       </w:r>
     </w:p>
     <w:p/>
@@ -7172,11 +7491,27 @@
     </w:p>
     <w:p>
       <w:r>
-        <w:t xml:space="preserve">By dealing with the missing values in the dataset I was able to safe important rows of data instead of removing the rows entirely and throwing away entire rows of product data. For example, if I had removed every row that did not have a PETA status, this would be removing data for no reason as the brand could be actively trying to get approved. By </w:t>
+        <w:t xml:space="preserve">By dealing with the missing values in the </w:t>
+      </w:r>
+      <w:proofErr w:type="gramStart"/>
+      <w:r>
+        <w:t>dataset</w:t>
+      </w:r>
+      <w:proofErr w:type="gramEnd"/>
+      <w:r>
+        <w:t xml:space="preserve"> I was able to safe important rows of data instead of removing the rows entirely and throwing away entire rows of product data. For example, if I had removed every row that did not have a PETA status, this would be removing data for no reason as the brand could be actively trying to get approved. By </w:t>
       </w:r>
       <w:r>
         <w:lastRenderedPageBreak/>
-        <w:t xml:space="preserve">filling in the missing values I was able to keep all of my beauty brands for the composite index. </w:t>
+        <w:t xml:space="preserve">filling in the missing values I was able to keep </w:t>
+      </w:r>
+      <w:proofErr w:type="gramStart"/>
+      <w:r>
+        <w:t>all of</w:t>
+      </w:r>
+      <w:proofErr w:type="gramEnd"/>
+      <w:r>
+        <w:t xml:space="preserve"> my beauty brands for the composite index. </w:t>
       </w:r>
     </w:p>
     <w:p>
@@ -7502,7 +7837,23 @@
           <w:rFonts w:ascii="Aptos" w:hAnsi="Aptos" w:cs="Arial"/>
           <w:color w:val="000000" w:themeColor="text1"/>
         </w:rPr>
-        <w:t xml:space="preserve">As there are so many variables I decided to use a heatmap to display the correlation between variables. </w:t>
+        <w:t xml:space="preserve">As there are so many </w:t>
+      </w:r>
+      <w:proofErr w:type="gramStart"/>
+      <w:r>
+        <w:rPr>
+          <w:rFonts w:ascii="Aptos" w:hAnsi="Aptos" w:cs="Arial"/>
+          <w:color w:val="000000" w:themeColor="text1"/>
+        </w:rPr>
+        <w:t>variables</w:t>
+      </w:r>
+      <w:proofErr w:type="gramEnd"/>
+      <w:r>
+        <w:rPr>
+          <w:rFonts w:ascii="Aptos" w:hAnsi="Aptos" w:cs="Arial"/>
+          <w:color w:val="000000" w:themeColor="text1"/>
+        </w:rPr>
+        <w:t xml:space="preserve"> I decided to use a heatmap to display the correlation between variables. </w:t>
       </w:r>
     </w:p>
     <w:p>
@@ -7598,7 +7949,39 @@
           <w:rFonts w:ascii="Aptos" w:hAnsi="Aptos" w:cs="Arial"/>
           <w:color w:val="000000" w:themeColor="text1"/>
         </w:rPr>
-        <w:t xml:space="preserve">From the heatmap I was able to see what variables had a high or low correlation, it is clear that there is an overall low linear correlation between variables as the correlation values are mostly between -0.30 and +0.30. </w:t>
+        <w:t xml:space="preserve">From the heatmap I was able to see what variables </w:t>
+      </w:r>
+      <w:proofErr w:type="gramStart"/>
+      <w:r>
+        <w:rPr>
+          <w:rFonts w:ascii="Aptos" w:hAnsi="Aptos" w:cs="Arial"/>
+          <w:color w:val="000000" w:themeColor="text1"/>
+        </w:rPr>
+        <w:t>had a high or low correlation</w:t>
+      </w:r>
+      <w:proofErr w:type="gramEnd"/>
+      <w:r>
+        <w:rPr>
+          <w:rFonts w:ascii="Aptos" w:hAnsi="Aptos" w:cs="Arial"/>
+          <w:color w:val="000000" w:themeColor="text1"/>
+        </w:rPr>
+        <w:t xml:space="preserve">, </w:t>
+      </w:r>
+      <w:proofErr w:type="gramStart"/>
+      <w:r>
+        <w:rPr>
+          <w:rFonts w:ascii="Aptos" w:hAnsi="Aptos" w:cs="Arial"/>
+          <w:color w:val="000000" w:themeColor="text1"/>
+        </w:rPr>
+        <w:t>it is clear that there</w:t>
+      </w:r>
+      <w:proofErr w:type="gramEnd"/>
+      <w:r>
+        <w:rPr>
+          <w:rFonts w:ascii="Aptos" w:hAnsi="Aptos" w:cs="Arial"/>
+          <w:color w:val="000000" w:themeColor="text1"/>
+        </w:rPr>
+        <w:t xml:space="preserve"> is an overall low linear correlation between variables as the correlation values are mostly between -0.30 and +0.30. </w:t>
       </w:r>
       <w:r>
         <w:rPr>
@@ -7778,7 +8161,23 @@
           <w:rFonts w:ascii="Aptos" w:hAnsi="Aptos" w:cs="Arial"/>
           <w:color w:val="000000" w:themeColor="text1"/>
         </w:rPr>
-        <w:t>The most notable negative correlations involve usage frequency and product size, this makes sense as products meant to frequent use or daily application usually come in smaller sizes. Similarly active ingredients and number of reviews have a negative correlation of -0.38</w:t>
+        <w:t xml:space="preserve">The most notable negative correlations involve usage frequency and product </w:t>
+      </w:r>
+      <w:proofErr w:type="gramStart"/>
+      <w:r>
+        <w:rPr>
+          <w:rFonts w:ascii="Aptos" w:hAnsi="Aptos" w:cs="Arial"/>
+          <w:color w:val="000000" w:themeColor="text1"/>
+        </w:rPr>
+        <w:t>size,</w:t>
+      </w:r>
+      <w:proofErr w:type="gramEnd"/>
+      <w:r>
+        <w:rPr>
+          <w:rFonts w:ascii="Aptos" w:hAnsi="Aptos" w:cs="Arial"/>
+          <w:color w:val="000000" w:themeColor="text1"/>
+        </w:rPr>
+        <w:t xml:space="preserve"> this makes sense as products meant to frequent use or daily application usually come in smaller sizes. Similarly active ingredients and number of reviews have a negative correlation of -0.38</w:t>
       </w:r>
       <w:r>
         <w:rPr>
@@ -8131,7 +8530,15 @@
         <w:t xml:space="preserve"> PC3 at 11%. From PC3 onwards the line significantly drops</w:t>
       </w:r>
       <w:r>
-        <w:t xml:space="preserve">, the first three principal components capture a large portion of the total dataset variance. This confirms that the 11 variables can be condensed into three core principal components. </w:t>
+        <w:t xml:space="preserve">, the first three principal components capture a large portion of the total dataset variance. This confirms that the 11 variables can be condensed into three core </w:t>
+      </w:r>
+      <w:proofErr w:type="gramStart"/>
+      <w:r>
+        <w:t>principal</w:t>
+      </w:r>
+      <w:proofErr w:type="gramEnd"/>
+      <w:r>
+        <w:t xml:space="preserve"> components. </w:t>
       </w:r>
     </w:p>
     <w:p>
@@ -9036,7 +9443,15 @@
     </w:p>
     <w:p>
       <w:r>
-        <w:t xml:space="preserve">As KMeans clustering does not work well with outliers it was essential that I checked for outliers in my data. During step 4 of Multivariate Analysis, I carried out outlier checks in the data before and after combining all of my datasets using boxplots, I also converted string variables into numeric values such as the is cruelty free variable. </w:t>
+        <w:t xml:space="preserve">As KMeans clustering does not work well with outliers it was essential that I checked for outliers in my data. During step 4 of Multivariate Analysis, I carried out outlier checks in the data before and after combining </w:t>
+      </w:r>
+      <w:proofErr w:type="gramStart"/>
+      <w:r>
+        <w:t>all of</w:t>
+      </w:r>
+      <w:proofErr w:type="gramEnd"/>
+      <w:r>
+        <w:t xml:space="preserve"> my datasets using boxplots, I also converted string variables into numeric values such as the is cruelty free variable. </w:t>
       </w:r>
     </w:p>
     <w:p>
@@ -9143,7 +9558,15 @@
         <w:t>with the data staying within a standard deviation of 3. W</w:t>
       </w:r>
       <w:r>
-        <w:t>ith zero outliers detected this shows that the majority of the data is stable in the final dataset.</w:t>
+        <w:t xml:space="preserve">ith zero outliers detected this shows that </w:t>
+      </w:r>
+      <w:proofErr w:type="gramStart"/>
+      <w:r>
+        <w:t>the majority of</w:t>
+      </w:r>
+      <w:proofErr w:type="gramEnd"/>
+      <w:r>
+        <w:t xml:space="preserve"> the data is stable in the final dataset.</w:t>
       </w:r>
     </w:p>
     <w:p>
@@ -9268,7 +9691,15 @@
     </w:p>
     <w:p>
       <w:r>
-        <w:t xml:space="preserve">The boxplot above shows that the standard scaling procedure successfully worked on these indicators. The number of reviews was previously thousands, however now all of the numerical values are within the same scale of around -2.3 and +1.8. </w:t>
+        <w:t xml:space="preserve">The boxplot above shows that the standard scaling procedure successfully worked on these indicators. The number of reviews was previously thousands, however now </w:t>
+      </w:r>
+      <w:proofErr w:type="gramStart"/>
+      <w:r>
+        <w:t>all of</w:t>
+      </w:r>
+      <w:proofErr w:type="gramEnd"/>
+      <w:r>
+        <w:t xml:space="preserve"> the numerical values are within the same scale of around -2.3 and +1.8. </w:t>
       </w:r>
       <w:r>
         <w:t xml:space="preserve">The median values for the three variables are also within the same range which is good. </w:t>
@@ -9541,22 +9972,19 @@
         </w:rPr>
         <w:t>Product Safety Index:</w:t>
       </w:r>
-    </w:p>
-    <w:p>
-      <w:pPr>
-        <w:rPr>
-          <w:b/>
-          <w:bCs/>
-        </w:rPr>
-      </w:pPr>
-    </w:p>
-    <w:p>
-      <w:pPr>
-        <w:rPr>
-          <w:b/>
-          <w:bCs/>
-        </w:rPr>
-      </w:pPr>
+      <w:r>
+        <w:rPr>
+          <w:b/>
+          <w:bCs/>
+        </w:rPr>
+        <w:t xml:space="preserve"> </w:t>
+      </w:r>
+      <w:r>
+        <w:t>This index is built on whether the product has active ingredients in it</w:t>
+      </w:r>
+      <w:r>
+        <w:t xml:space="preserve">. </w:t>
+      </w:r>
     </w:p>
     <w:p>
       <w:pPr>
@@ -9574,17 +10002,321 @@
       </w:r>
     </w:p>
     <w:p>
-      <w:pPr>
-        <w:rPr>
-          <w:b/>
-          <w:bCs/>
-        </w:rPr>
-      </w:pPr>
-      <w:r>
-        <w:rPr>
-          <w:b/>
-          <w:bCs/>
-        </w:rPr>
+      <w:r>
+        <w:t xml:space="preserve">To avoid high correlations between variables in the data, I created a heatmap to view the correlations and check relationships, I also used Principal Component Analysis. </w:t>
+      </w:r>
+    </w:p>
+    <w:p>
+      <w:r>
+        <w:t xml:space="preserve">By using Principal Component Analysis I was able to view the weights of my two main principal components, PC1 with 17% and PC2 with 15%. By doing this it showed that there </w:t>
+      </w:r>
+      <w:proofErr w:type="gramStart"/>
+      <w:r>
+        <w:t>were</w:t>
+      </w:r>
+      <w:proofErr w:type="gramEnd"/>
+      <w:r>
+        <w:t xml:space="preserve"> no overlapping between variables in the dataset. </w:t>
+      </w:r>
+    </w:p>
+    <w:p>
+      <w:r>
+        <w:t xml:space="preserve">For creating my sub </w:t>
+      </w:r>
+      <w:proofErr w:type="gramStart"/>
+      <w:r>
+        <w:t>indicators</w:t>
+      </w:r>
+      <w:proofErr w:type="gramEnd"/>
+      <w:r>
+        <w:t xml:space="preserve"> I grouped some variables together for example ratings and number of reviews to create the consumer acceptance index. This ensured that large numbers of reviews did not </w:t>
+      </w:r>
+      <w:proofErr w:type="gramStart"/>
+      <w:r>
+        <w:t>effect</w:t>
+      </w:r>
+      <w:proofErr w:type="gramEnd"/>
+      <w:r>
+        <w:t xml:space="preserve"> variables like price or sustainability. </w:t>
+      </w:r>
+    </w:p>
+    <w:p>
+      <w:pPr>
+        <w:rPr>
+          <w:b/>
+          <w:bCs/>
+        </w:rPr>
+      </w:pPr>
+      <w:r>
+        <w:rPr>
+          <w:b/>
+          <w:bCs/>
+        </w:rPr>
+        <w:t>6.3 Creating the Index</w:t>
+      </w:r>
+    </w:p>
+    <w:p>
+      <w:r>
+        <w:t xml:space="preserve">For my consumer acceptance index, I added the scaled rating and number of reviews variables together and divided the result by 2. I did this to create a balanced score to ensure that high ratings and high reviews are merged into one sub indicator. </w:t>
+      </w:r>
+    </w:p>
+    <w:p>
+      <w:r>
+        <w:t xml:space="preserve">To create my product safety </w:t>
+      </w:r>
+      <w:proofErr w:type="gramStart"/>
+      <w:r>
+        <w:t>index</w:t>
+      </w:r>
+      <w:proofErr w:type="gramEnd"/>
+      <w:r>
+        <w:t xml:space="preserve"> </w:t>
+      </w:r>
+      <w:r>
+        <w:t xml:space="preserve">I subtracted the scaled active value from 100, as in my raw data, a higher number means the product has more chemicals or active ingredients. This ensures that a brand with nearly zero chemicals in their products, gets a safety score of 100 or close to 100. </w:t>
+      </w:r>
+    </w:p>
+    <w:p>
+      <w:r>
+        <w:t xml:space="preserve">To get my final composite index to score the brands, I calculated the average of my 5 sub indicators for each brand, by adding up the 5 indicator scores and dividing the result by 5. I done this to create my final composite index score out of </w:t>
+      </w:r>
+      <w:proofErr w:type="gramStart"/>
+      <w:r>
+        <w:t>100, and</w:t>
+      </w:r>
+      <w:proofErr w:type="gramEnd"/>
+      <w:r>
+        <w:t xml:space="preserve"> used the </w:t>
+      </w:r>
+      <w:r>
+        <w:lastRenderedPageBreak/>
+        <w:t>python sort values to rank the data from the lowest performing brand to the best based on the final index</w:t>
+      </w:r>
+      <w:r>
+        <w:t xml:space="preserve"> score. </w:t>
+      </w:r>
+    </w:p>
+    <w:p>
+      <w:pPr>
+        <w:rPr>
+          <w:b/>
+          <w:bCs/>
+        </w:rPr>
+      </w:pPr>
+    </w:p>
+    <w:p>
+      <w:pPr>
+        <w:rPr>
+          <w:b/>
+          <w:bCs/>
+        </w:rPr>
+      </w:pPr>
+    </w:p>
+    <w:p>
+      <w:pPr>
+        <w:rPr>
+          <w:b/>
+          <w:bCs/>
+        </w:rPr>
+      </w:pPr>
+    </w:p>
+    <w:p>
+      <w:pPr>
+        <w:rPr>
+          <w:b/>
+          <w:bCs/>
+        </w:rPr>
+      </w:pPr>
+    </w:p>
+    <w:p>
+      <w:pPr>
+        <w:rPr>
+          <w:b/>
+          <w:bCs/>
+        </w:rPr>
+      </w:pPr>
+    </w:p>
+    <w:p>
+      <w:pPr>
+        <w:rPr>
+          <w:b/>
+          <w:bCs/>
+        </w:rPr>
+      </w:pPr>
+    </w:p>
+    <w:p>
+      <w:pPr>
+        <w:rPr>
+          <w:b/>
+          <w:bCs/>
+        </w:rPr>
+      </w:pPr>
+    </w:p>
+    <w:p>
+      <w:pPr>
+        <w:rPr>
+          <w:b/>
+          <w:bCs/>
+        </w:rPr>
+      </w:pPr>
+    </w:p>
+    <w:p>
+      <w:pPr>
+        <w:rPr>
+          <w:b/>
+          <w:bCs/>
+        </w:rPr>
+      </w:pPr>
+    </w:p>
+    <w:p>
+      <w:pPr>
+        <w:rPr>
+          <w:b/>
+          <w:bCs/>
+        </w:rPr>
+      </w:pPr>
+    </w:p>
+    <w:p>
+      <w:pPr>
+        <w:rPr>
+          <w:b/>
+          <w:bCs/>
+        </w:rPr>
+      </w:pPr>
+    </w:p>
+    <w:p>
+      <w:pPr>
+        <w:rPr>
+          <w:b/>
+          <w:bCs/>
+        </w:rPr>
+      </w:pPr>
+    </w:p>
+    <w:p>
+      <w:pPr>
+        <w:rPr>
+          <w:b/>
+          <w:bCs/>
+        </w:rPr>
+      </w:pPr>
+    </w:p>
+    <w:p>
+      <w:pPr>
+        <w:rPr>
+          <w:b/>
+          <w:bCs/>
+        </w:rPr>
+      </w:pPr>
+    </w:p>
+    <w:p>
+      <w:pPr>
+        <w:rPr>
+          <w:b/>
+          <w:bCs/>
+        </w:rPr>
+      </w:pPr>
+    </w:p>
+    <w:p>
+      <w:pPr>
+        <w:rPr>
+          <w:b/>
+          <w:bCs/>
+        </w:rPr>
+      </w:pPr>
+    </w:p>
+    <w:p>
+      <w:pPr>
+        <w:rPr>
+          <w:b/>
+          <w:bCs/>
+        </w:rPr>
+      </w:pPr>
+    </w:p>
+    <w:p>
+      <w:pPr>
+        <w:rPr>
+          <w:b/>
+          <w:bCs/>
+        </w:rPr>
+      </w:pPr>
+    </w:p>
+    <w:p>
+      <w:pPr>
+        <w:rPr>
+          <w:b/>
+          <w:bCs/>
+        </w:rPr>
+      </w:pPr>
+    </w:p>
+    <w:p>
+      <w:pPr>
+        <w:rPr>
+          <w:b/>
+          <w:bCs/>
+        </w:rPr>
+      </w:pPr>
+    </w:p>
+    <w:p>
+      <w:pPr>
+        <w:rPr>
+          <w:b/>
+          <w:bCs/>
+        </w:rPr>
+      </w:pPr>
+    </w:p>
+    <w:p>
+      <w:pPr>
+        <w:rPr>
+          <w:b/>
+          <w:bCs/>
+        </w:rPr>
+      </w:pPr>
+    </w:p>
+    <w:p>
+      <w:pPr>
+        <w:rPr>
+          <w:b/>
+          <w:bCs/>
+        </w:rPr>
+      </w:pPr>
+    </w:p>
+    <w:p>
+      <w:pPr>
+        <w:rPr>
+          <w:b/>
+          <w:bCs/>
+        </w:rPr>
+      </w:pPr>
+    </w:p>
+    <w:p>
+      <w:pPr>
+        <w:rPr>
+          <w:b/>
+          <w:bCs/>
+        </w:rPr>
+      </w:pPr>
+    </w:p>
+    <w:p>
+      <w:pPr>
+        <w:rPr>
+          <w:b/>
+          <w:bCs/>
+        </w:rPr>
+      </w:pPr>
+    </w:p>
+    <w:p>
+      <w:pPr>
+        <w:rPr>
+          <w:b/>
+          <w:bCs/>
+        </w:rPr>
+      </w:pPr>
+      <w:r>
+        <w:rPr>
+          <w:b/>
+          <w:bCs/>
+        </w:rPr>
+        <w:lastRenderedPageBreak/>
         <w:tab/>
       </w:r>
       <w:r>
@@ -9749,7 +10481,6 @@
     </w:p>
     <w:p>
       <w:r>
-        <w:lastRenderedPageBreak/>
         <w:t xml:space="preserve">Top brands belong to cluster 2, scaler working as the top brand is 100. </w:t>
       </w:r>
     </w:p>

</xml_diff>